<commit_message>
everything handled before paraphrasing
</commit_message>
<xml_diff>
--- a/RagBot/new-KB/GL_QA_Base Data-temp.docx
+++ b/RagBot/new-KB/GL_QA_Base Data-temp.docx
@@ -3723,7 +3723,7 @@
                     <pic:cNvPicPr/>
                   </pic:nvPicPr>
                   <pic:blipFill>
-                    <a:blip r:embed="rId5"/>
+                    <a:blip r:embed="rId6"/>
                     <a:stretch>
                       <a:fillRect/>
                     </a:stretch>
@@ -4597,7 +4597,7 @@
                     <pic:cNvPicPr/>
                   </pic:nvPicPr>
                   <pic:blipFill>
-                    <a:blip r:embed="rId6"/>
+                    <a:blip r:embed="rId7"/>
                     <a:stretch>
                       <a:fillRect/>
                     </a:stretch>
@@ -4755,7 +4755,7 @@
                     <pic:cNvPicPr/>
                   </pic:nvPicPr>
                   <pic:blipFill>
-                    <a:blip r:embed="rId7"/>
+                    <a:blip r:embed="rId8"/>
                     <a:stretch>
                       <a:fillRect/>
                     </a:stretch>
@@ -4839,7 +4839,7 @@
                     <pic:cNvPicPr/>
                   </pic:nvPicPr>
                   <pic:blipFill>
-                    <a:blip r:embed="rId8"/>
+                    <a:blip r:embed="rId9"/>
                     <a:stretch>
                       <a:fillRect/>
                     </a:stretch>
@@ -5278,7 +5278,7 @@
                     <pic:cNvPicPr/>
                   </pic:nvPicPr>
                   <pic:blipFill>
-                    <a:blip r:embed="rId9"/>
+                    <a:blip r:embed="rId10"/>
                     <a:stretch>
                       <a:fillRect/>
                     </a:stretch>
@@ -5414,7 +5414,7 @@
                     <pic:cNvPicPr/>
                   </pic:nvPicPr>
                   <pic:blipFill>
-                    <a:blip r:embed="rId10"/>
+                    <a:blip r:embed="rId11"/>
                     <a:stretch>
                       <a:fillRect/>
                     </a:stretch>
@@ -5579,7 +5579,7 @@
                     <pic:cNvPicPr/>
                   </pic:nvPicPr>
                   <pic:blipFill>
-                    <a:blip r:embed="rId11"/>
+                    <a:blip r:embed="rId12"/>
                     <a:stretch>
                       <a:fillRect/>
                     </a:stretch>
@@ -5664,7 +5664,7 @@
                     <pic:cNvPicPr/>
                   </pic:nvPicPr>
                   <pic:blipFill>
-                    <a:blip r:embed="rId12"/>
+                    <a:blip r:embed="rId13"/>
                     <a:stretch>
                       <a:fillRect/>
                     </a:stretch>
@@ -6716,7 +6716,30 @@
           <w:rtl/>
           <w:lang w:bidi="fa-IR"/>
         </w:rPr>
-        <w:t xml:space="preserve"> از انواع "بدهکار"، "بستانکار" و </w:t>
+        <w:t xml:space="preserve"> از انواع "بدهکار"</w:t>
+      </w:r>
+      <w:r>
+        <w:rPr>
+          <w:rFonts w:ascii="SG Kara FaNum Light" w:hAnsi="SG Kara FaNum Light" w:cs="SG Kara FaNum Light"/>
+          <w:lang w:bidi="fa-IR"/>
+        </w:rPr>
+        <w:t xml:space="preserve"> </w:t>
+      </w:r>
+      <w:r>
+        <w:rPr>
+          <w:rFonts w:ascii="SG Kara FaNum Light" w:hAnsi="SG Kara FaNum Light" w:cs="SG Kara FaNum Light" w:hint="cs"/>
+          <w:rtl/>
+          <w:lang w:bidi="fa-IR"/>
+        </w:rPr>
+        <w:t xml:space="preserve">یا </w:t>
+      </w:r>
+      <w:r>
+        <w:rPr>
+          <w:rFonts w:ascii="SG Kara FaNum Light" w:hAnsi="SG Kara FaNum Light" w:cs="SG Kara FaNum Light"/>
+          <w:rtl/>
+          <w:lang w:bidi="fa-IR"/>
+        </w:rPr>
+        <w:t xml:space="preserve">"بستانکار" و </w:t>
       </w:r>
       <w:r>
         <w:rPr>
@@ -6919,7 +6942,23 @@
           <w:rtl/>
           <w:lang w:bidi="fa-IR"/>
         </w:rPr>
-        <w:t>ا "بستانکار" م</w:t>
+        <w:t xml:space="preserve">ا "بستانکار" </w:t>
+      </w:r>
+      <w:r>
+        <w:rPr>
+          <w:rFonts w:ascii="SG Kara FaNum Light" w:hAnsi="SG Kara FaNum Light" w:cs="SG Kara FaNum Light" w:hint="cs"/>
+          <w:rtl/>
+          <w:lang w:bidi="fa-IR"/>
+        </w:rPr>
+        <w:t xml:space="preserve">و یا ماهیت "مهم نیست" </w:t>
+      </w:r>
+      <w:r>
+        <w:rPr>
+          <w:rFonts w:ascii="SG Kara FaNum Light" w:hAnsi="SG Kara FaNum Light" w:cs="SG Kara FaNum Light"/>
+          <w:rtl/>
+          <w:lang w:bidi="fa-IR"/>
+        </w:rPr>
+        <w:t>م</w:t>
       </w:r>
       <w:r>
         <w:rPr>
@@ -6951,39 +6990,15 @@
           <w:rtl/>
           <w:lang w:bidi="fa-IR"/>
         </w:rPr>
-        <w:t>د حساب ها</w:t>
-      </w:r>
-      <w:r>
-        <w:rPr>
-          <w:rFonts w:ascii="SG Kara FaNum Light" w:hAnsi="SG Kara FaNum Light" w:cs="SG Kara FaNum Light"/>
-          <w:rtl/>
-          <w:lang w:bidi="fa-IR"/>
-        </w:rPr>
-        <w:t>ی</w:t>
-      </w:r>
-      <w:r>
-        <w:rPr>
-          <w:rFonts w:ascii="SG Kara FaNum Light" w:hAnsi="SG Kara FaNum Light" w:cs="SG Kara FaNum Light"/>
-          <w:rtl/>
-          <w:lang w:bidi="fa-IR"/>
-        </w:rPr>
-        <w:t xml:space="preserve"> طرف مقابل را مشخص نما</w:t>
-      </w:r>
-      <w:r>
-        <w:rPr>
-          <w:rFonts w:ascii="SG Kara FaNum Light" w:hAnsi="SG Kara FaNum Light" w:cs="SG Kara FaNum Light"/>
-          <w:rtl/>
-          <w:lang w:bidi="fa-IR"/>
-        </w:rPr>
-        <w:t>یی</w:t>
-      </w:r>
-      <w:r>
-        <w:rPr>
-          <w:rFonts w:ascii="SG Kara FaNum Light" w:hAnsi="SG Kara FaNum Light" w:cs="SG Kara FaNum Light"/>
-          <w:rtl/>
-          <w:lang w:bidi="fa-IR"/>
-        </w:rPr>
-        <w:t xml:space="preserve">د. </w:t>
+        <w:t xml:space="preserve">د حساب مقابل </w:t>
+      </w:r>
+      <w:r>
+        <w:rPr>
+          <w:rFonts w:ascii="SG Kara FaNum Light" w:hAnsi="SG Kara FaNum Light" w:cs="SG Kara FaNum Light" w:hint="cs"/>
+          <w:rtl/>
+          <w:lang w:bidi="fa-IR"/>
+        </w:rPr>
+        <w:t xml:space="preserve">تعدیل ماهیت تعیین نمود. </w:t>
       </w:r>
       <w:r>
         <w:rPr>
@@ -11928,7 +11943,16 @@
           <w:rtl/>
           <w:lang w:bidi="fa-IR"/>
         </w:rPr>
-        <w:t xml:space="preserve"> ف</w:t>
+        <w:t xml:space="preserve"> </w:t>
+      </w:r>
+      <w:proofErr w:type="spellStart"/>
+      <w:r>
+        <w:rPr>
+          <w:rFonts w:ascii="SG Kara FaNum Light" w:hAnsi="SG Kara FaNum Light" w:cs="SG Kara FaNum Light"/>
+          <w:rtl/>
+          <w:lang w:bidi="fa-IR"/>
+        </w:rPr>
+        <w:t>ف</w:t>
       </w:r>
       <w:r>
         <w:rPr>
@@ -11954,6 +11978,7 @@
         </w:rPr>
         <w:t>ی</w:t>
       </w:r>
+      <w:proofErr w:type="spellEnd"/>
       <w:r>
         <w:rPr>
           <w:rFonts w:ascii="SG Kara FaNum Light" w:hAnsi="SG Kara FaNum Light" w:cs="SG Kara FaNum Light"/>
@@ -13351,7 +13376,7 @@
                     <pic:cNvPicPr/>
                   </pic:nvPicPr>
                   <pic:blipFill>
-                    <a:blip r:embed="rId13"/>
+                    <a:blip r:embed="rId14"/>
                     <a:stretch>
                       <a:fillRect/>
                     </a:stretch>
@@ -13425,6 +13450,14 @@
       </w:pPr>
       <w:r>
         <w:rPr>
+          <w:rFonts w:ascii="SG Kara FaNum Light" w:hAnsi="SG Kara FaNum Light" w:cs="SG Kara FaNum Light" w:hint="cs"/>
+          <w:rtl/>
+          <w:lang w:bidi="fa-IR"/>
+        </w:rPr>
+        <w:t xml:space="preserve">تفصیل های مرتبط با هر معین در بخش اقلام سند در سند حسابداری نمایش داده میشوند. </w:t>
+      </w:r>
+      <w:r>
+        <w:rPr>
           <w:rFonts w:ascii="SG Kara FaNum Light" w:hAnsi="SG Kara FaNum Light" w:cs="SG Kara FaNum Light"/>
           <w:rtl/>
           <w:lang w:bidi="fa-IR"/>
@@ -14287,6 +14320,7 @@
           <w:rtl/>
           <w:lang w:bidi="fa-IR"/>
         </w:rPr>
+        <w:lastRenderedPageBreak/>
         <w:t>سا</w:t>
       </w:r>
       <w:r>
@@ -14342,7 +14376,6 @@
           <w:rtl/>
           <w:lang w:bidi="fa-IR"/>
         </w:rPr>
-        <w:lastRenderedPageBreak/>
         <w:t>سا</w:t>
       </w:r>
       <w:r>
@@ -15592,6 +15625,25 @@
           <w:lang w:bidi="fa-IR"/>
         </w:rPr>
         <w:t>، میتوانید ارتباط را حذف کنید.</w:t>
+      </w:r>
+    </w:p>
+    <w:p>
+      <w:pPr>
+        <w:shd w:val="clear" w:color="auto" w:fill="FFFFFF"/>
+        <w:bidi/>
+        <w:spacing w:before="100" w:beforeAutospacing="1" w:after="100" w:afterAutospacing="1" w:line="240" w:lineRule="auto"/>
+        <w:jc w:val="both"/>
+        <w:rPr>
+          <w:rFonts w:ascii="SG Kara FaNum Light" w:eastAsia="Times New Roman" w:hAnsi="SG Kara FaNum Light" w:cs="SG Kara FaNum Light"/>
+          <w:rtl/>
+        </w:rPr>
+      </w:pPr>
+      <w:r>
+        <w:rPr>
+          <w:rFonts w:ascii="SG Kara FaNum Light" w:eastAsia="Times New Roman" w:hAnsi="SG Kara FaNum Light" w:cs="SG Kara FaNum Light" w:hint="cs"/>
+          <w:rtl/>
+        </w:rPr>
+        <w:t xml:space="preserve">توجه: امکان ارتباط نامحدودی از  انواع تفصیل ها با یک حساب معین وجود دارد. </w:t>
       </w:r>
     </w:p>
     <w:p>
@@ -15745,7 +15797,21 @@
           <w:rFonts w:ascii="SG Kara FaNum Light" w:eastAsia="Times New Roman" w:hAnsi="SG Kara FaNum Light" w:cs="SG Kara FaNum Light"/>
           <w:rtl/>
         </w:rPr>
-        <w:t>انتخاب تفصيل ها</w:t>
+        <w:t>ا</w:t>
+      </w:r>
+      <w:r>
+        <w:rPr>
+          <w:rFonts w:ascii="SG Kara FaNum Light" w:eastAsia="Times New Roman" w:hAnsi="SG Kara FaNum Light" w:cs="SG Kara FaNum Light" w:hint="cs"/>
+          <w:rtl/>
+        </w:rPr>
+        <w:t>مکان ا</w:t>
+      </w:r>
+      <w:r>
+        <w:rPr>
+          <w:rFonts w:ascii="SG Kara FaNum Light" w:eastAsia="Times New Roman" w:hAnsi="SG Kara FaNum Light" w:cs="SG Kara FaNum Light"/>
+          <w:rtl/>
+        </w:rPr>
+        <w:t>نتخاب تفصيل ها</w:t>
       </w:r>
       <w:r>
         <w:rPr>
@@ -15889,7 +15955,7 @@
                     </pic:cNvPicPr>
                   </pic:nvPicPr>
                   <pic:blipFill rotWithShape="1">
-                    <a:blip r:embed="rId14">
+                    <a:blip r:embed="rId15">
                       <a:extLst>
                         <a:ext uri="{28A0092B-C50C-407E-A947-70E740481C1C}">
                           <a14:useLocalDpi xmlns:a14="http://schemas.microsoft.com/office/drawing/2010/main" val="0"/>
@@ -15986,7 +16052,7 @@
                     </pic:cNvPicPr>
                   </pic:nvPicPr>
                   <pic:blipFill rotWithShape="1">
-                    <a:blip r:embed="rId15" cstate="print">
+                    <a:blip r:embed="rId16" cstate="print">
                       <a:extLst>
                         <a:ext uri="{28A0092B-C50C-407E-A947-70E740481C1C}">
                           <a14:useLocalDpi xmlns:a14="http://schemas.microsoft.com/office/drawing/2010/main" val="0"/>
@@ -16113,7 +16179,7 @@
                     <pic:cNvPicPr/>
                   </pic:nvPicPr>
                   <pic:blipFill>
-                    <a:blip r:embed="rId16"/>
+                    <a:blip r:embed="rId17"/>
                     <a:stretch>
                       <a:fillRect/>
                     </a:stretch>
@@ -16482,7 +16548,7 @@
                     <pic:cNvPicPr/>
                   </pic:nvPicPr>
                   <pic:blipFill>
-                    <a:blip r:embed="rId17"/>
+                    <a:blip r:embed="rId18"/>
                     <a:stretch>
                       <a:fillRect/>
                     </a:stretch>
@@ -17350,7 +17416,7 @@
                     <pic:cNvPicPr/>
                   </pic:nvPicPr>
                   <pic:blipFill>
-                    <a:blip r:embed="rId18"/>
+                    <a:blip r:embed="rId19"/>
                     <a:stretch>
                       <a:fillRect/>
                     </a:stretch>
@@ -17809,129 +17875,6 @@
             <wp:extent cx="5943600" cy="738505"/>
             <wp:effectExtent l="0" t="0" r="0" b="4445"/>
             <wp:docPr id="11" name="Picture 11"/>
-            <wp:cNvGraphicFramePr>
-              <a:graphicFrameLocks xmlns:a="http://schemas.openxmlformats.org/drawingml/2006/main" noChangeAspect="1"/>
-            </wp:cNvGraphicFramePr>
-            <a:graphic xmlns:a="http://schemas.openxmlformats.org/drawingml/2006/main">
-              <a:graphicData uri="http://schemas.openxmlformats.org/drawingml/2006/picture">
-                <pic:pic xmlns:pic="http://schemas.openxmlformats.org/drawingml/2006/picture">
-                  <pic:nvPicPr>
-                    <pic:cNvPr id="1" name=""/>
-                    <pic:cNvPicPr/>
-                  </pic:nvPicPr>
-                  <pic:blipFill>
-                    <a:blip r:embed="rId19"/>
-                    <a:stretch>
-                      <a:fillRect/>
-                    </a:stretch>
-                  </pic:blipFill>
-                  <pic:spPr>
-                    <a:xfrm>
-                      <a:off x="0" y="0"/>
-                      <a:ext cx="5943600" cy="738505"/>
-                    </a:xfrm>
-                    <a:prstGeom prst="rect">
-                      <a:avLst/>
-                    </a:prstGeom>
-                  </pic:spPr>
-                </pic:pic>
-              </a:graphicData>
-            </a:graphic>
-          </wp:inline>
-        </w:drawing>
-      </w:r>
-    </w:p>
-    <w:p>
-      <w:pPr>
-        <w:bidi/>
-        <w:rPr>
-          <w:rFonts w:ascii="SG Kara FaNum Light" w:hAnsi="SG Kara FaNum Light" w:cs="SG Kara FaNum Light"/>
-          <w:rtl/>
-          <w:lang w:bidi="fa-IR"/>
-        </w:rPr>
-      </w:pPr>
-    </w:p>
-    <w:p>
-      <w:pPr>
-        <w:bidi/>
-        <w:rPr>
-          <w:rFonts w:ascii="SG Kara FaNum Light" w:hAnsi="SG Kara FaNum Light" w:cs="SG Kara FaNum Light"/>
-          <w:rtl/>
-          <w:lang w:bidi="fa-IR"/>
-        </w:rPr>
-      </w:pPr>
-      <w:r>
-        <w:rPr>
-          <w:rFonts w:ascii="SG Kara FaNum Light" w:hAnsi="SG Kara FaNum Light" w:cs="SG Kara FaNum Light" w:hint="cs"/>
-          <w:rtl/>
-          <w:lang w:bidi="fa-IR"/>
-        </w:rPr>
-        <w:t>بعد از ذخیره، بخش اطلاعات تفصیل را در سمت چپ صفحه مشاهده میکنید، با انتخاب کلید "ایجاد " یک صفحه باز میشود ، در این صفحه میتوانید کد تفصیل را وارد کنید و یا این کد به صورت پیش فرض بر اساس روش کدگذاری تعریف شده وارد می شود.</w:t>
-      </w:r>
-      <w:r>
-        <w:rPr>
-          <w:rFonts w:ascii="SG Kara FaNum Light" w:hAnsi="SG Kara FaNum Light" w:cs="SG Kara FaNum Light"/>
-          <w:rtl/>
-          <w:lang w:bidi="fa-IR"/>
-        </w:rPr>
-        <w:br/>
-      </w:r>
-      <w:r>
-        <w:rPr>
-          <w:rFonts w:ascii="SG Kara FaNum Light" w:hAnsi="SG Kara FaNum Light" w:cs="SG Kara FaNum Light" w:hint="cs"/>
-          <w:rtl/>
-          <w:lang w:bidi="fa-IR"/>
-        </w:rPr>
-        <w:t>نام تفصیل برابر با عنوان مرکز هزینه خواهد بود.</w:t>
-      </w:r>
-    </w:p>
-    <w:p>
-      <w:pPr>
-        <w:bidi/>
-        <w:rPr>
-          <w:rFonts w:ascii="SG Kara FaNum Light" w:hAnsi="SG Kara FaNum Light" w:cs="SG Kara FaNum Light"/>
-          <w:rtl/>
-          <w:lang w:bidi="fa-IR"/>
-        </w:rPr>
-      </w:pPr>
-      <w:r>
-        <w:rPr>
-          <w:rFonts w:ascii="SG Kara FaNum Light" w:hAnsi="SG Kara FaNum Light" w:cs="SG Kara FaNum Light" w:hint="cs"/>
-          <w:rtl/>
-          <w:lang w:bidi="fa-IR"/>
-        </w:rPr>
-        <w:lastRenderedPageBreak/>
-        <w:t>با انتخاب کلید ذخیره، حساب تفصیل مربوط به مرکز هزینه نیز ذخیره خواهد شد.</w:t>
-      </w:r>
-      <w:r>
-        <w:rPr>
-          <w:rFonts w:ascii="SG Kara FaNum Light" w:hAnsi="SG Kara FaNum Light" w:cs="SG Kara FaNum Light"/>
-          <w:rtl/>
-          <w:lang w:bidi="fa-IR"/>
-        </w:rPr>
-        <w:br/>
-      </w:r>
-    </w:p>
-    <w:p>
-      <w:pPr>
-        <w:bidi/>
-        <w:rPr>
-          <w:rFonts w:ascii="SG Kara FaNum Light" w:hAnsi="SG Kara FaNum Light" w:cs="SG Kara FaNum Light"/>
-          <w:lang w:bidi="fa-IR"/>
-        </w:rPr>
-      </w:pPr>
-      <w:r>
-        <w:rPr>
-          <w:rFonts w:ascii="SG Kara FaNum Light" w:hAnsi="SG Kara FaNum Light" w:cs="SG Kara FaNum Light"/>
-          <w:noProof/>
-          <w:rtl/>
-          <w:lang w:bidi="fa-IR"/>
-        </w:rPr>
-        <w:drawing>
-          <wp:inline distT="0" distB="0" distL="0" distR="0" wp14:anchorId="43D3D618" wp14:editId="30C9240C">
-            <wp:extent cx="5943600" cy="2349500"/>
-            <wp:effectExtent l="0" t="0" r="0" b="0"/>
-            <wp:docPr id="12" name="Picture 12"/>
             <wp:cNvGraphicFramePr>
               <a:graphicFrameLocks xmlns:a="http://schemas.openxmlformats.org/drawingml/2006/main" noChangeAspect="1"/>
             </wp:cNvGraphicFramePr>
@@ -17951,7 +17894,7 @@
                   <pic:spPr>
                     <a:xfrm>
                       <a:off x="0" y="0"/>
-                      <a:ext cx="5943600" cy="2349500"/>
+                      <a:ext cx="5943600" cy="738505"/>
                     </a:xfrm>
                     <a:prstGeom prst="rect">
                       <a:avLst/>
@@ -17969,817 +17912,77 @@
         <w:bidi/>
         <w:rPr>
           <w:rFonts w:ascii="SG Kara FaNum Light" w:hAnsi="SG Kara FaNum Light" w:cs="SG Kara FaNum Light"/>
-          <w:lang w:bidi="fa-IR"/>
-        </w:rPr>
-      </w:pPr>
-    </w:p>
-    <w:p>
-      <w:pPr>
-        <w:bidi/>
-        <w:rPr>
-          <w:rFonts w:ascii="SG Kara FaNum Light" w:hAnsi="SG Kara FaNum Light" w:cs="SG Kara FaNum Light"/>
-          <w:lang w:bidi="fa-IR"/>
-        </w:rPr>
-      </w:pPr>
-    </w:p>
-    <w:p>
-      <w:pPr>
-        <w:bidi/>
-        <w:rPr>
-          <w:rFonts w:ascii="SG Kara FaNum Light" w:hAnsi="SG Kara FaNum Light" w:cs="SG Kara FaNum Light"/>
-          <w:rtl/>
-          <w:lang w:bidi="fa-IR"/>
-        </w:rPr>
-      </w:pPr>
-      <w:r>
-        <w:rPr>
-          <w:rFonts w:ascii="SG Kara FaNum Light" w:hAnsi="SG Kara FaNum Light" w:cs="SG Kara FaNum Light" w:hint="cs"/>
-          <w:rtl/>
-          <w:lang w:bidi="fa-IR"/>
-        </w:rPr>
-        <w:t>در گوشه صفحه با انتخاب کلید سه نقطه امکان مشاهده فهرست مراکز هزینه را خواهید داشت.</w:t>
-      </w:r>
-    </w:p>
-    <w:p>
-      <w:pPr>
-        <w:bidi/>
-        <w:rPr>
-          <w:rFonts w:ascii="SG Kara FaNum Light" w:hAnsi="SG Kara FaNum Light" w:cs="SG Kara FaNum Light"/>
-          <w:rtl/>
-          <w:lang w:bidi="fa-IR"/>
-        </w:rPr>
-      </w:pPr>
-      <w:r>
-        <w:rPr>
-          <w:rFonts w:ascii="SG Kara FaNum Light" w:hAnsi="SG Kara FaNum Light" w:cs="SG Kara FaNum Light" w:hint="cs"/>
-          <w:rtl/>
-          <w:lang w:bidi="fa-IR"/>
-        </w:rPr>
-        <w:t>با انتخاب کلید حذف ، مرکز هزینه شما حذف خواهد شد، لازم به ذکر است اگر تفصیل مرکز هزینه استفاده شده باشد، امکان حذف آن وجود ندارد.</w:t>
-      </w:r>
-    </w:p>
-    <w:p>
-      <w:pPr>
-        <w:bidi/>
-        <w:rPr>
-          <w:rFonts w:ascii="SG Kara FaNum Light" w:hAnsi="SG Kara FaNum Light" w:cs="SG Kara FaNum Light"/>
-          <w:rtl/>
-          <w:lang w:bidi="fa-IR"/>
-        </w:rPr>
-      </w:pPr>
-    </w:p>
-    <w:p>
-      <w:pPr>
-        <w:pStyle w:val="Heading1"/>
-        <w:bidi/>
-        <w:rPr>
-          <w:rtl/>
-          <w:lang w:bidi="fa-IR"/>
-        </w:rPr>
-      </w:pPr>
-      <w:r>
-        <w:rPr>
-          <w:rFonts w:hint="cs"/>
-          <w:rtl/>
-          <w:lang w:bidi="fa-IR"/>
-        </w:rPr>
-        <w:t>پروژه</w:t>
-      </w:r>
-    </w:p>
-    <w:p>
-      <w:pPr>
-        <w:bidi/>
-        <w:rPr>
-          <w:rFonts w:ascii="SG Kara FaNum Light" w:hAnsi="SG Kara FaNum Light" w:cs="SG Kara FaNum Light"/>
-          <w:rtl/>
-          <w:lang w:bidi="fa-IR"/>
-        </w:rPr>
-      </w:pPr>
-      <w:r>
-        <w:rPr>
-          <w:rFonts w:ascii="SG Kara FaNum Light" w:hAnsi="SG Kara FaNum Light" w:cs="SG Kara FaNum Light"/>
-          <w:rtl/>
-          <w:lang w:bidi="fa-IR"/>
-        </w:rPr>
-        <w:t>پروژه مجموعه فعال</w:t>
-      </w:r>
-      <w:r>
-        <w:rPr>
-          <w:rFonts w:ascii="SG Kara FaNum Light" w:hAnsi="SG Kara FaNum Light" w:cs="SG Kara FaNum Light" w:hint="cs"/>
-          <w:rtl/>
-          <w:lang w:bidi="fa-IR"/>
-        </w:rPr>
-        <w:t>ی</w:t>
-      </w:r>
-      <w:r>
-        <w:rPr>
-          <w:rFonts w:ascii="SG Kara FaNum Light" w:hAnsi="SG Kara FaNum Light" w:cs="SG Kara FaNum Light" w:hint="eastAsia"/>
-          <w:rtl/>
-          <w:lang w:bidi="fa-IR"/>
-        </w:rPr>
-        <w:t>ت‌ها</w:t>
-      </w:r>
-      <w:r>
-        <w:rPr>
-          <w:rFonts w:ascii="SG Kara FaNum Light" w:hAnsi="SG Kara FaNum Light" w:cs="SG Kara FaNum Light" w:hint="cs"/>
-          <w:rtl/>
-          <w:lang w:bidi="fa-IR"/>
-        </w:rPr>
-        <w:t>ی</w:t>
-      </w:r>
-      <w:r>
-        <w:rPr>
-          <w:rFonts w:ascii="SG Kara FaNum Light" w:hAnsi="SG Kara FaNum Light" w:cs="SG Kara FaNum Light"/>
-          <w:rtl/>
-          <w:lang w:bidi="fa-IR"/>
-        </w:rPr>
-        <w:t xml:space="preserve"> فرد</w:t>
-      </w:r>
-      <w:r>
-        <w:rPr>
-          <w:rFonts w:ascii="SG Kara FaNum Light" w:hAnsi="SG Kara FaNum Light" w:cs="SG Kara FaNum Light" w:hint="cs"/>
-          <w:rtl/>
-          <w:lang w:bidi="fa-IR"/>
-        </w:rPr>
-        <w:t>ی</w:t>
-      </w:r>
-      <w:r>
-        <w:rPr>
-          <w:rFonts w:ascii="SG Kara FaNum Light" w:hAnsi="SG Kara FaNum Light" w:cs="SG Kara FaNum Light"/>
-          <w:rtl/>
-          <w:lang w:bidi="fa-IR"/>
-        </w:rPr>
-        <w:t xml:space="preserve"> </w:t>
-      </w:r>
-      <w:r>
-        <w:rPr>
-          <w:rFonts w:ascii="SG Kara FaNum Light" w:hAnsi="SG Kara FaNum Light" w:cs="SG Kara FaNum Light" w:hint="cs"/>
-          <w:rtl/>
-          <w:lang w:bidi="fa-IR"/>
-        </w:rPr>
-        <w:t>ی</w:t>
-      </w:r>
-      <w:r>
-        <w:rPr>
-          <w:rFonts w:ascii="SG Kara FaNum Light" w:hAnsi="SG Kara FaNum Light" w:cs="SG Kara FaNum Light" w:hint="eastAsia"/>
-          <w:rtl/>
-          <w:lang w:bidi="fa-IR"/>
-        </w:rPr>
-        <w:t>ا</w:t>
-      </w:r>
-      <w:r>
-        <w:rPr>
-          <w:rFonts w:ascii="SG Kara FaNum Light" w:hAnsi="SG Kara FaNum Light" w:cs="SG Kara FaNum Light"/>
-          <w:rtl/>
-          <w:lang w:bidi="fa-IR"/>
-        </w:rPr>
-        <w:t xml:space="preserve"> گروه</w:t>
-      </w:r>
-      <w:r>
-        <w:rPr>
-          <w:rFonts w:ascii="SG Kara FaNum Light" w:hAnsi="SG Kara FaNum Light" w:cs="SG Kara FaNum Light" w:hint="cs"/>
-          <w:rtl/>
-          <w:lang w:bidi="fa-IR"/>
-        </w:rPr>
-        <w:t>ی</w:t>
-      </w:r>
-      <w:r>
-        <w:rPr>
-          <w:rFonts w:ascii="SG Kara FaNum Light" w:hAnsi="SG Kara FaNum Light" w:cs="SG Kara FaNum Light"/>
-          <w:rtl/>
-          <w:lang w:bidi="fa-IR"/>
-        </w:rPr>
-        <w:t xml:space="preserve"> خاص و قابل </w:t>
-      </w:r>
-      <w:proofErr w:type="spellStart"/>
-      <w:r>
-        <w:rPr>
-          <w:rFonts w:ascii="SG Kara FaNum Light" w:hAnsi="SG Kara FaNum Light" w:cs="SG Kara FaNum Light"/>
-          <w:rtl/>
-          <w:lang w:bidi="fa-IR"/>
-        </w:rPr>
-        <w:t>اندازه‌گ</w:t>
-      </w:r>
-      <w:r>
-        <w:rPr>
-          <w:rFonts w:ascii="SG Kara FaNum Light" w:hAnsi="SG Kara FaNum Light" w:cs="SG Kara FaNum Light" w:hint="cs"/>
-          <w:rtl/>
-          <w:lang w:bidi="fa-IR"/>
-        </w:rPr>
-        <w:t>ی</w:t>
-      </w:r>
-      <w:r>
-        <w:rPr>
-          <w:rFonts w:ascii="SG Kara FaNum Light" w:hAnsi="SG Kara FaNum Light" w:cs="SG Kara FaNum Light" w:hint="eastAsia"/>
-          <w:rtl/>
-          <w:lang w:bidi="fa-IR"/>
-        </w:rPr>
-        <w:t>ر</w:t>
-      </w:r>
-      <w:r>
-        <w:rPr>
-          <w:rFonts w:ascii="SG Kara FaNum Light" w:hAnsi="SG Kara FaNum Light" w:cs="SG Kara FaNum Light" w:hint="cs"/>
-          <w:rtl/>
-          <w:lang w:bidi="fa-IR"/>
-        </w:rPr>
-        <w:t>ی</w:t>
-      </w:r>
-      <w:proofErr w:type="spellEnd"/>
-      <w:r>
-        <w:rPr>
-          <w:rFonts w:ascii="SG Kara FaNum Light" w:hAnsi="SG Kara FaNum Light" w:cs="SG Kara FaNum Light"/>
-          <w:rtl/>
-          <w:lang w:bidi="fa-IR"/>
-        </w:rPr>
-        <w:t xml:space="preserve"> است که به منظور تول</w:t>
-      </w:r>
-      <w:r>
-        <w:rPr>
-          <w:rFonts w:ascii="SG Kara FaNum Light" w:hAnsi="SG Kara FaNum Light" w:cs="SG Kara FaNum Light" w:hint="cs"/>
-          <w:rtl/>
-          <w:lang w:bidi="fa-IR"/>
-        </w:rPr>
-        <w:t>ی</w:t>
-      </w:r>
-      <w:r>
-        <w:rPr>
-          <w:rFonts w:ascii="SG Kara FaNum Light" w:hAnsi="SG Kara FaNum Light" w:cs="SG Kara FaNum Light" w:hint="eastAsia"/>
-          <w:rtl/>
-          <w:lang w:bidi="fa-IR"/>
-        </w:rPr>
-        <w:t>د</w:t>
-      </w:r>
-      <w:r>
-        <w:rPr>
-          <w:rFonts w:ascii="SG Kara FaNum Light" w:hAnsi="SG Kara FaNum Light" w:cs="SG Kara FaNum Light"/>
-          <w:rtl/>
-          <w:lang w:bidi="fa-IR"/>
-        </w:rPr>
-        <w:t xml:space="preserve"> محصول </w:t>
-      </w:r>
-      <w:r>
-        <w:rPr>
-          <w:rFonts w:ascii="SG Kara FaNum Light" w:hAnsi="SG Kara FaNum Light" w:cs="SG Kara FaNum Light" w:hint="cs"/>
-          <w:rtl/>
-          <w:lang w:bidi="fa-IR"/>
-        </w:rPr>
-        <w:t>ی</w:t>
-      </w:r>
-      <w:r>
-        <w:rPr>
-          <w:rFonts w:ascii="SG Kara FaNum Light" w:hAnsi="SG Kara FaNum Light" w:cs="SG Kara FaNum Light" w:hint="eastAsia"/>
-          <w:rtl/>
-          <w:lang w:bidi="fa-IR"/>
-        </w:rPr>
-        <w:t>ا</w:t>
-      </w:r>
-      <w:r>
-        <w:rPr>
-          <w:rFonts w:ascii="SG Kara FaNum Light" w:hAnsi="SG Kara FaNum Light" w:cs="SG Kara FaNum Light"/>
-          <w:rtl/>
-          <w:lang w:bidi="fa-IR"/>
-        </w:rPr>
-        <w:t xml:space="preserve"> ارائه خدمت به کار رفته و دارا</w:t>
-      </w:r>
-      <w:r>
-        <w:rPr>
-          <w:rFonts w:ascii="SG Kara FaNum Light" w:hAnsi="SG Kara FaNum Light" w:cs="SG Kara FaNum Light" w:hint="cs"/>
-          <w:rtl/>
-          <w:lang w:bidi="fa-IR"/>
-        </w:rPr>
-        <w:t>ی</w:t>
-      </w:r>
-      <w:r>
-        <w:rPr>
-          <w:rFonts w:ascii="SG Kara FaNum Light" w:hAnsi="SG Kara FaNum Light" w:cs="SG Kara FaNum Light"/>
-          <w:rtl/>
-          <w:lang w:bidi="fa-IR"/>
-        </w:rPr>
-        <w:t xml:space="preserve"> زمان شروع و پا</w:t>
-      </w:r>
-      <w:r>
-        <w:rPr>
-          <w:rFonts w:ascii="SG Kara FaNum Light" w:hAnsi="SG Kara FaNum Light" w:cs="SG Kara FaNum Light" w:hint="cs"/>
-          <w:rtl/>
-          <w:lang w:bidi="fa-IR"/>
-        </w:rPr>
-        <w:t>ی</w:t>
-      </w:r>
-      <w:r>
-        <w:rPr>
-          <w:rFonts w:ascii="SG Kara FaNum Light" w:hAnsi="SG Kara FaNum Light" w:cs="SG Kara FaNum Light" w:hint="eastAsia"/>
-          <w:rtl/>
-          <w:lang w:bidi="fa-IR"/>
-        </w:rPr>
-        <w:t>ان</w:t>
-      </w:r>
-      <w:r>
-        <w:rPr>
-          <w:rFonts w:ascii="SG Kara FaNum Light" w:hAnsi="SG Kara FaNum Light" w:cs="SG Kara FaNum Light"/>
-          <w:rtl/>
-          <w:lang w:bidi="fa-IR"/>
-        </w:rPr>
-        <w:t xml:space="preserve"> است و در آن </w:t>
-      </w:r>
-      <w:proofErr w:type="spellStart"/>
-      <w:r>
-        <w:rPr>
-          <w:rFonts w:ascii="SG Kara FaNum Light" w:hAnsi="SG Kara FaNum Light" w:cs="SG Kara FaNum Light"/>
-          <w:rtl/>
-          <w:lang w:bidi="fa-IR"/>
-        </w:rPr>
-        <w:t>پ</w:t>
-      </w:r>
-      <w:r>
-        <w:rPr>
-          <w:rFonts w:ascii="SG Kara FaNum Light" w:hAnsi="SG Kara FaNum Light" w:cs="SG Kara FaNum Light" w:hint="cs"/>
-          <w:rtl/>
-          <w:lang w:bidi="fa-IR"/>
-        </w:rPr>
-        <w:t>ی</w:t>
-      </w:r>
-      <w:r>
-        <w:rPr>
-          <w:rFonts w:ascii="SG Kara FaNum Light" w:hAnsi="SG Kara FaNum Light" w:cs="SG Kara FaNum Light" w:hint="eastAsia"/>
-          <w:rtl/>
-          <w:lang w:bidi="fa-IR"/>
-        </w:rPr>
-        <w:t>ش‌ب</w:t>
-      </w:r>
-      <w:r>
-        <w:rPr>
-          <w:rFonts w:ascii="SG Kara FaNum Light" w:hAnsi="SG Kara FaNum Light" w:cs="SG Kara FaNum Light" w:hint="cs"/>
-          <w:rtl/>
-          <w:lang w:bidi="fa-IR"/>
-        </w:rPr>
-        <w:t>ی</w:t>
-      </w:r>
-      <w:r>
-        <w:rPr>
-          <w:rFonts w:ascii="SG Kara FaNum Light" w:hAnsi="SG Kara FaNum Light" w:cs="SG Kara FaNum Light" w:hint="eastAsia"/>
-          <w:rtl/>
-          <w:lang w:bidi="fa-IR"/>
-        </w:rPr>
-        <w:t>ن</w:t>
-      </w:r>
-      <w:r>
-        <w:rPr>
-          <w:rFonts w:ascii="SG Kara FaNum Light" w:hAnsi="SG Kara FaNum Light" w:cs="SG Kara FaNum Light" w:hint="cs"/>
-          <w:rtl/>
-          <w:lang w:bidi="fa-IR"/>
-        </w:rPr>
-        <w:t>ی</w:t>
-      </w:r>
-      <w:proofErr w:type="spellEnd"/>
-      <w:r>
-        <w:rPr>
-          <w:rFonts w:ascii="SG Kara FaNum Light" w:hAnsi="SG Kara FaNum Light" w:cs="SG Kara FaNum Light"/>
-          <w:rtl/>
-          <w:lang w:bidi="fa-IR"/>
-        </w:rPr>
-        <w:t xml:space="preserve"> زمان انجام هر فعال</w:t>
-      </w:r>
-      <w:r>
-        <w:rPr>
-          <w:rFonts w:ascii="SG Kara FaNum Light" w:hAnsi="SG Kara FaNum Light" w:cs="SG Kara FaNum Light" w:hint="cs"/>
-          <w:rtl/>
-          <w:lang w:bidi="fa-IR"/>
-        </w:rPr>
-        <w:t>ی</w:t>
-      </w:r>
-      <w:r>
-        <w:rPr>
-          <w:rFonts w:ascii="SG Kara FaNum Light" w:hAnsi="SG Kara FaNum Light" w:cs="SG Kara FaNum Light" w:hint="eastAsia"/>
-          <w:rtl/>
-          <w:lang w:bidi="fa-IR"/>
-        </w:rPr>
-        <w:t>ت</w:t>
-      </w:r>
-      <w:r>
-        <w:rPr>
-          <w:rFonts w:ascii="SG Kara FaNum Light" w:hAnsi="SG Kara FaNum Light" w:cs="SG Kara FaNum Light"/>
-          <w:rtl/>
-          <w:lang w:bidi="fa-IR"/>
-        </w:rPr>
-        <w:t xml:space="preserve"> ن</w:t>
-      </w:r>
-      <w:r>
-        <w:rPr>
-          <w:rFonts w:ascii="SG Kara FaNum Light" w:hAnsi="SG Kara FaNum Light" w:cs="SG Kara FaNum Light" w:hint="cs"/>
-          <w:rtl/>
-          <w:lang w:bidi="fa-IR"/>
-        </w:rPr>
-        <w:t>ی</w:t>
-      </w:r>
-      <w:r>
-        <w:rPr>
-          <w:rFonts w:ascii="SG Kara FaNum Light" w:hAnsi="SG Kara FaNum Light" w:cs="SG Kara FaNum Light" w:hint="eastAsia"/>
-          <w:rtl/>
-          <w:lang w:bidi="fa-IR"/>
-        </w:rPr>
-        <w:t>ز</w:t>
-      </w:r>
-      <w:r>
-        <w:rPr>
-          <w:rFonts w:ascii="SG Kara FaNum Light" w:hAnsi="SG Kara FaNum Light" w:cs="SG Kara FaNum Light"/>
-          <w:rtl/>
-          <w:lang w:bidi="fa-IR"/>
-        </w:rPr>
-        <w:t xml:space="preserve"> صورت م</w:t>
-      </w:r>
-      <w:r>
-        <w:rPr>
-          <w:rFonts w:ascii="SG Kara FaNum Light" w:hAnsi="SG Kara FaNum Light" w:cs="SG Kara FaNum Light" w:hint="cs"/>
-          <w:rtl/>
-          <w:lang w:bidi="fa-IR"/>
-        </w:rPr>
-        <w:t>ی‌</w:t>
-      </w:r>
-      <w:r>
-        <w:rPr>
-          <w:rFonts w:ascii="SG Kara FaNum Light" w:hAnsi="SG Kara FaNum Light" w:cs="SG Kara FaNum Light" w:hint="eastAsia"/>
-          <w:rtl/>
-          <w:lang w:bidi="fa-IR"/>
-        </w:rPr>
-        <w:t>گ</w:t>
-      </w:r>
-      <w:r>
-        <w:rPr>
-          <w:rFonts w:ascii="SG Kara FaNum Light" w:hAnsi="SG Kara FaNum Light" w:cs="SG Kara FaNum Light" w:hint="cs"/>
-          <w:rtl/>
-          <w:lang w:bidi="fa-IR"/>
-        </w:rPr>
-        <w:t>ی</w:t>
-      </w:r>
-      <w:r>
-        <w:rPr>
-          <w:rFonts w:ascii="SG Kara FaNum Light" w:hAnsi="SG Kara FaNum Light" w:cs="SG Kara FaNum Light" w:hint="eastAsia"/>
-          <w:rtl/>
-          <w:lang w:bidi="fa-IR"/>
-        </w:rPr>
-        <w:t>رد</w:t>
-      </w:r>
-      <w:r>
-        <w:rPr>
-          <w:rFonts w:ascii="SG Kara FaNum Light" w:hAnsi="SG Kara FaNum Light" w:cs="SG Kara FaNum Light"/>
-          <w:rtl/>
-          <w:lang w:bidi="fa-IR"/>
-        </w:rPr>
-        <w:t>. در</w:t>
-      </w:r>
-      <w:r>
-        <w:rPr>
-          <w:rFonts w:ascii="SG Kara FaNum Light" w:hAnsi="SG Kara FaNum Light" w:cs="SG Kara FaNum Light" w:hint="cs"/>
-          <w:rtl/>
-          <w:lang w:bidi="fa-IR"/>
-        </w:rPr>
-        <w:t xml:space="preserve"> </w:t>
-      </w:r>
-      <w:r>
-        <w:rPr>
-          <w:rFonts w:ascii="SG Kara FaNum Light" w:hAnsi="SG Kara FaNum Light" w:cs="SG Kara FaNum Light"/>
-          <w:rtl/>
-          <w:lang w:bidi="fa-IR"/>
-        </w:rPr>
-        <w:t xml:space="preserve">مجموع، </w:t>
-      </w:r>
-      <w:proofErr w:type="spellStart"/>
-      <w:r>
-        <w:rPr>
-          <w:rFonts w:ascii="SG Kara FaNum Light" w:hAnsi="SG Kara FaNum Light" w:cs="SG Kara FaNum Light"/>
-          <w:rtl/>
-          <w:lang w:bidi="fa-IR"/>
-        </w:rPr>
-        <w:t>پروژه‌ها</w:t>
-      </w:r>
-      <w:proofErr w:type="spellEnd"/>
-      <w:r>
-        <w:rPr>
-          <w:rFonts w:ascii="SG Kara FaNum Light" w:hAnsi="SG Kara FaNum Light" w:cs="SG Kara FaNum Light"/>
-          <w:rtl/>
-          <w:lang w:bidi="fa-IR"/>
-        </w:rPr>
-        <w:t xml:space="preserve"> </w:t>
-      </w:r>
-      <w:proofErr w:type="spellStart"/>
-      <w:r>
-        <w:rPr>
-          <w:rFonts w:ascii="SG Kara FaNum Light" w:hAnsi="SG Kara FaNum Light" w:cs="SG Kara FaNum Light"/>
-          <w:rtl/>
-          <w:lang w:bidi="fa-IR"/>
-        </w:rPr>
-        <w:t>مجموعه‌ا</w:t>
-      </w:r>
-      <w:r>
-        <w:rPr>
-          <w:rFonts w:ascii="SG Kara FaNum Light" w:hAnsi="SG Kara FaNum Light" w:cs="SG Kara FaNum Light" w:hint="cs"/>
-          <w:rtl/>
-          <w:lang w:bidi="fa-IR"/>
-        </w:rPr>
-        <w:t>ی</w:t>
-      </w:r>
-      <w:proofErr w:type="spellEnd"/>
-      <w:r>
-        <w:rPr>
-          <w:rFonts w:ascii="SG Kara FaNum Light" w:hAnsi="SG Kara FaNum Light" w:cs="SG Kara FaNum Light"/>
-          <w:rtl/>
-          <w:lang w:bidi="fa-IR"/>
-        </w:rPr>
-        <w:t xml:space="preserve"> از </w:t>
-      </w:r>
-      <w:proofErr w:type="spellStart"/>
-      <w:r>
-        <w:rPr>
-          <w:rFonts w:ascii="SG Kara FaNum Light" w:hAnsi="SG Kara FaNum Light" w:cs="SG Kara FaNum Light"/>
-          <w:rtl/>
-          <w:lang w:bidi="fa-IR"/>
-        </w:rPr>
-        <w:t>فعال</w:t>
-      </w:r>
-      <w:r>
-        <w:rPr>
-          <w:rFonts w:ascii="SG Kara FaNum Light" w:hAnsi="SG Kara FaNum Light" w:cs="SG Kara FaNum Light" w:hint="cs"/>
-          <w:rtl/>
-          <w:lang w:bidi="fa-IR"/>
-        </w:rPr>
-        <w:t>ی</w:t>
-      </w:r>
-      <w:r>
-        <w:rPr>
-          <w:rFonts w:ascii="SG Kara FaNum Light" w:hAnsi="SG Kara FaNum Light" w:cs="SG Kara FaNum Light" w:hint="eastAsia"/>
-          <w:rtl/>
-          <w:lang w:bidi="fa-IR"/>
-        </w:rPr>
-        <w:t>ت‌ها</w:t>
-      </w:r>
-      <w:r>
-        <w:rPr>
-          <w:rFonts w:ascii="SG Kara FaNum Light" w:hAnsi="SG Kara FaNum Light" w:cs="SG Kara FaNum Light" w:hint="cs"/>
-          <w:rtl/>
-          <w:lang w:bidi="fa-IR"/>
-        </w:rPr>
-        <w:t>ی</w:t>
-      </w:r>
-      <w:proofErr w:type="spellEnd"/>
-      <w:r>
-        <w:rPr>
-          <w:rFonts w:ascii="SG Kara FaNum Light" w:hAnsi="SG Kara FaNum Light" w:cs="SG Kara FaNum Light"/>
-          <w:rtl/>
-          <w:lang w:bidi="fa-IR"/>
-        </w:rPr>
-        <w:t xml:space="preserve"> به خصوص هستند که به افراد و سازمان‌ها کمک م</w:t>
-      </w:r>
-      <w:r>
-        <w:rPr>
-          <w:rFonts w:ascii="SG Kara FaNum Light" w:hAnsi="SG Kara FaNum Light" w:cs="SG Kara FaNum Light" w:hint="cs"/>
-          <w:rtl/>
-          <w:lang w:bidi="fa-IR"/>
-        </w:rPr>
-        <w:t>ی‌</w:t>
-      </w:r>
-      <w:r>
-        <w:rPr>
-          <w:rFonts w:ascii="SG Kara FaNum Light" w:hAnsi="SG Kara FaNum Light" w:cs="SG Kara FaNum Light" w:hint="eastAsia"/>
-          <w:rtl/>
-          <w:lang w:bidi="fa-IR"/>
-        </w:rPr>
-        <w:t>کنند</w:t>
-      </w:r>
-      <w:r>
-        <w:rPr>
-          <w:rFonts w:ascii="SG Kara FaNum Light" w:hAnsi="SG Kara FaNum Light" w:cs="SG Kara FaNum Light"/>
-          <w:rtl/>
-          <w:lang w:bidi="fa-IR"/>
-        </w:rPr>
-        <w:t xml:space="preserve"> تا به اهداف تجار</w:t>
-      </w:r>
-      <w:r>
-        <w:rPr>
-          <w:rFonts w:ascii="SG Kara FaNum Light" w:hAnsi="SG Kara FaNum Light" w:cs="SG Kara FaNum Light" w:hint="cs"/>
-          <w:rtl/>
-          <w:lang w:bidi="fa-IR"/>
-        </w:rPr>
-        <w:t>ی</w:t>
-      </w:r>
-      <w:r>
-        <w:rPr>
-          <w:rFonts w:ascii="SG Kara FaNum Light" w:hAnsi="SG Kara FaNum Light" w:cs="SG Kara FaNum Light"/>
-          <w:rtl/>
-          <w:lang w:bidi="fa-IR"/>
-        </w:rPr>
-        <w:t xml:space="preserve"> و غ</w:t>
-      </w:r>
-      <w:r>
-        <w:rPr>
-          <w:rFonts w:ascii="SG Kara FaNum Light" w:hAnsi="SG Kara FaNum Light" w:cs="SG Kara FaNum Light" w:hint="cs"/>
-          <w:rtl/>
-          <w:lang w:bidi="fa-IR"/>
-        </w:rPr>
-        <w:t>ی</w:t>
-      </w:r>
-      <w:r>
-        <w:rPr>
-          <w:rFonts w:ascii="SG Kara FaNum Light" w:hAnsi="SG Kara FaNum Light" w:cs="SG Kara FaNum Light" w:hint="eastAsia"/>
-          <w:rtl/>
-          <w:lang w:bidi="fa-IR"/>
-        </w:rPr>
-        <w:t>رتجار</w:t>
-      </w:r>
-      <w:r>
-        <w:rPr>
-          <w:rFonts w:ascii="SG Kara FaNum Light" w:hAnsi="SG Kara FaNum Light" w:cs="SG Kara FaNum Light" w:hint="cs"/>
-          <w:rtl/>
-          <w:lang w:bidi="fa-IR"/>
-        </w:rPr>
-        <w:t>ی</w:t>
-      </w:r>
-      <w:r>
-        <w:rPr>
-          <w:rFonts w:ascii="SG Kara FaNum Light" w:hAnsi="SG Kara FaNum Light" w:cs="SG Kara FaNum Light"/>
-          <w:rtl/>
-          <w:lang w:bidi="fa-IR"/>
-        </w:rPr>
-        <w:t xml:space="preserve"> خود دست</w:t>
-      </w:r>
-      <w:r>
-        <w:rPr>
-          <w:rFonts w:ascii="SG Kara FaNum Light" w:hAnsi="SG Kara FaNum Light" w:cs="SG Kara FaNum Light" w:hint="cs"/>
-          <w:rtl/>
-          <w:lang w:bidi="fa-IR"/>
-        </w:rPr>
-        <w:t xml:space="preserve"> </w:t>
-      </w:r>
-      <w:r>
-        <w:rPr>
-          <w:rFonts w:ascii="SG Kara FaNum Light" w:hAnsi="SG Kara FaNum Light" w:cs="SG Kara FaNum Light"/>
-          <w:rtl/>
-          <w:lang w:bidi="fa-IR"/>
-        </w:rPr>
-        <w:t>‌</w:t>
-      </w:r>
-      <w:r>
-        <w:rPr>
-          <w:rFonts w:ascii="SG Kara FaNum Light" w:hAnsi="SG Kara FaNum Light" w:cs="SG Kara FaNum Light" w:hint="cs"/>
-          <w:rtl/>
-          <w:lang w:bidi="fa-IR"/>
-        </w:rPr>
-        <w:t>ی</w:t>
-      </w:r>
-      <w:r>
-        <w:rPr>
-          <w:rFonts w:ascii="SG Kara FaNum Light" w:hAnsi="SG Kara FaNum Light" w:cs="SG Kara FaNum Light" w:hint="eastAsia"/>
-          <w:rtl/>
-          <w:lang w:bidi="fa-IR"/>
-        </w:rPr>
-        <w:t>ابند</w:t>
-      </w:r>
-      <w:r>
-        <w:rPr>
-          <w:rFonts w:ascii="SG Kara FaNum Light" w:hAnsi="SG Kara FaNum Light" w:cs="SG Kara FaNum Light"/>
-          <w:rtl/>
-          <w:lang w:bidi="fa-IR"/>
-        </w:rPr>
-        <w:t>. و</w:t>
-      </w:r>
-      <w:r>
-        <w:rPr>
-          <w:rFonts w:ascii="SG Kara FaNum Light" w:hAnsi="SG Kara FaNum Light" w:cs="SG Kara FaNum Light" w:hint="cs"/>
-          <w:rtl/>
-          <w:lang w:bidi="fa-IR"/>
-        </w:rPr>
-        <w:t>ی</w:t>
-      </w:r>
-      <w:r>
-        <w:rPr>
-          <w:rFonts w:ascii="SG Kara FaNum Light" w:hAnsi="SG Kara FaNum Light" w:cs="SG Kara FaNum Light" w:hint="eastAsia"/>
-          <w:rtl/>
-          <w:lang w:bidi="fa-IR"/>
-        </w:rPr>
-        <w:t>ژگ</w:t>
-      </w:r>
-      <w:r>
-        <w:rPr>
-          <w:rFonts w:ascii="SG Kara FaNum Light" w:hAnsi="SG Kara FaNum Light" w:cs="SG Kara FaNum Light" w:hint="cs"/>
-          <w:rtl/>
-          <w:lang w:bidi="fa-IR"/>
-        </w:rPr>
-        <w:t>ی‌</w:t>
-      </w:r>
-      <w:r>
-        <w:rPr>
-          <w:rFonts w:ascii="SG Kara FaNum Light" w:hAnsi="SG Kara FaNum Light" w:cs="SG Kara FaNum Light" w:hint="eastAsia"/>
-          <w:rtl/>
-          <w:lang w:bidi="fa-IR"/>
-        </w:rPr>
-        <w:t>ها</w:t>
-      </w:r>
-      <w:r>
-        <w:rPr>
-          <w:rFonts w:ascii="SG Kara FaNum Light" w:hAnsi="SG Kara FaNum Light" w:cs="SG Kara FaNum Light" w:hint="cs"/>
-          <w:rtl/>
-          <w:lang w:bidi="fa-IR"/>
-        </w:rPr>
-        <w:t>ی</w:t>
-      </w:r>
-      <w:r>
-        <w:rPr>
-          <w:rFonts w:ascii="SG Kara FaNum Light" w:hAnsi="SG Kara FaNum Light" w:cs="SG Kara FaNum Light"/>
-          <w:rtl/>
-          <w:lang w:bidi="fa-IR"/>
-        </w:rPr>
-        <w:t xml:space="preserve"> متما</w:t>
-      </w:r>
-      <w:r>
-        <w:rPr>
-          <w:rFonts w:ascii="SG Kara FaNum Light" w:hAnsi="SG Kara FaNum Light" w:cs="SG Kara FaNum Light" w:hint="cs"/>
-          <w:rtl/>
-          <w:lang w:bidi="fa-IR"/>
-        </w:rPr>
-        <w:t>ی</w:t>
-      </w:r>
-      <w:r>
-        <w:rPr>
-          <w:rFonts w:ascii="SG Kara FaNum Light" w:hAnsi="SG Kara FaNum Light" w:cs="SG Kara FaNum Light" w:hint="eastAsia"/>
-          <w:rtl/>
-          <w:lang w:bidi="fa-IR"/>
-        </w:rPr>
-        <w:t>ز</w:t>
-      </w:r>
-      <w:r>
-        <w:rPr>
-          <w:rFonts w:ascii="SG Kara FaNum Light" w:hAnsi="SG Kara FaNum Light" w:cs="SG Kara FaNum Light"/>
-          <w:rtl/>
-          <w:lang w:bidi="fa-IR"/>
-        </w:rPr>
-        <w:t xml:space="preserve"> کننده آن شامل منحصر به فرد بودن، داشتن هدف مشخص، محدود</w:t>
-      </w:r>
-      <w:r>
-        <w:rPr>
-          <w:rFonts w:ascii="SG Kara FaNum Light" w:hAnsi="SG Kara FaNum Light" w:cs="SG Kara FaNum Light" w:hint="cs"/>
-          <w:rtl/>
-          <w:lang w:bidi="fa-IR"/>
-        </w:rPr>
-        <w:t>ی</w:t>
-      </w:r>
-      <w:r>
-        <w:rPr>
-          <w:rFonts w:ascii="SG Kara FaNum Light" w:hAnsi="SG Kara FaNum Light" w:cs="SG Kara FaNum Light" w:hint="eastAsia"/>
-          <w:rtl/>
-          <w:lang w:bidi="fa-IR"/>
-        </w:rPr>
-        <w:t>ت</w:t>
-      </w:r>
-      <w:r>
-        <w:rPr>
-          <w:rFonts w:ascii="SG Kara FaNum Light" w:hAnsi="SG Kara FaNum Light" w:cs="SG Kara FaNum Light"/>
-          <w:rtl/>
-          <w:lang w:bidi="fa-IR"/>
-        </w:rPr>
-        <w:t xml:space="preserve"> در زمان و منابع و موقت بودن است</w:t>
-      </w:r>
-      <w:r>
-        <w:rPr>
-          <w:rFonts w:ascii="SG Kara FaNum Light" w:hAnsi="SG Kara FaNum Light" w:cs="SG Kara FaNum Light" w:hint="cs"/>
-          <w:rtl/>
-          <w:lang w:bidi="fa-IR"/>
-        </w:rPr>
-        <w:t>.</w:t>
-      </w:r>
-    </w:p>
-    <w:p>
-      <w:pPr>
-        <w:bidi/>
-        <w:rPr>
-          <w:rFonts w:ascii="SG Kara FaNum Light" w:hAnsi="SG Kara FaNum Light" w:cs="SG Kara FaNum Light"/>
-          <w:rtl/>
-          <w:lang w:bidi="fa-IR"/>
-        </w:rPr>
-      </w:pPr>
-    </w:p>
-    <w:p>
-      <w:pPr>
-        <w:bidi/>
-        <w:rPr>
-          <w:rFonts w:ascii="SG Kara FaNum Light" w:hAnsi="SG Kara FaNum Light" w:cs="SG Kara FaNum Light"/>
-          <w:rtl/>
-          <w:lang w:bidi="fa-IR"/>
-        </w:rPr>
-      </w:pPr>
-      <w:r>
-        <w:rPr>
-          <w:rFonts w:ascii="SG Kara FaNum Light" w:hAnsi="SG Kara FaNum Light" w:cs="SG Kara FaNum Light" w:hint="cs"/>
-          <w:rtl/>
-          <w:lang w:bidi="fa-IR"/>
-        </w:rPr>
-        <w:t>برای تعریف یک پروژه  باید از مسیر منوی اصلی/ عمومی/ اطلاعات پایه / پروژه ،  کلید + را  انتخاب کنید و در صفحه باز شده موارد زیر را پر کنید:</w:t>
-      </w:r>
-    </w:p>
-    <w:p>
-      <w:pPr>
-        <w:bidi/>
-        <w:rPr>
-          <w:rFonts w:ascii="SG Kara FaNum Light" w:hAnsi="SG Kara FaNum Light" w:cs="SG Kara FaNum Light"/>
-          <w:rtl/>
+          <w:rtl/>
+          <w:lang w:bidi="fa-IR"/>
+        </w:rPr>
+      </w:pPr>
+    </w:p>
+    <w:p>
+      <w:pPr>
+        <w:bidi/>
+        <w:rPr>
+          <w:rFonts w:ascii="SG Kara FaNum Light" w:hAnsi="SG Kara FaNum Light" w:cs="SG Kara FaNum Light"/>
+          <w:rtl/>
+          <w:lang w:bidi="fa-IR"/>
+        </w:rPr>
+      </w:pPr>
+      <w:r>
+        <w:rPr>
+          <w:rFonts w:ascii="SG Kara FaNum Light" w:hAnsi="SG Kara FaNum Light" w:cs="SG Kara FaNum Light" w:hint="cs"/>
+          <w:rtl/>
+          <w:lang w:bidi="fa-IR"/>
+        </w:rPr>
+        <w:t>بعد از ذخیره، بخش اطلاعات تفصیل را در سمت چپ صفحه مشاهده میکنید، با انتخاب کلید "ایجاد " یک صفحه باز میشود ، در این صفحه میتوانید کد تفصیل را وارد کنید و یا این کد به صورت پیش فرض بر اساس روش کدگذاری تعریف شده وارد می شود.</w:t>
+      </w:r>
+      <w:r>
+        <w:rPr>
+          <w:rFonts w:ascii="SG Kara FaNum Light" w:hAnsi="SG Kara FaNum Light" w:cs="SG Kara FaNum Light"/>
+          <w:rtl/>
+          <w:lang w:bidi="fa-IR"/>
+        </w:rPr>
+        <w:br/>
+      </w:r>
+      <w:r>
+        <w:rPr>
+          <w:rFonts w:ascii="SG Kara FaNum Light" w:hAnsi="SG Kara FaNum Light" w:cs="SG Kara FaNum Light" w:hint="cs"/>
+          <w:rtl/>
+          <w:lang w:bidi="fa-IR"/>
+        </w:rPr>
+        <w:t>نام تفصیل برابر با عنوان مرکز هزینه خواهد بود.</w:t>
+      </w:r>
+    </w:p>
+    <w:p>
+      <w:pPr>
+        <w:bidi/>
+        <w:rPr>
+          <w:rFonts w:ascii="SG Kara FaNum Light" w:hAnsi="SG Kara FaNum Light" w:cs="SG Kara FaNum Light"/>
+          <w:rtl/>
+          <w:lang w:bidi="fa-IR"/>
+        </w:rPr>
+      </w:pPr>
+      <w:r>
+        <w:rPr>
+          <w:rFonts w:ascii="SG Kara FaNum Light" w:hAnsi="SG Kara FaNum Light" w:cs="SG Kara FaNum Light" w:hint="cs"/>
+          <w:rtl/>
+          <w:lang w:bidi="fa-IR"/>
+        </w:rPr>
+        <w:lastRenderedPageBreak/>
+        <w:t>با انتخاب کلید ذخیره، حساب تفصیل مربوط به مرکز هزینه نیز ذخیره خواهد شد.</w:t>
+      </w:r>
+      <w:r>
+        <w:rPr>
+          <w:rFonts w:ascii="SG Kara FaNum Light" w:hAnsi="SG Kara FaNum Light" w:cs="SG Kara FaNum Light"/>
+          <w:rtl/>
+          <w:lang w:bidi="fa-IR"/>
+        </w:rPr>
+        <w:br/>
+      </w:r>
+    </w:p>
+    <w:p>
+      <w:pPr>
+        <w:bidi/>
+        <w:rPr>
+          <w:rFonts w:ascii="SG Kara FaNum Light" w:hAnsi="SG Kara FaNum Light" w:cs="SG Kara FaNum Light"/>
           <w:lang w:bidi="fa-IR"/>
         </w:rPr>
       </w:pPr>
@@ -18791,10 +17994,10 @@
           <w:lang w:bidi="fa-IR"/>
         </w:rPr>
         <w:drawing>
-          <wp:inline distT="0" distB="0" distL="0" distR="0" wp14:anchorId="2F78A538" wp14:editId="42672C69">
-            <wp:extent cx="5943600" cy="1134110"/>
-            <wp:effectExtent l="0" t="0" r="0" b="8890"/>
-            <wp:docPr id="13" name="Picture 13"/>
+          <wp:inline distT="0" distB="0" distL="0" distR="0" wp14:anchorId="43D3D618" wp14:editId="30C9240C">
+            <wp:extent cx="5943600" cy="2349500"/>
+            <wp:effectExtent l="0" t="0" r="0" b="0"/>
+            <wp:docPr id="12" name="Picture 12"/>
             <wp:cNvGraphicFramePr>
               <a:graphicFrameLocks xmlns:a="http://schemas.openxmlformats.org/drawingml/2006/main" noChangeAspect="1"/>
             </wp:cNvGraphicFramePr>
@@ -18814,7 +18017,7 @@
                   <pic:spPr>
                     <a:xfrm>
                       <a:off x="0" y="0"/>
-                      <a:ext cx="5943600" cy="1134110"/>
+                      <a:ext cx="5943600" cy="2349500"/>
                     </a:xfrm>
                     <a:prstGeom prst="rect">
                       <a:avLst/>
@@ -18832,124 +18035,809 @@
         <w:bidi/>
         <w:rPr>
           <w:rFonts w:ascii="SG Kara FaNum Light" w:hAnsi="SG Kara FaNum Light" w:cs="SG Kara FaNum Light"/>
-          <w:rtl/>
-          <w:lang w:bidi="fa-IR"/>
-        </w:rPr>
-      </w:pPr>
-      <w:r>
-        <w:rPr>
-          <w:rFonts w:ascii="SG Kara FaNum Light" w:hAnsi="SG Kara FaNum Light" w:cs="SG Kara FaNum Light" w:hint="cs"/>
-          <w:rtl/>
-          <w:lang w:bidi="fa-IR"/>
-        </w:rPr>
-        <w:t xml:space="preserve">کد: کد مورد نظر برای نمایش پروژه </w:t>
-      </w:r>
-    </w:p>
-    <w:p>
-      <w:pPr>
-        <w:bidi/>
-        <w:rPr>
-          <w:rFonts w:ascii="SG Kara FaNum Light" w:hAnsi="SG Kara FaNum Light" w:cs="SG Kara FaNum Light"/>
-          <w:rtl/>
-          <w:lang w:bidi="fa-IR"/>
-        </w:rPr>
-      </w:pPr>
-      <w:r>
-        <w:rPr>
-          <w:rFonts w:ascii="SG Kara FaNum Light" w:hAnsi="SG Kara FaNum Light" w:cs="SG Kara FaNum Light" w:hint="cs"/>
-          <w:rtl/>
-          <w:lang w:bidi="fa-IR"/>
-        </w:rPr>
-        <w:lastRenderedPageBreak/>
-        <w:t>عنوان: نام پروژه</w:t>
-      </w:r>
-    </w:p>
-    <w:p>
-      <w:pPr>
-        <w:bidi/>
-        <w:rPr>
-          <w:rFonts w:ascii="SG Kara FaNum Light" w:hAnsi="SG Kara FaNum Light" w:cs="SG Kara FaNum Light"/>
-          <w:rtl/>
-          <w:lang w:bidi="fa-IR"/>
-        </w:rPr>
-      </w:pPr>
-      <w:r>
-        <w:rPr>
-          <w:rFonts w:ascii="SG Kara FaNum Light" w:hAnsi="SG Kara FaNum Light" w:cs="SG Kara FaNum Light" w:hint="cs"/>
-          <w:rtl/>
-          <w:lang w:bidi="fa-IR"/>
-        </w:rPr>
-        <w:t xml:space="preserve">فعال: به صورت پیش فرض فعال است، اما در صورت لزوم میتوان پروژه را غیرفعال کرد. در صورتی که وضعیت پروژه غیر فعال باشد، در عملیات سیستم مشاهده </w:t>
+          <w:lang w:bidi="fa-IR"/>
+        </w:rPr>
+      </w:pPr>
+    </w:p>
+    <w:p>
+      <w:pPr>
+        <w:bidi/>
+        <w:rPr>
+          <w:rFonts w:ascii="SG Kara FaNum Light" w:hAnsi="SG Kara FaNum Light" w:cs="SG Kara FaNum Light"/>
+          <w:lang w:bidi="fa-IR"/>
+        </w:rPr>
+      </w:pPr>
+    </w:p>
+    <w:p>
+      <w:pPr>
+        <w:bidi/>
+        <w:rPr>
+          <w:rFonts w:ascii="SG Kara FaNum Light" w:hAnsi="SG Kara FaNum Light" w:cs="SG Kara FaNum Light"/>
+          <w:rtl/>
+          <w:lang w:bidi="fa-IR"/>
+        </w:rPr>
+      </w:pPr>
+      <w:r>
+        <w:rPr>
+          <w:rFonts w:ascii="SG Kara FaNum Light" w:hAnsi="SG Kara FaNum Light" w:cs="SG Kara FaNum Light" w:hint="cs"/>
+          <w:rtl/>
+          <w:lang w:bidi="fa-IR"/>
+        </w:rPr>
+        <w:t>در گوشه صفحه با انتخاب کلید سه نقطه امکان مشاهده فهرست مراکز هزینه را خواهید داشت.</w:t>
+      </w:r>
+    </w:p>
+    <w:p>
+      <w:pPr>
+        <w:bidi/>
+        <w:rPr>
+          <w:rFonts w:ascii="SG Kara FaNum Light" w:hAnsi="SG Kara FaNum Light" w:cs="SG Kara FaNum Light"/>
+          <w:rtl/>
+          <w:lang w:bidi="fa-IR"/>
+        </w:rPr>
+      </w:pPr>
+      <w:r>
+        <w:rPr>
+          <w:rFonts w:ascii="SG Kara FaNum Light" w:hAnsi="SG Kara FaNum Light" w:cs="SG Kara FaNum Light" w:hint="cs"/>
+          <w:rtl/>
+          <w:lang w:bidi="fa-IR"/>
+        </w:rPr>
+        <w:t>با انتخاب کلید حذف ، مرکز هزینه شما حذف خواهد شد، لازم به ذکر است اگر تفصیل مرکز هزینه استفاده شده باشد، امکان حذف آن وجود ندارد.</w:t>
+      </w:r>
+    </w:p>
+    <w:p>
+      <w:pPr>
+        <w:bidi/>
+        <w:rPr>
+          <w:rFonts w:ascii="SG Kara FaNum Light" w:hAnsi="SG Kara FaNum Light" w:cs="SG Kara FaNum Light"/>
+          <w:rtl/>
+          <w:lang w:bidi="fa-IR"/>
+        </w:rPr>
+      </w:pPr>
+    </w:p>
+    <w:p>
+      <w:pPr>
+        <w:pStyle w:val="Heading1"/>
+        <w:bidi/>
+        <w:rPr>
+          <w:rtl/>
+          <w:lang w:bidi="fa-IR"/>
+        </w:rPr>
+      </w:pPr>
+      <w:r>
+        <w:rPr>
+          <w:rFonts w:hint="cs"/>
+          <w:rtl/>
+          <w:lang w:bidi="fa-IR"/>
+        </w:rPr>
+        <w:t>پروژه</w:t>
+      </w:r>
+    </w:p>
+    <w:p>
+      <w:pPr>
+        <w:bidi/>
+        <w:rPr>
+          <w:rFonts w:ascii="SG Kara FaNum Light" w:hAnsi="SG Kara FaNum Light" w:cs="SG Kara FaNum Light"/>
+          <w:rtl/>
+          <w:lang w:bidi="fa-IR"/>
+        </w:rPr>
+      </w:pPr>
+      <w:r>
+        <w:rPr>
+          <w:rFonts w:ascii="SG Kara FaNum Light" w:hAnsi="SG Kara FaNum Light" w:cs="SG Kara FaNum Light"/>
+          <w:rtl/>
+          <w:lang w:bidi="fa-IR"/>
+        </w:rPr>
+        <w:t>پروژه مجموعه فعال</w:t>
+      </w:r>
+      <w:r>
+        <w:rPr>
+          <w:rFonts w:ascii="SG Kara FaNum Light" w:hAnsi="SG Kara FaNum Light" w:cs="SG Kara FaNum Light" w:hint="cs"/>
+          <w:rtl/>
+          <w:lang w:bidi="fa-IR"/>
+        </w:rPr>
+        <w:t>ی</w:t>
+      </w:r>
+      <w:r>
+        <w:rPr>
+          <w:rFonts w:ascii="SG Kara FaNum Light" w:hAnsi="SG Kara FaNum Light" w:cs="SG Kara FaNum Light" w:hint="eastAsia"/>
+          <w:rtl/>
+          <w:lang w:bidi="fa-IR"/>
+        </w:rPr>
+        <w:t>ت‌ها</w:t>
+      </w:r>
+      <w:r>
+        <w:rPr>
+          <w:rFonts w:ascii="SG Kara FaNum Light" w:hAnsi="SG Kara FaNum Light" w:cs="SG Kara FaNum Light" w:hint="cs"/>
+          <w:rtl/>
+          <w:lang w:bidi="fa-IR"/>
+        </w:rPr>
+        <w:t>ی</w:t>
+      </w:r>
+      <w:r>
+        <w:rPr>
+          <w:rFonts w:ascii="SG Kara FaNum Light" w:hAnsi="SG Kara FaNum Light" w:cs="SG Kara FaNum Light"/>
+          <w:rtl/>
+          <w:lang w:bidi="fa-IR"/>
+        </w:rPr>
+        <w:t xml:space="preserve"> فرد</w:t>
+      </w:r>
+      <w:r>
+        <w:rPr>
+          <w:rFonts w:ascii="SG Kara FaNum Light" w:hAnsi="SG Kara FaNum Light" w:cs="SG Kara FaNum Light" w:hint="cs"/>
+          <w:rtl/>
+          <w:lang w:bidi="fa-IR"/>
+        </w:rPr>
+        <w:t>ی</w:t>
+      </w:r>
+      <w:r>
+        <w:rPr>
+          <w:rFonts w:ascii="SG Kara FaNum Light" w:hAnsi="SG Kara FaNum Light" w:cs="SG Kara FaNum Light"/>
+          <w:rtl/>
+          <w:lang w:bidi="fa-IR"/>
+        </w:rPr>
+        <w:t xml:space="preserve"> </w:t>
+      </w:r>
+      <w:r>
+        <w:rPr>
+          <w:rFonts w:ascii="SG Kara FaNum Light" w:hAnsi="SG Kara FaNum Light" w:cs="SG Kara FaNum Light" w:hint="cs"/>
+          <w:rtl/>
+          <w:lang w:bidi="fa-IR"/>
+        </w:rPr>
+        <w:t>ی</w:t>
+      </w:r>
+      <w:r>
+        <w:rPr>
+          <w:rFonts w:ascii="SG Kara FaNum Light" w:hAnsi="SG Kara FaNum Light" w:cs="SG Kara FaNum Light" w:hint="eastAsia"/>
+          <w:rtl/>
+          <w:lang w:bidi="fa-IR"/>
+        </w:rPr>
+        <w:t>ا</w:t>
+      </w:r>
+      <w:r>
+        <w:rPr>
+          <w:rFonts w:ascii="SG Kara FaNum Light" w:hAnsi="SG Kara FaNum Light" w:cs="SG Kara FaNum Light"/>
+          <w:rtl/>
+          <w:lang w:bidi="fa-IR"/>
+        </w:rPr>
+        <w:t xml:space="preserve"> گروه</w:t>
+      </w:r>
+      <w:r>
+        <w:rPr>
+          <w:rFonts w:ascii="SG Kara FaNum Light" w:hAnsi="SG Kara FaNum Light" w:cs="SG Kara FaNum Light" w:hint="cs"/>
+          <w:rtl/>
+          <w:lang w:bidi="fa-IR"/>
+        </w:rPr>
+        <w:t>ی</w:t>
+      </w:r>
+      <w:r>
+        <w:rPr>
+          <w:rFonts w:ascii="SG Kara FaNum Light" w:hAnsi="SG Kara FaNum Light" w:cs="SG Kara FaNum Light"/>
+          <w:rtl/>
+          <w:lang w:bidi="fa-IR"/>
+        </w:rPr>
+        <w:t xml:space="preserve"> خاص و قابل </w:t>
       </w:r>
       <w:proofErr w:type="spellStart"/>
       <w:r>
         <w:rPr>
-          <w:rFonts w:ascii="SG Kara FaNum Light" w:hAnsi="SG Kara FaNum Light" w:cs="SG Kara FaNum Light" w:hint="cs"/>
-          <w:rtl/>
-          <w:lang w:bidi="fa-IR"/>
-        </w:rPr>
-        <w:t>نمی</w:t>
+          <w:rFonts w:ascii="SG Kara FaNum Light" w:hAnsi="SG Kara FaNum Light" w:cs="SG Kara FaNum Light"/>
+          <w:rtl/>
+          <w:lang w:bidi="fa-IR"/>
+        </w:rPr>
+        <w:t>اندازه‌گ</w:t>
+      </w:r>
+      <w:r>
+        <w:rPr>
+          <w:rFonts w:ascii="SG Kara FaNum Light" w:hAnsi="SG Kara FaNum Light" w:cs="SG Kara FaNum Light" w:hint="cs"/>
+          <w:rtl/>
+          <w:lang w:bidi="fa-IR"/>
+        </w:rPr>
+        <w:t>ی</w:t>
+      </w:r>
+      <w:r>
+        <w:rPr>
+          <w:rFonts w:ascii="SG Kara FaNum Light" w:hAnsi="SG Kara FaNum Light" w:cs="SG Kara FaNum Light" w:hint="eastAsia"/>
+          <w:rtl/>
+          <w:lang w:bidi="fa-IR"/>
+        </w:rPr>
+        <w:t>ر</w:t>
+      </w:r>
+      <w:r>
+        <w:rPr>
+          <w:rFonts w:ascii="SG Kara FaNum Light" w:hAnsi="SG Kara FaNum Light" w:cs="SG Kara FaNum Light" w:hint="cs"/>
+          <w:rtl/>
+          <w:lang w:bidi="fa-IR"/>
+        </w:rPr>
+        <w:t>ی</w:t>
       </w:r>
       <w:proofErr w:type="spellEnd"/>
       <w:r>
         <w:rPr>
-          <w:rFonts w:ascii="SG Kara FaNum Light" w:hAnsi="SG Kara FaNum Light" w:cs="SG Kara FaNum Light" w:hint="cs"/>
-          <w:rtl/>
-          <w:lang w:bidi="fa-IR"/>
-        </w:rPr>
-        <w:t xml:space="preserve"> شود.</w:t>
-      </w:r>
-    </w:p>
-    <w:p>
-      <w:pPr>
-        <w:bidi/>
-        <w:rPr>
-          <w:rFonts w:ascii="SG Kara FaNum Light" w:hAnsi="SG Kara FaNum Light" w:cs="SG Kara FaNum Light"/>
-          <w:rtl/>
-          <w:lang w:bidi="fa-IR"/>
-        </w:rPr>
-      </w:pPr>
-      <w:r>
-        <w:rPr>
-          <w:rFonts w:ascii="SG Kara FaNum Light" w:hAnsi="SG Kara FaNum Light" w:cs="SG Kara FaNum Light" w:hint="cs"/>
-          <w:rtl/>
-          <w:lang w:bidi="fa-IR"/>
-        </w:rPr>
-        <w:t>سپس با استفاده از کلید "ذخیره" در گوشه سمت چپ  پروژه ذخیره میشود.</w:t>
-      </w:r>
-      <w:r>
-        <w:rPr>
-          <w:rFonts w:ascii="SG Kara FaNum Light" w:hAnsi="SG Kara FaNum Light" w:cs="SG Kara FaNum Light"/>
-          <w:rtl/>
-          <w:lang w:bidi="fa-IR"/>
-        </w:rPr>
-        <w:br/>
-      </w:r>
-      <w:r>
-        <w:rPr>
-          <w:rFonts w:ascii="SG Kara FaNum Light" w:hAnsi="SG Kara FaNum Light" w:cs="SG Kara FaNum Light" w:hint="cs"/>
-          <w:rtl/>
-          <w:lang w:bidi="fa-IR"/>
-        </w:rPr>
-        <w:t>در صورت انتخاب کلید "</w:t>
+          <w:rFonts w:ascii="SG Kara FaNum Light" w:hAnsi="SG Kara FaNum Light" w:cs="SG Kara FaNum Light"/>
+          <w:rtl/>
+          <w:lang w:bidi="fa-IR"/>
+        </w:rPr>
+        <w:t xml:space="preserve"> است که به منظور تول</w:t>
+      </w:r>
+      <w:r>
+        <w:rPr>
+          <w:rFonts w:ascii="SG Kara FaNum Light" w:hAnsi="SG Kara FaNum Light" w:cs="SG Kara FaNum Light" w:hint="cs"/>
+          <w:rtl/>
+          <w:lang w:bidi="fa-IR"/>
+        </w:rPr>
+        <w:t>ی</w:t>
+      </w:r>
+      <w:r>
+        <w:rPr>
+          <w:rFonts w:ascii="SG Kara FaNum Light" w:hAnsi="SG Kara FaNum Light" w:cs="SG Kara FaNum Light" w:hint="eastAsia"/>
+          <w:rtl/>
+          <w:lang w:bidi="fa-IR"/>
+        </w:rPr>
+        <w:t>د</w:t>
+      </w:r>
+      <w:r>
+        <w:rPr>
+          <w:rFonts w:ascii="SG Kara FaNum Light" w:hAnsi="SG Kara FaNum Light" w:cs="SG Kara FaNum Light"/>
+          <w:rtl/>
+          <w:lang w:bidi="fa-IR"/>
+        </w:rPr>
+        <w:t xml:space="preserve"> محصول </w:t>
+      </w:r>
+      <w:r>
+        <w:rPr>
+          <w:rFonts w:ascii="SG Kara FaNum Light" w:hAnsi="SG Kara FaNum Light" w:cs="SG Kara FaNum Light" w:hint="cs"/>
+          <w:rtl/>
+          <w:lang w:bidi="fa-IR"/>
+        </w:rPr>
+        <w:t>ی</w:t>
+      </w:r>
+      <w:r>
+        <w:rPr>
+          <w:rFonts w:ascii="SG Kara FaNum Light" w:hAnsi="SG Kara FaNum Light" w:cs="SG Kara FaNum Light" w:hint="eastAsia"/>
+          <w:rtl/>
+          <w:lang w:bidi="fa-IR"/>
+        </w:rPr>
+        <w:t>ا</w:t>
+      </w:r>
+      <w:r>
+        <w:rPr>
+          <w:rFonts w:ascii="SG Kara FaNum Light" w:hAnsi="SG Kara FaNum Light" w:cs="SG Kara FaNum Light"/>
+          <w:rtl/>
+          <w:lang w:bidi="fa-IR"/>
+        </w:rPr>
+        <w:t xml:space="preserve"> ارائه خدمت به کار رفته و دارا</w:t>
+      </w:r>
+      <w:r>
+        <w:rPr>
+          <w:rFonts w:ascii="SG Kara FaNum Light" w:hAnsi="SG Kara FaNum Light" w:cs="SG Kara FaNum Light" w:hint="cs"/>
+          <w:rtl/>
+          <w:lang w:bidi="fa-IR"/>
+        </w:rPr>
+        <w:t>ی</w:t>
+      </w:r>
+      <w:r>
+        <w:rPr>
+          <w:rFonts w:ascii="SG Kara FaNum Light" w:hAnsi="SG Kara FaNum Light" w:cs="SG Kara FaNum Light"/>
+          <w:rtl/>
+          <w:lang w:bidi="fa-IR"/>
+        </w:rPr>
+        <w:t xml:space="preserve"> زمان شروع و پا</w:t>
+      </w:r>
+      <w:r>
+        <w:rPr>
+          <w:rFonts w:ascii="SG Kara FaNum Light" w:hAnsi="SG Kara FaNum Light" w:cs="SG Kara FaNum Light" w:hint="cs"/>
+          <w:rtl/>
+          <w:lang w:bidi="fa-IR"/>
+        </w:rPr>
+        <w:t>ی</w:t>
+      </w:r>
+      <w:r>
+        <w:rPr>
+          <w:rFonts w:ascii="SG Kara FaNum Light" w:hAnsi="SG Kara FaNum Light" w:cs="SG Kara FaNum Light" w:hint="eastAsia"/>
+          <w:rtl/>
+          <w:lang w:bidi="fa-IR"/>
+        </w:rPr>
+        <w:t>ان</w:t>
+      </w:r>
+      <w:r>
+        <w:rPr>
+          <w:rFonts w:ascii="SG Kara FaNum Light" w:hAnsi="SG Kara FaNum Light" w:cs="SG Kara FaNum Light"/>
+          <w:rtl/>
+          <w:lang w:bidi="fa-IR"/>
+        </w:rPr>
+        <w:t xml:space="preserve"> است و در آن </w:t>
       </w:r>
       <w:proofErr w:type="spellStart"/>
       <w:r>
         <w:rPr>
-          <w:rFonts w:ascii="SG Kara FaNum Light" w:hAnsi="SG Kara FaNum Light" w:cs="SG Kara FaNum Light" w:hint="cs"/>
-          <w:rtl/>
-          <w:lang w:bidi="fa-IR"/>
-        </w:rPr>
-        <w:t>فلش</w:t>
+          <w:rFonts w:ascii="SG Kara FaNum Light" w:hAnsi="SG Kara FaNum Light" w:cs="SG Kara FaNum Light"/>
+          <w:rtl/>
+          <w:lang w:bidi="fa-IR"/>
+        </w:rPr>
+        <w:t>پ</w:t>
+      </w:r>
+      <w:r>
+        <w:rPr>
+          <w:rFonts w:ascii="SG Kara FaNum Light" w:hAnsi="SG Kara FaNum Light" w:cs="SG Kara FaNum Light" w:hint="cs"/>
+          <w:rtl/>
+          <w:lang w:bidi="fa-IR"/>
+        </w:rPr>
+        <w:t>ی</w:t>
+      </w:r>
+      <w:r>
+        <w:rPr>
+          <w:rFonts w:ascii="SG Kara FaNum Light" w:hAnsi="SG Kara FaNum Light" w:cs="SG Kara FaNum Light" w:hint="eastAsia"/>
+          <w:rtl/>
+          <w:lang w:bidi="fa-IR"/>
+        </w:rPr>
+        <w:t>ش‌ب</w:t>
+      </w:r>
+      <w:r>
+        <w:rPr>
+          <w:rFonts w:ascii="SG Kara FaNum Light" w:hAnsi="SG Kara FaNum Light" w:cs="SG Kara FaNum Light" w:hint="cs"/>
+          <w:rtl/>
+          <w:lang w:bidi="fa-IR"/>
+        </w:rPr>
+        <w:t>ی</w:t>
+      </w:r>
+      <w:r>
+        <w:rPr>
+          <w:rFonts w:ascii="SG Kara FaNum Light" w:hAnsi="SG Kara FaNum Light" w:cs="SG Kara FaNum Light" w:hint="eastAsia"/>
+          <w:rtl/>
+          <w:lang w:bidi="fa-IR"/>
+        </w:rPr>
+        <w:t>ن</w:t>
+      </w:r>
+      <w:r>
+        <w:rPr>
+          <w:rFonts w:ascii="SG Kara FaNum Light" w:hAnsi="SG Kara FaNum Light" w:cs="SG Kara FaNum Light" w:hint="cs"/>
+          <w:rtl/>
+          <w:lang w:bidi="fa-IR"/>
+        </w:rPr>
+        <w:t>ی</w:t>
       </w:r>
       <w:proofErr w:type="spellEnd"/>
       <w:r>
         <w:rPr>
-          <w:rFonts w:ascii="SG Kara FaNum Light" w:hAnsi="SG Kara FaNum Light" w:cs="SG Kara FaNum Light" w:hint="cs"/>
-          <w:rtl/>
-          <w:lang w:bidi="fa-IR"/>
-        </w:rPr>
-        <w:t xml:space="preserve"> رو به پایین "  و کلیک بر روی گزینه ذخیره و جدید، این صفحه ذخیره و بسته میشود و صفحه خالی دیگری برای ورود اطلاعات پروژه  بعدی باز میشود.</w:t>
+          <w:rFonts w:ascii="SG Kara FaNum Light" w:hAnsi="SG Kara FaNum Light" w:cs="SG Kara FaNum Light"/>
+          <w:rtl/>
+          <w:lang w:bidi="fa-IR"/>
+        </w:rPr>
+        <w:t xml:space="preserve"> زمان انجام هر فعال</w:t>
+      </w:r>
+      <w:r>
+        <w:rPr>
+          <w:rFonts w:ascii="SG Kara FaNum Light" w:hAnsi="SG Kara FaNum Light" w:cs="SG Kara FaNum Light" w:hint="cs"/>
+          <w:rtl/>
+          <w:lang w:bidi="fa-IR"/>
+        </w:rPr>
+        <w:t>ی</w:t>
+      </w:r>
+      <w:r>
+        <w:rPr>
+          <w:rFonts w:ascii="SG Kara FaNum Light" w:hAnsi="SG Kara FaNum Light" w:cs="SG Kara FaNum Light" w:hint="eastAsia"/>
+          <w:rtl/>
+          <w:lang w:bidi="fa-IR"/>
+        </w:rPr>
+        <w:t>ت</w:t>
+      </w:r>
+      <w:r>
+        <w:rPr>
+          <w:rFonts w:ascii="SG Kara FaNum Light" w:hAnsi="SG Kara FaNum Light" w:cs="SG Kara FaNum Light"/>
+          <w:rtl/>
+          <w:lang w:bidi="fa-IR"/>
+        </w:rPr>
+        <w:t xml:space="preserve"> ن</w:t>
+      </w:r>
+      <w:r>
+        <w:rPr>
+          <w:rFonts w:ascii="SG Kara FaNum Light" w:hAnsi="SG Kara FaNum Light" w:cs="SG Kara FaNum Light" w:hint="cs"/>
+          <w:rtl/>
+          <w:lang w:bidi="fa-IR"/>
+        </w:rPr>
+        <w:t>ی</w:t>
+      </w:r>
+      <w:r>
+        <w:rPr>
+          <w:rFonts w:ascii="SG Kara FaNum Light" w:hAnsi="SG Kara FaNum Light" w:cs="SG Kara FaNum Light" w:hint="eastAsia"/>
+          <w:rtl/>
+          <w:lang w:bidi="fa-IR"/>
+        </w:rPr>
+        <w:t>ز</w:t>
+      </w:r>
+      <w:r>
+        <w:rPr>
+          <w:rFonts w:ascii="SG Kara FaNum Light" w:hAnsi="SG Kara FaNum Light" w:cs="SG Kara FaNum Light"/>
+          <w:rtl/>
+          <w:lang w:bidi="fa-IR"/>
+        </w:rPr>
+        <w:t xml:space="preserve"> صورت م</w:t>
+      </w:r>
+      <w:r>
+        <w:rPr>
+          <w:rFonts w:ascii="SG Kara FaNum Light" w:hAnsi="SG Kara FaNum Light" w:cs="SG Kara FaNum Light" w:hint="cs"/>
+          <w:rtl/>
+          <w:lang w:bidi="fa-IR"/>
+        </w:rPr>
+        <w:t>ی‌</w:t>
+      </w:r>
+      <w:r>
+        <w:rPr>
+          <w:rFonts w:ascii="SG Kara FaNum Light" w:hAnsi="SG Kara FaNum Light" w:cs="SG Kara FaNum Light" w:hint="eastAsia"/>
+          <w:rtl/>
+          <w:lang w:bidi="fa-IR"/>
+        </w:rPr>
+        <w:t>گ</w:t>
+      </w:r>
+      <w:r>
+        <w:rPr>
+          <w:rFonts w:ascii="SG Kara FaNum Light" w:hAnsi="SG Kara FaNum Light" w:cs="SG Kara FaNum Light" w:hint="cs"/>
+          <w:rtl/>
+          <w:lang w:bidi="fa-IR"/>
+        </w:rPr>
+        <w:t>ی</w:t>
+      </w:r>
+      <w:r>
+        <w:rPr>
+          <w:rFonts w:ascii="SG Kara FaNum Light" w:hAnsi="SG Kara FaNum Light" w:cs="SG Kara FaNum Light" w:hint="eastAsia"/>
+          <w:rtl/>
+          <w:lang w:bidi="fa-IR"/>
+        </w:rPr>
+        <w:t>رد</w:t>
+      </w:r>
+      <w:r>
+        <w:rPr>
+          <w:rFonts w:ascii="SG Kara FaNum Light" w:hAnsi="SG Kara FaNum Light" w:cs="SG Kara FaNum Light"/>
+          <w:rtl/>
+          <w:lang w:bidi="fa-IR"/>
+        </w:rPr>
+        <w:t>. در</w:t>
+      </w:r>
+      <w:r>
+        <w:rPr>
+          <w:rFonts w:ascii="SG Kara FaNum Light" w:hAnsi="SG Kara FaNum Light" w:cs="SG Kara FaNum Light" w:hint="cs"/>
+          <w:rtl/>
+          <w:lang w:bidi="fa-IR"/>
+        </w:rPr>
+        <w:t xml:space="preserve"> </w:t>
+      </w:r>
+      <w:r>
+        <w:rPr>
+          <w:rFonts w:ascii="SG Kara FaNum Light" w:hAnsi="SG Kara FaNum Light" w:cs="SG Kara FaNum Light"/>
+          <w:rtl/>
+          <w:lang w:bidi="fa-IR"/>
+        </w:rPr>
+        <w:t xml:space="preserve">مجموع، </w:t>
+      </w:r>
+      <w:proofErr w:type="spellStart"/>
+      <w:r>
+        <w:rPr>
+          <w:rFonts w:ascii="SG Kara FaNum Light" w:hAnsi="SG Kara FaNum Light" w:cs="SG Kara FaNum Light"/>
+          <w:rtl/>
+          <w:lang w:bidi="fa-IR"/>
+        </w:rPr>
+        <w:t>پروژه‌ها</w:t>
+      </w:r>
+      <w:proofErr w:type="spellEnd"/>
+      <w:r>
+        <w:rPr>
+          <w:rFonts w:ascii="SG Kara FaNum Light" w:hAnsi="SG Kara FaNum Light" w:cs="SG Kara FaNum Light"/>
+          <w:rtl/>
+          <w:lang w:bidi="fa-IR"/>
+        </w:rPr>
+        <w:t xml:space="preserve"> </w:t>
+      </w:r>
+      <w:proofErr w:type="spellStart"/>
+      <w:r>
+        <w:rPr>
+          <w:rFonts w:ascii="SG Kara FaNum Light" w:hAnsi="SG Kara FaNum Light" w:cs="SG Kara FaNum Light"/>
+          <w:rtl/>
+          <w:lang w:bidi="fa-IR"/>
+        </w:rPr>
+        <w:t>مجموعه‌ا</w:t>
+      </w:r>
+      <w:r>
+        <w:rPr>
+          <w:rFonts w:ascii="SG Kara FaNum Light" w:hAnsi="SG Kara FaNum Light" w:cs="SG Kara FaNum Light" w:hint="cs"/>
+          <w:rtl/>
+          <w:lang w:bidi="fa-IR"/>
+        </w:rPr>
+        <w:t>ی</w:t>
+      </w:r>
+      <w:proofErr w:type="spellEnd"/>
+      <w:r>
+        <w:rPr>
+          <w:rFonts w:ascii="SG Kara FaNum Light" w:hAnsi="SG Kara FaNum Light" w:cs="SG Kara FaNum Light"/>
+          <w:rtl/>
+          <w:lang w:bidi="fa-IR"/>
+        </w:rPr>
+        <w:t xml:space="preserve"> از </w:t>
+      </w:r>
+      <w:proofErr w:type="spellStart"/>
+      <w:r>
+        <w:rPr>
+          <w:rFonts w:ascii="SG Kara FaNum Light" w:hAnsi="SG Kara FaNum Light" w:cs="SG Kara FaNum Light"/>
+          <w:rtl/>
+          <w:lang w:bidi="fa-IR"/>
+        </w:rPr>
+        <w:t>فعال</w:t>
+      </w:r>
+      <w:r>
+        <w:rPr>
+          <w:rFonts w:ascii="SG Kara FaNum Light" w:hAnsi="SG Kara FaNum Light" w:cs="SG Kara FaNum Light" w:hint="cs"/>
+          <w:rtl/>
+          <w:lang w:bidi="fa-IR"/>
+        </w:rPr>
+        <w:t>ی</w:t>
+      </w:r>
+      <w:r>
+        <w:rPr>
+          <w:rFonts w:ascii="SG Kara FaNum Light" w:hAnsi="SG Kara FaNum Light" w:cs="SG Kara FaNum Light" w:hint="eastAsia"/>
+          <w:rtl/>
+          <w:lang w:bidi="fa-IR"/>
+        </w:rPr>
+        <w:t>ت‌ها</w:t>
+      </w:r>
+      <w:r>
+        <w:rPr>
+          <w:rFonts w:ascii="SG Kara FaNum Light" w:hAnsi="SG Kara FaNum Light" w:cs="SG Kara FaNum Light" w:hint="cs"/>
+          <w:rtl/>
+          <w:lang w:bidi="fa-IR"/>
+        </w:rPr>
+        <w:t>ی</w:t>
+      </w:r>
+      <w:proofErr w:type="spellEnd"/>
+      <w:r>
+        <w:rPr>
+          <w:rFonts w:ascii="SG Kara FaNum Light" w:hAnsi="SG Kara FaNum Light" w:cs="SG Kara FaNum Light"/>
+          <w:rtl/>
+          <w:lang w:bidi="fa-IR"/>
+        </w:rPr>
+        <w:t xml:space="preserve"> به خصوص هستند که به افراد و سازمان‌ها کمک م</w:t>
+      </w:r>
+      <w:r>
+        <w:rPr>
+          <w:rFonts w:ascii="SG Kara FaNum Light" w:hAnsi="SG Kara FaNum Light" w:cs="SG Kara FaNum Light" w:hint="cs"/>
+          <w:rtl/>
+          <w:lang w:bidi="fa-IR"/>
+        </w:rPr>
+        <w:t>ی‌</w:t>
+      </w:r>
+      <w:r>
+        <w:rPr>
+          <w:rFonts w:ascii="SG Kara FaNum Light" w:hAnsi="SG Kara FaNum Light" w:cs="SG Kara FaNum Light" w:hint="eastAsia"/>
+          <w:rtl/>
+          <w:lang w:bidi="fa-IR"/>
+        </w:rPr>
+        <w:t>کنند</w:t>
+      </w:r>
+      <w:r>
+        <w:rPr>
+          <w:rFonts w:ascii="SG Kara FaNum Light" w:hAnsi="SG Kara FaNum Light" w:cs="SG Kara FaNum Light"/>
+          <w:rtl/>
+          <w:lang w:bidi="fa-IR"/>
+        </w:rPr>
+        <w:t xml:space="preserve"> تا به اهداف تجار</w:t>
+      </w:r>
+      <w:r>
+        <w:rPr>
+          <w:rFonts w:ascii="SG Kara FaNum Light" w:hAnsi="SG Kara FaNum Light" w:cs="SG Kara FaNum Light" w:hint="cs"/>
+          <w:rtl/>
+          <w:lang w:bidi="fa-IR"/>
+        </w:rPr>
+        <w:t>ی</w:t>
+      </w:r>
+      <w:r>
+        <w:rPr>
+          <w:rFonts w:ascii="SG Kara FaNum Light" w:hAnsi="SG Kara FaNum Light" w:cs="SG Kara FaNum Light"/>
+          <w:rtl/>
+          <w:lang w:bidi="fa-IR"/>
+        </w:rPr>
+        <w:t xml:space="preserve"> و غ</w:t>
+      </w:r>
+      <w:r>
+        <w:rPr>
+          <w:rFonts w:ascii="SG Kara FaNum Light" w:hAnsi="SG Kara FaNum Light" w:cs="SG Kara FaNum Light" w:hint="cs"/>
+          <w:rtl/>
+          <w:lang w:bidi="fa-IR"/>
+        </w:rPr>
+        <w:t>ی</w:t>
+      </w:r>
+      <w:r>
+        <w:rPr>
+          <w:rFonts w:ascii="SG Kara FaNum Light" w:hAnsi="SG Kara FaNum Light" w:cs="SG Kara FaNum Light" w:hint="eastAsia"/>
+          <w:rtl/>
+          <w:lang w:bidi="fa-IR"/>
+        </w:rPr>
+        <w:t>رتجار</w:t>
+      </w:r>
+      <w:r>
+        <w:rPr>
+          <w:rFonts w:ascii="SG Kara FaNum Light" w:hAnsi="SG Kara FaNum Light" w:cs="SG Kara FaNum Light" w:hint="cs"/>
+          <w:rtl/>
+          <w:lang w:bidi="fa-IR"/>
+        </w:rPr>
+        <w:t>ی</w:t>
+      </w:r>
+      <w:r>
+        <w:rPr>
+          <w:rFonts w:ascii="SG Kara FaNum Light" w:hAnsi="SG Kara FaNum Light" w:cs="SG Kara FaNum Light"/>
+          <w:rtl/>
+          <w:lang w:bidi="fa-IR"/>
+        </w:rPr>
+        <w:t xml:space="preserve"> خود دست</w:t>
+      </w:r>
+      <w:r>
+        <w:rPr>
+          <w:rFonts w:ascii="SG Kara FaNum Light" w:hAnsi="SG Kara FaNum Light" w:cs="SG Kara FaNum Light" w:hint="cs"/>
+          <w:rtl/>
+          <w:lang w:bidi="fa-IR"/>
+        </w:rPr>
+        <w:t xml:space="preserve"> </w:t>
+      </w:r>
+      <w:r>
+        <w:rPr>
+          <w:rFonts w:ascii="SG Kara FaNum Light" w:hAnsi="SG Kara FaNum Light" w:cs="SG Kara FaNum Light"/>
+          <w:rtl/>
+          <w:lang w:bidi="fa-IR"/>
+        </w:rPr>
+        <w:t>‌</w:t>
+      </w:r>
+      <w:r>
+        <w:rPr>
+          <w:rFonts w:ascii="SG Kara FaNum Light" w:hAnsi="SG Kara FaNum Light" w:cs="SG Kara FaNum Light" w:hint="cs"/>
+          <w:rtl/>
+          <w:lang w:bidi="fa-IR"/>
+        </w:rPr>
+        <w:t>ی</w:t>
+      </w:r>
+      <w:r>
+        <w:rPr>
+          <w:rFonts w:ascii="SG Kara FaNum Light" w:hAnsi="SG Kara FaNum Light" w:cs="SG Kara FaNum Light" w:hint="eastAsia"/>
+          <w:rtl/>
+          <w:lang w:bidi="fa-IR"/>
+        </w:rPr>
+        <w:t>ابند</w:t>
+      </w:r>
+      <w:r>
+        <w:rPr>
+          <w:rFonts w:ascii="SG Kara FaNum Light" w:hAnsi="SG Kara FaNum Light" w:cs="SG Kara FaNum Light"/>
+          <w:rtl/>
+          <w:lang w:bidi="fa-IR"/>
+        </w:rPr>
+        <w:t>. و</w:t>
+      </w:r>
+      <w:r>
+        <w:rPr>
+          <w:rFonts w:ascii="SG Kara FaNum Light" w:hAnsi="SG Kara FaNum Light" w:cs="SG Kara FaNum Light" w:hint="cs"/>
+          <w:rtl/>
+          <w:lang w:bidi="fa-IR"/>
+        </w:rPr>
+        <w:t>ی</w:t>
+      </w:r>
+      <w:r>
+        <w:rPr>
+          <w:rFonts w:ascii="SG Kara FaNum Light" w:hAnsi="SG Kara FaNum Light" w:cs="SG Kara FaNum Light" w:hint="eastAsia"/>
+          <w:rtl/>
+          <w:lang w:bidi="fa-IR"/>
+        </w:rPr>
+        <w:t>ژگ</w:t>
+      </w:r>
+      <w:r>
+        <w:rPr>
+          <w:rFonts w:ascii="SG Kara FaNum Light" w:hAnsi="SG Kara FaNum Light" w:cs="SG Kara FaNum Light" w:hint="cs"/>
+          <w:rtl/>
+          <w:lang w:bidi="fa-IR"/>
+        </w:rPr>
+        <w:t>ی‌</w:t>
+      </w:r>
+      <w:r>
+        <w:rPr>
+          <w:rFonts w:ascii="SG Kara FaNum Light" w:hAnsi="SG Kara FaNum Light" w:cs="SG Kara FaNum Light" w:hint="eastAsia"/>
+          <w:rtl/>
+          <w:lang w:bidi="fa-IR"/>
+        </w:rPr>
+        <w:t>ها</w:t>
+      </w:r>
+      <w:r>
+        <w:rPr>
+          <w:rFonts w:ascii="SG Kara FaNum Light" w:hAnsi="SG Kara FaNum Light" w:cs="SG Kara FaNum Light" w:hint="cs"/>
+          <w:rtl/>
+          <w:lang w:bidi="fa-IR"/>
+        </w:rPr>
+        <w:t>ی</w:t>
+      </w:r>
+      <w:r>
+        <w:rPr>
+          <w:rFonts w:ascii="SG Kara FaNum Light" w:hAnsi="SG Kara FaNum Light" w:cs="SG Kara FaNum Light"/>
+          <w:rtl/>
+          <w:lang w:bidi="fa-IR"/>
+        </w:rPr>
+        <w:t xml:space="preserve"> متما</w:t>
+      </w:r>
+      <w:r>
+        <w:rPr>
+          <w:rFonts w:ascii="SG Kara FaNum Light" w:hAnsi="SG Kara FaNum Light" w:cs="SG Kara FaNum Light" w:hint="cs"/>
+          <w:rtl/>
+          <w:lang w:bidi="fa-IR"/>
+        </w:rPr>
+        <w:t>ی</w:t>
+      </w:r>
+      <w:r>
+        <w:rPr>
+          <w:rFonts w:ascii="SG Kara FaNum Light" w:hAnsi="SG Kara FaNum Light" w:cs="SG Kara FaNum Light" w:hint="eastAsia"/>
+          <w:rtl/>
+          <w:lang w:bidi="fa-IR"/>
+        </w:rPr>
+        <w:t>ز</w:t>
+      </w:r>
+      <w:r>
+        <w:rPr>
+          <w:rFonts w:ascii="SG Kara FaNum Light" w:hAnsi="SG Kara FaNum Light" w:cs="SG Kara FaNum Light"/>
+          <w:rtl/>
+          <w:lang w:bidi="fa-IR"/>
+        </w:rPr>
+        <w:t xml:space="preserve"> کننده آن شامل منحصر به فرد بودن، داشتن هدف مشخص، محدود</w:t>
+      </w:r>
+      <w:r>
+        <w:rPr>
+          <w:rFonts w:ascii="SG Kara FaNum Light" w:hAnsi="SG Kara FaNum Light" w:cs="SG Kara FaNum Light" w:hint="cs"/>
+          <w:rtl/>
+          <w:lang w:bidi="fa-IR"/>
+        </w:rPr>
+        <w:t>ی</w:t>
+      </w:r>
+      <w:r>
+        <w:rPr>
+          <w:rFonts w:ascii="SG Kara FaNum Light" w:hAnsi="SG Kara FaNum Light" w:cs="SG Kara FaNum Light" w:hint="eastAsia"/>
+          <w:rtl/>
+          <w:lang w:bidi="fa-IR"/>
+        </w:rPr>
+        <w:t>ت</w:t>
+      </w:r>
+      <w:r>
+        <w:rPr>
+          <w:rFonts w:ascii="SG Kara FaNum Light" w:hAnsi="SG Kara FaNum Light" w:cs="SG Kara FaNum Light"/>
+          <w:rtl/>
+          <w:lang w:bidi="fa-IR"/>
+        </w:rPr>
+        <w:t xml:space="preserve"> در زمان و منابع و موقت بودن است</w:t>
+      </w:r>
+      <w:r>
+        <w:rPr>
+          <w:rFonts w:ascii="SG Kara FaNum Light" w:hAnsi="SG Kara FaNum Light" w:cs="SG Kara FaNum Light" w:hint="cs"/>
+          <w:rtl/>
+          <w:lang w:bidi="fa-IR"/>
+        </w:rPr>
+        <w:t>.</w:t>
+      </w:r>
+    </w:p>
+    <w:p>
+      <w:pPr>
+        <w:bidi/>
+        <w:rPr>
+          <w:rFonts w:ascii="SG Kara FaNum Light" w:hAnsi="SG Kara FaNum Light" w:cs="SG Kara FaNum Light"/>
+          <w:rtl/>
+          <w:lang w:bidi="fa-IR"/>
+        </w:rPr>
+      </w:pPr>
+    </w:p>
+    <w:p>
+      <w:pPr>
+        <w:bidi/>
+        <w:rPr>
+          <w:rFonts w:ascii="SG Kara FaNum Light" w:hAnsi="SG Kara FaNum Light" w:cs="SG Kara FaNum Light"/>
+          <w:rtl/>
+          <w:lang w:bidi="fa-IR"/>
+        </w:rPr>
+      </w:pPr>
+      <w:r>
+        <w:rPr>
+          <w:rFonts w:ascii="SG Kara FaNum Light" w:hAnsi="SG Kara FaNum Light" w:cs="SG Kara FaNum Light" w:hint="cs"/>
+          <w:rtl/>
+          <w:lang w:bidi="fa-IR"/>
+        </w:rPr>
+        <w:t>برای تعریف یک پروژه  باید از مسیر منوی اصلی/ عمومی/ اطلاعات پایه / پروژه ،  کلید + را  انتخاب کنید و در صفحه باز شده موارد زیر را پر کنید:</w:t>
       </w:r>
     </w:p>
     <w:p>
@@ -18969,10 +18857,10 @@
           <w:lang w:bidi="fa-IR"/>
         </w:rPr>
         <w:drawing>
-          <wp:inline distT="0" distB="0" distL="0" distR="0" wp14:anchorId="0B1F9489" wp14:editId="5591FDD2">
-            <wp:extent cx="5943600" cy="2003425"/>
-            <wp:effectExtent l="0" t="0" r="0" b="0"/>
-            <wp:docPr id="16" name="Picture 16"/>
+          <wp:inline distT="0" distB="0" distL="0" distR="0" wp14:anchorId="2F78A538" wp14:editId="42672C69">
+            <wp:extent cx="5943600" cy="1134110"/>
+            <wp:effectExtent l="0" t="0" r="0" b="8890"/>
+            <wp:docPr id="13" name="Picture 13"/>
             <wp:cNvGraphicFramePr>
               <a:graphicFrameLocks xmlns:a="http://schemas.openxmlformats.org/drawingml/2006/main" noChangeAspect="1"/>
             </wp:cNvGraphicFramePr>
@@ -18992,7 +18880,7 @@
                   <pic:spPr>
                     <a:xfrm>
                       <a:off x="0" y="0"/>
-                      <a:ext cx="5943600" cy="2003425"/>
+                      <a:ext cx="5943600" cy="1134110"/>
                     </a:xfrm>
                     <a:prstGeom prst="rect">
                       <a:avLst/>
@@ -19020,7 +18908,80 @@
           <w:rtl/>
           <w:lang w:bidi="fa-IR"/>
         </w:rPr>
-        <w:t>بعد از ذخیره، بخش اطلاعات تفصیل را در سمت چپ صفحه مشاهده میکنید، با انتخاب کلید "ایجاد " یک صفحه باز میشود ، در این صفحه میتوانید کد تفصیل را وارد کنید و یا این کد به صورت پیش فرض بر اساس روش کدگذاری تعریف شده وارد می شود.</w:t>
+        <w:t xml:space="preserve">کد: کد مورد نظر برای نمایش پروژه </w:t>
+      </w:r>
+    </w:p>
+    <w:p>
+      <w:pPr>
+        <w:bidi/>
+        <w:rPr>
+          <w:rFonts w:ascii="SG Kara FaNum Light" w:hAnsi="SG Kara FaNum Light" w:cs="SG Kara FaNum Light"/>
+          <w:rtl/>
+          <w:lang w:bidi="fa-IR"/>
+        </w:rPr>
+      </w:pPr>
+      <w:r>
+        <w:rPr>
+          <w:rFonts w:ascii="SG Kara FaNum Light" w:hAnsi="SG Kara FaNum Light" w:cs="SG Kara FaNum Light" w:hint="cs"/>
+          <w:rtl/>
+          <w:lang w:bidi="fa-IR"/>
+        </w:rPr>
+        <w:lastRenderedPageBreak/>
+        <w:t>عنوان: نام پروژه</w:t>
+      </w:r>
+    </w:p>
+    <w:p>
+      <w:pPr>
+        <w:bidi/>
+        <w:rPr>
+          <w:rFonts w:ascii="SG Kara FaNum Light" w:hAnsi="SG Kara FaNum Light" w:cs="SG Kara FaNum Light"/>
+          <w:rtl/>
+          <w:lang w:bidi="fa-IR"/>
+        </w:rPr>
+      </w:pPr>
+      <w:r>
+        <w:rPr>
+          <w:rFonts w:ascii="SG Kara FaNum Light" w:hAnsi="SG Kara FaNum Light" w:cs="SG Kara FaNum Light" w:hint="cs"/>
+          <w:rtl/>
+          <w:lang w:bidi="fa-IR"/>
+        </w:rPr>
+        <w:t xml:space="preserve">فعال: به صورت پیش فرض فعال است، اما در صورت لزوم میتوان پروژه را غیرفعال کرد. در صورتی که وضعیت پروژه غیر فعال باشد، در عملیات سیستم مشاهده </w:t>
+      </w:r>
+      <w:proofErr w:type="spellStart"/>
+      <w:r>
+        <w:rPr>
+          <w:rFonts w:ascii="SG Kara FaNum Light" w:hAnsi="SG Kara FaNum Light" w:cs="SG Kara FaNum Light" w:hint="cs"/>
+          <w:rtl/>
+          <w:lang w:bidi="fa-IR"/>
+        </w:rPr>
+        <w:t>نمی</w:t>
+      </w:r>
+      <w:proofErr w:type="spellEnd"/>
+      <w:r>
+        <w:rPr>
+          <w:rFonts w:ascii="SG Kara FaNum Light" w:hAnsi="SG Kara FaNum Light" w:cs="SG Kara FaNum Light" w:hint="cs"/>
+          <w:rtl/>
+          <w:lang w:bidi="fa-IR"/>
+        </w:rPr>
+        <w:t xml:space="preserve"> شود.</w:t>
+      </w:r>
+    </w:p>
+    <w:p>
+      <w:pPr>
+        <w:bidi/>
+        <w:rPr>
+          <w:rFonts w:ascii="SG Kara FaNum Light" w:hAnsi="SG Kara FaNum Light" w:cs="SG Kara FaNum Light"/>
+          <w:rtl/>
+          <w:lang w:bidi="fa-IR"/>
+        </w:rPr>
+      </w:pPr>
+      <w:r>
+        <w:rPr>
+          <w:rFonts w:ascii="SG Kara FaNum Light" w:hAnsi="SG Kara FaNum Light" w:cs="SG Kara FaNum Light" w:hint="cs"/>
+          <w:rtl/>
+          <w:lang w:bidi="fa-IR"/>
+        </w:rPr>
+        <w:t>سپس با استفاده از کلید "ذخیره" در گوشه سمت چپ  پروژه ذخیره میشود.</w:t>
       </w:r>
       <w:r>
         <w:rPr>
@@ -19036,43 +18997,48 @@
           <w:rtl/>
           <w:lang w:bidi="fa-IR"/>
         </w:rPr>
-        <w:t>نام تفصیل برابر با عنوان پروژه  خواهد بود.</w:t>
-      </w:r>
-    </w:p>
-    <w:p>
-      <w:pPr>
-        <w:bidi/>
-        <w:rPr>
-          <w:rFonts w:ascii="SG Kara FaNum Light" w:hAnsi="SG Kara FaNum Light" w:cs="SG Kara FaNum Light"/>
-          <w:rtl/>
-          <w:lang w:bidi="fa-IR"/>
-        </w:rPr>
-      </w:pPr>
-      <w:r>
-        <w:rPr>
-          <w:rFonts w:ascii="SG Kara FaNum Light" w:hAnsi="SG Kara FaNum Light" w:cs="SG Kara FaNum Light" w:hint="cs"/>
-          <w:rtl/>
-          <w:lang w:bidi="fa-IR"/>
-        </w:rPr>
-        <w:t>با انتخاب کلید ذخیره، حساب تفصیل مربوط به پروژه  نیز ذخیره خواهد شد.</w:t>
-      </w:r>
-      <w:r>
-        <w:rPr>
-          <w:rFonts w:ascii="SG Kara FaNum Light" w:hAnsi="SG Kara FaNum Light" w:cs="SG Kara FaNum Light"/>
-          <w:rtl/>
-          <w:lang w:bidi="fa-IR"/>
-        </w:rPr>
-        <w:br/>
-      </w:r>
-      <w:r>
-        <w:rPr>
+        <w:t>در صورت انتخاب کلید "</w:t>
+      </w:r>
+      <w:proofErr w:type="spellStart"/>
+      <w:r>
+        <w:rPr>
+          <w:rFonts w:ascii="SG Kara FaNum Light" w:hAnsi="SG Kara FaNum Light" w:cs="SG Kara FaNum Light" w:hint="cs"/>
+          <w:rtl/>
+          <w:lang w:bidi="fa-IR"/>
+        </w:rPr>
+        <w:t>فلش</w:t>
+      </w:r>
+      <w:proofErr w:type="spellEnd"/>
+      <w:r>
+        <w:rPr>
+          <w:rFonts w:ascii="SG Kara FaNum Light" w:hAnsi="SG Kara FaNum Light" w:cs="SG Kara FaNum Light" w:hint="cs"/>
+          <w:rtl/>
+          <w:lang w:bidi="fa-IR"/>
+        </w:rPr>
+        <w:t xml:space="preserve"> رو به پایین "  و کلیک بر روی گزینه ذخیره و جدید، این صفحه ذخیره و بسته میشود و صفحه خالی دیگری برای ورود اطلاعات پروژه  بعدی باز میشود.</w:t>
+      </w:r>
+    </w:p>
+    <w:p>
+      <w:pPr>
+        <w:bidi/>
+        <w:rPr>
+          <w:rFonts w:ascii="SG Kara FaNum Light" w:hAnsi="SG Kara FaNum Light" w:cs="SG Kara FaNum Light"/>
+          <w:rtl/>
+          <w:lang w:bidi="fa-IR"/>
+        </w:rPr>
+      </w:pPr>
+      <w:r>
+        <w:rPr>
+          <w:rFonts w:ascii="SG Kara FaNum Light" w:hAnsi="SG Kara FaNum Light" w:cs="SG Kara FaNum Light"/>
           <w:noProof/>
+          <w:rtl/>
+          <w:lang w:bidi="fa-IR"/>
         </w:rPr>
         <w:drawing>
-          <wp:inline distT="0" distB="0" distL="0" distR="0" wp14:anchorId="5CC34804" wp14:editId="4AAE9C6A">
-            <wp:extent cx="5943600" cy="771525"/>
-            <wp:effectExtent l="0" t="0" r="0" b="9525"/>
-            <wp:docPr id="19" name="Picture 19"/>
+          <wp:inline distT="0" distB="0" distL="0" distR="0" wp14:anchorId="0B1F9489" wp14:editId="5591FDD2">
+            <wp:extent cx="5943600" cy="2003425"/>
+            <wp:effectExtent l="0" t="0" r="0" b="0"/>
+            <wp:docPr id="16" name="Picture 16"/>
             <wp:cNvGraphicFramePr>
               <a:graphicFrameLocks xmlns:a="http://schemas.openxmlformats.org/drawingml/2006/main" noChangeAspect="1"/>
             </wp:cNvGraphicFramePr>
@@ -19092,6 +19058,106 @@
                   <pic:spPr>
                     <a:xfrm>
                       <a:off x="0" y="0"/>
+                      <a:ext cx="5943600" cy="2003425"/>
+                    </a:xfrm>
+                    <a:prstGeom prst="rect">
+                      <a:avLst/>
+                    </a:prstGeom>
+                  </pic:spPr>
+                </pic:pic>
+              </a:graphicData>
+            </a:graphic>
+          </wp:inline>
+        </w:drawing>
+      </w:r>
+    </w:p>
+    <w:p>
+      <w:pPr>
+        <w:bidi/>
+        <w:rPr>
+          <w:rFonts w:ascii="SG Kara FaNum Light" w:hAnsi="SG Kara FaNum Light" w:cs="SG Kara FaNum Light"/>
+          <w:rtl/>
+          <w:lang w:bidi="fa-IR"/>
+        </w:rPr>
+      </w:pPr>
+      <w:r>
+        <w:rPr>
+          <w:rFonts w:ascii="SG Kara FaNum Light" w:hAnsi="SG Kara FaNum Light" w:cs="SG Kara FaNum Light" w:hint="cs"/>
+          <w:rtl/>
+          <w:lang w:bidi="fa-IR"/>
+        </w:rPr>
+        <w:t>بعد از ذخیره، بخش اطلاعات تفصیل را در سمت چپ صفحه مشاهده میکنید، با انتخاب کلید "ایجاد " یک صفحه باز میشود ، در این صفحه میتوانید کد تفصیل را وارد کنید و یا این کد به صورت پیش فرض بر اساس روش کدگذاری تعریف شده وارد می شود.</w:t>
+      </w:r>
+      <w:r>
+        <w:rPr>
+          <w:rFonts w:ascii="SG Kara FaNum Light" w:hAnsi="SG Kara FaNum Light" w:cs="SG Kara FaNum Light"/>
+          <w:rtl/>
+          <w:lang w:bidi="fa-IR"/>
+        </w:rPr>
+        <w:br/>
+      </w:r>
+      <w:r>
+        <w:rPr>
+          <w:rFonts w:ascii="SG Kara FaNum Light" w:hAnsi="SG Kara FaNum Light" w:cs="SG Kara FaNum Light" w:hint="cs"/>
+          <w:rtl/>
+          <w:lang w:bidi="fa-IR"/>
+        </w:rPr>
+        <w:t>نام تفصیل برابر با عنوان پروژه  خواهد بود.</w:t>
+      </w:r>
+    </w:p>
+    <w:p>
+      <w:pPr>
+        <w:bidi/>
+        <w:rPr>
+          <w:rFonts w:ascii="SG Kara FaNum Light" w:hAnsi="SG Kara FaNum Light" w:cs="SG Kara FaNum Light"/>
+          <w:rtl/>
+          <w:lang w:bidi="fa-IR"/>
+        </w:rPr>
+      </w:pPr>
+      <w:r>
+        <w:rPr>
+          <w:rFonts w:ascii="SG Kara FaNum Light" w:hAnsi="SG Kara FaNum Light" w:cs="SG Kara FaNum Light" w:hint="cs"/>
+          <w:rtl/>
+          <w:lang w:bidi="fa-IR"/>
+        </w:rPr>
+        <w:t>با انتخاب کلید ذخیره، حساب تفصیل مربوط به پروژه  نیز ذخیره خواهد شد.</w:t>
+      </w:r>
+      <w:r>
+        <w:rPr>
+          <w:rFonts w:ascii="SG Kara FaNum Light" w:hAnsi="SG Kara FaNum Light" w:cs="SG Kara FaNum Light"/>
+          <w:rtl/>
+          <w:lang w:bidi="fa-IR"/>
+        </w:rPr>
+        <w:br/>
+      </w:r>
+      <w:r>
+        <w:rPr>
+          <w:noProof/>
+        </w:rPr>
+        <w:drawing>
+          <wp:inline distT="0" distB="0" distL="0" distR="0" wp14:anchorId="5CC34804" wp14:editId="4AAE9C6A">
+            <wp:extent cx="5943600" cy="771525"/>
+            <wp:effectExtent l="0" t="0" r="0" b="9525"/>
+            <wp:docPr id="19" name="Picture 19"/>
+            <wp:cNvGraphicFramePr>
+              <a:graphicFrameLocks xmlns:a="http://schemas.openxmlformats.org/drawingml/2006/main" noChangeAspect="1"/>
+            </wp:cNvGraphicFramePr>
+            <a:graphic xmlns:a="http://schemas.openxmlformats.org/drawingml/2006/main">
+              <a:graphicData uri="http://schemas.openxmlformats.org/drawingml/2006/picture">
+                <pic:pic xmlns:pic="http://schemas.openxmlformats.org/drawingml/2006/picture">
+                  <pic:nvPicPr>
+                    <pic:cNvPr id="1" name=""/>
+                    <pic:cNvPicPr/>
+                  </pic:nvPicPr>
+                  <pic:blipFill>
+                    <a:blip r:embed="rId24"/>
+                    <a:stretch>
+                      <a:fillRect/>
+                    </a:stretch>
+                  </pic:blipFill>
+                  <pic:spPr>
+                    <a:xfrm>
+                      <a:off x="0" y="0"/>
                       <a:ext cx="5943600" cy="771525"/>
                     </a:xfrm>
                     <a:prstGeom prst="rect">
@@ -19680,7 +19746,7 @@
                     <pic:cNvPicPr/>
                   </pic:nvPicPr>
                   <pic:blipFill>
-                    <a:blip r:embed="rId24"/>
+                    <a:blip r:embed="rId25"/>
                     <a:stretch>
                       <a:fillRect/>
                     </a:stretch>
@@ -20025,7 +20091,7 @@
                     <pic:cNvPicPr/>
                   </pic:nvPicPr>
                   <pic:blipFill>
-                    <a:blip r:embed="rId25"/>
+                    <a:blip r:embed="rId26"/>
                     <a:stretch>
                       <a:fillRect/>
                     </a:stretch>
@@ -20092,11 +20158,37 @@
       </w:pPr>
       <w:r>
         <w:rPr>
-          <w:rFonts w:ascii="SG Kara FaNum Light" w:hAnsi="SG Kara FaNum Light" w:cs="SG Kara FaNum Light" w:hint="cs"/>
-          <w:rtl/>
-          <w:lang w:bidi="fa-IR"/>
-        </w:rPr>
-        <w:t xml:space="preserve">ارز اصلی گزارش: به صورت پیش فرض ارز عملیاتی انتخاب شده است، اما درصورت وجود </w:t>
+          <w:rStyle w:val="Heading2Char"/>
+          <w:rFonts w:hint="cs"/>
+          <w:rtl/>
+        </w:rPr>
+        <w:t>ارز اصلی گزارش:</w:t>
+      </w:r>
+      <w:r>
+        <w:rPr>
+          <w:rFonts w:ascii="SG Kara FaNum Light" w:hAnsi="SG Kara FaNum Light" w:cs="SG Kara FaNum Light" w:hint="cs"/>
+          <w:rtl/>
+          <w:lang w:bidi="fa-IR"/>
+        </w:rPr>
+        <w:t xml:space="preserve"> </w:t>
+      </w:r>
+    </w:p>
+    <w:p>
+      <w:pPr>
+        <w:bidi/>
+        <w:rPr>
+          <w:rFonts w:ascii="SG Kara FaNum Light" w:hAnsi="SG Kara FaNum Light" w:cs="SG Kara FaNum Light"/>
+          <w:rtl/>
+          <w:lang w:bidi="fa-IR"/>
+        </w:rPr>
+      </w:pPr>
+      <w:r>
+        <w:rPr>
+          <w:rFonts w:ascii="SG Kara FaNum Light" w:hAnsi="SG Kara FaNum Light" w:cs="SG Kara FaNum Light" w:hint="cs"/>
+          <w:rtl/>
+          <w:lang w:bidi="fa-IR"/>
+        </w:rPr>
+        <w:t xml:space="preserve">به صورت پیش فرض ارز عملیاتی انتخاب شده است، اما درصورت وجود </w:t>
       </w:r>
       <w:proofErr w:type="spellStart"/>
       <w:r>
@@ -20128,65 +20220,144 @@
       </w:pPr>
       <w:r>
         <w:rPr>
-          <w:rFonts w:ascii="SG Kara FaNum Light" w:hAnsi="SG Kara FaNum Light" w:cs="SG Kara FaNum Light" w:hint="cs"/>
-          <w:rtl/>
-          <w:lang w:bidi="fa-IR"/>
-        </w:rPr>
-        <w:t>سال مالی: از طریق فیلتر سال مالی می توانید محدوده سال های مالی مورد نظر برای اجرای گزارش را تعیین نمایید.</w:t>
-      </w:r>
-    </w:p>
-    <w:p>
-      <w:pPr>
-        <w:bidi/>
-        <w:rPr>
-          <w:rFonts w:ascii="SG Kara FaNum Light" w:hAnsi="SG Kara FaNum Light" w:cs="SG Kara FaNum Light"/>
-          <w:rtl/>
-          <w:lang w:bidi="fa-IR"/>
-        </w:rPr>
-      </w:pPr>
-      <w:r>
-        <w:rPr>
-          <w:rFonts w:ascii="SG Kara FaNum Light" w:hAnsi="SG Kara FaNum Light" w:cs="SG Kara FaNum Light" w:hint="cs"/>
-          <w:rtl/>
-          <w:lang w:bidi="fa-IR"/>
-        </w:rPr>
-        <w:t>نوع بازه زمانی: امکان تعیین بازه زمانی گزارش بر اساس دوره مالی یا تاریخ وجود دارد. در صورت انتخاب دوره مالی، می توان دوره های مالی را فیلتر نمود. همچنین در صورت انتخاب تاریخ، می توان محدوده دقیقتر گزارش بر اساس تاریخ اسناد را تعیین کرد.</w:t>
-      </w:r>
-    </w:p>
-    <w:p>
-      <w:pPr>
-        <w:bidi/>
-        <w:rPr>
-          <w:rFonts w:ascii="SG Kara FaNum Light" w:hAnsi="SG Kara FaNum Light" w:cs="SG Kara FaNum Light"/>
-          <w:rtl/>
-          <w:lang w:bidi="fa-IR"/>
-        </w:rPr>
-      </w:pPr>
-      <w:r>
-        <w:rPr>
-          <w:rFonts w:ascii="SG Kara FaNum Light" w:hAnsi="SG Kara FaNum Light" w:cs="SG Kara FaNum Light" w:hint="cs"/>
-          <w:rtl/>
-          <w:lang w:bidi="fa-IR"/>
-        </w:rPr>
-        <w:t>دوره مالی: طبق دوره های تعریف شده در فرم سال مالی دوره های مربوط به سال های مالی انتخاب شده در فیلتر سال مالی نمایش داده میشوند و امکان تعیین محدوده مورد نظر برای دوره های مالی را دارید.</w:t>
-      </w:r>
-    </w:p>
-    <w:p>
-      <w:pPr>
-        <w:bidi/>
-        <w:rPr>
-          <w:rFonts w:ascii="SG Kara FaNum Light" w:hAnsi="SG Kara FaNum Light" w:cs="SG Kara FaNum Light"/>
-          <w:rtl/>
-          <w:lang w:bidi="fa-IR"/>
-        </w:rPr>
-      </w:pPr>
-      <w:r>
-        <w:rPr>
-          <w:rFonts w:ascii="SG Kara FaNum Light" w:hAnsi="SG Kara FaNum Light" w:cs="SG Kara FaNum Light" w:hint="cs"/>
-          <w:rtl/>
-          <w:lang w:bidi="fa-IR"/>
-        </w:rPr>
-        <w:t xml:space="preserve">نوع سند: انواع سند تعریف شده در سیستم قابل انتخاب و فیلتر کردن است. انواع سند شامل موارد زیر است: </w:t>
+          <w:rStyle w:val="Heading2Char"/>
+          <w:rFonts w:hint="cs"/>
+          <w:rtl/>
+        </w:rPr>
+        <w:t>سال مالی:</w:t>
+      </w:r>
+      <w:r>
+        <w:rPr>
+          <w:rFonts w:ascii="SG Kara FaNum Light" w:hAnsi="SG Kara FaNum Light" w:cs="SG Kara FaNum Light" w:hint="cs"/>
+          <w:rtl/>
+          <w:lang w:bidi="fa-IR"/>
+        </w:rPr>
+        <w:t xml:space="preserve"> </w:t>
+      </w:r>
+    </w:p>
+    <w:p>
+      <w:pPr>
+        <w:bidi/>
+        <w:rPr>
+          <w:rFonts w:ascii="SG Kara FaNum Light" w:hAnsi="SG Kara FaNum Light" w:cs="SG Kara FaNum Light"/>
+          <w:rtl/>
+          <w:lang w:bidi="fa-IR"/>
+        </w:rPr>
+      </w:pPr>
+      <w:r>
+        <w:rPr>
+          <w:rFonts w:ascii="SG Kara FaNum Light" w:hAnsi="SG Kara FaNum Light" w:cs="SG Kara FaNum Light" w:hint="cs"/>
+          <w:rtl/>
+          <w:lang w:bidi="fa-IR"/>
+        </w:rPr>
+        <w:t>از طریق فیلتر سال مالی می توانید محدوده سال های مالی مورد نظر برای اجرای گزارش را تعیین نمایید.</w:t>
+      </w:r>
+    </w:p>
+    <w:p>
+      <w:pPr>
+        <w:bidi/>
+        <w:rPr>
+          <w:rStyle w:val="Heading2Char"/>
+          <w:rtl/>
+        </w:rPr>
+      </w:pPr>
+      <w:r>
+        <w:rPr>
+          <w:rStyle w:val="Heading2Char"/>
+          <w:rFonts w:hint="cs"/>
+          <w:rtl/>
+        </w:rPr>
+        <w:t xml:space="preserve">نوع بازه زمانی: </w:t>
+      </w:r>
+    </w:p>
+    <w:p>
+      <w:pPr>
+        <w:bidi/>
+        <w:rPr>
+          <w:rFonts w:ascii="SG Kara FaNum Light" w:hAnsi="SG Kara FaNum Light" w:cs="SG Kara FaNum Light"/>
+          <w:rtl/>
+          <w:lang w:bidi="fa-IR"/>
+        </w:rPr>
+      </w:pPr>
+      <w:r>
+        <w:rPr>
+          <w:rFonts w:ascii="SG Kara FaNum Light" w:hAnsi="SG Kara FaNum Light" w:cs="SG Kara FaNum Light" w:hint="cs"/>
+          <w:rtl/>
+          <w:lang w:bidi="fa-IR"/>
+        </w:rPr>
+        <w:t>امکان تعیین بازه زمانی گزارش بر اساس دوره مالی یا تاریخ وجود دارد. در صورت انتخاب دوره مالی، می توان دوره های مالی را فیلتر نمود. همچنین در صورت انتخاب تاریخ، می توان محدوده دقیقتر گزارش بر اساس تاریخ اسناد را تعیین کرد.</w:t>
+      </w:r>
+    </w:p>
+    <w:p>
+      <w:pPr>
+        <w:pStyle w:val="Heading2"/>
+        <w:bidi/>
+        <w:rPr>
+          <w:rtl/>
+          <w:lang w:bidi="fa-IR"/>
+        </w:rPr>
+      </w:pPr>
+      <w:r>
+        <w:rPr>
+          <w:rFonts w:hint="cs"/>
+          <w:rtl/>
+          <w:lang w:bidi="fa-IR"/>
+        </w:rPr>
+        <w:lastRenderedPageBreak/>
+        <w:t>دوره مالی:</w:t>
+      </w:r>
+    </w:p>
+    <w:p>
+      <w:pPr>
+        <w:bidi/>
+        <w:rPr>
+          <w:rFonts w:ascii="SG Kara FaNum Light" w:hAnsi="SG Kara FaNum Light" w:cs="SG Kara FaNum Light"/>
+          <w:rtl/>
+          <w:lang w:bidi="fa-IR"/>
+        </w:rPr>
+      </w:pPr>
+      <w:r>
+        <w:rPr>
+          <w:rFonts w:ascii="SG Kara FaNum Light" w:hAnsi="SG Kara FaNum Light" w:cs="SG Kara FaNum Light" w:hint="cs"/>
+          <w:rtl/>
+          <w:lang w:bidi="fa-IR"/>
+        </w:rPr>
+        <w:t xml:space="preserve"> طبق دوره های تعریف شده در فرم سال مالی دوره های مربوط به سال های مالی انتخاب شده در فیلتر سال مالی نمایش داده میشوند و امکان تعیین محدوده مورد نظر برای دوره های مالی را دارید.</w:t>
+      </w:r>
+    </w:p>
+    <w:p>
+      <w:pPr>
+        <w:bidi/>
+        <w:rPr>
+          <w:rStyle w:val="Heading2Char"/>
+          <w:rtl/>
+        </w:rPr>
+      </w:pPr>
+      <w:r>
+        <w:rPr>
+          <w:rStyle w:val="Heading2Char"/>
+          <w:rFonts w:hint="cs"/>
+          <w:rtl/>
+        </w:rPr>
+        <w:t>نوع سند:</w:t>
+      </w:r>
+    </w:p>
+    <w:p>
+      <w:pPr>
+        <w:bidi/>
+        <w:rPr>
+          <w:rFonts w:ascii="SG Kara FaNum Light" w:hAnsi="SG Kara FaNum Light" w:cs="SG Kara FaNum Light"/>
+          <w:rtl/>
+          <w:lang w:bidi="fa-IR"/>
+        </w:rPr>
+      </w:pPr>
+      <w:r>
+        <w:rPr>
+          <w:rFonts w:ascii="SG Kara FaNum Light" w:hAnsi="SG Kara FaNum Light" w:cs="SG Kara FaNum Light" w:hint="cs"/>
+          <w:rtl/>
+          <w:lang w:bidi="fa-IR"/>
+        </w:rPr>
+        <w:t xml:space="preserve"> انواع سند تعریف شده در سیستم قابل انتخاب و فیلتر کردن است. انواع سند شامل موارد زیر است: </w:t>
       </w:r>
     </w:p>
     <w:p>
@@ -20208,7 +20379,6 @@
           <w:rtl/>
           <w:lang w:bidi="fa-IR"/>
         </w:rPr>
-        <w:lastRenderedPageBreak/>
         <w:t xml:space="preserve">افتتاحیه </w:t>
       </w:r>
     </w:p>
@@ -20458,17 +20628,71 @@
         <w:ind w:left="0"/>
         <w:rPr>
           <w:rFonts w:ascii="SG Kara FaNum Light" w:hAnsi="SG Kara FaNum Light" w:cs="SG Kara FaNum Light"/>
-          <w:rtl/>
-          <w:lang w:bidi="fa-IR"/>
-        </w:rPr>
-      </w:pPr>
-      <w:r>
-        <w:rPr>
-          <w:rFonts w:ascii="SG Kara FaNum Light" w:hAnsi="SG Kara FaNum Light" w:cs="SG Kara FaNum Light" w:hint="cs"/>
-          <w:rtl/>
-          <w:lang w:bidi="fa-IR"/>
-        </w:rPr>
-        <w:t>نوع حساب: میتوانید انتخاب کنید کدام انواع حساب ها در گزارش نمایش داده شوند که شامل موارد زیر هستند:</w:t>
+          <w:lang w:bidi="fa-IR"/>
+        </w:rPr>
+      </w:pPr>
+      <w:r>
+        <w:rPr>
+          <w:rFonts w:ascii="SG Kara FaNum Light" w:hAnsi="SG Kara FaNum Light" w:cs="SG Kara FaNum Light" w:hint="cs"/>
+          <w:rtl/>
+          <w:lang w:bidi="fa-IR"/>
+        </w:rPr>
+        <w:t xml:space="preserve">توجه: امکان صدور سند با مقدار فیلد نوع سند افتتاحیه فقط در اولین سال مالی </w:t>
+      </w:r>
+      <w:r>
+        <w:rPr>
+          <w:rFonts w:ascii="SG Kara FaNum Light" w:hAnsi="SG Kara FaNum Light" w:cs="SG Kara FaNum Light" w:hint="cs"/>
+          <w:rtl/>
+          <w:lang w:bidi="fa-IR"/>
+        </w:rPr>
+        <w:t xml:space="preserve">به صورت دستی </w:t>
+      </w:r>
+      <w:r>
+        <w:rPr>
+          <w:rFonts w:ascii="SG Kara FaNum Light" w:hAnsi="SG Kara FaNum Light" w:cs="SG Kara FaNum Light" w:hint="cs"/>
+          <w:rtl/>
+          <w:lang w:bidi="fa-IR"/>
+        </w:rPr>
+        <w:t xml:space="preserve">امکان پذیر است. </w:t>
+      </w:r>
+    </w:p>
+    <w:p>
+      <w:pPr>
+        <w:pStyle w:val="ListParagraph"/>
+        <w:bidi/>
+        <w:ind w:left="0"/>
+        <w:rPr>
+          <w:rStyle w:val="Heading2Char"/>
+          <w:rtl/>
+        </w:rPr>
+      </w:pPr>
+      <w:r>
+        <w:rPr>
+          <w:rStyle w:val="Heading2Char"/>
+          <w:rFonts w:hint="cs"/>
+          <w:rtl/>
+        </w:rPr>
+        <w:t>نوع حساب:</w:t>
+      </w:r>
+    </w:p>
+    <w:p>
+      <w:pPr>
+        <w:pStyle w:val="ListParagraph"/>
+        <w:bidi/>
+        <w:ind w:left="0"/>
+        <w:rPr>
+          <w:rFonts w:ascii="SG Kara FaNum Light" w:hAnsi="SG Kara FaNum Light" w:cs="SG Kara FaNum Light"/>
+          <w:rtl/>
+          <w:lang w:bidi="fa-IR"/>
+        </w:rPr>
+      </w:pPr>
+      <w:r>
+        <w:rPr>
+          <w:rFonts w:ascii="SG Kara FaNum Light" w:hAnsi="SG Kara FaNum Light" w:cs="SG Kara FaNum Light" w:hint="cs"/>
+          <w:rtl/>
+          <w:lang w:bidi="fa-IR"/>
+        </w:rPr>
+        <w:t xml:space="preserve"> میتوانید انتخاب کنید کدام انواع حساب ها در گزارش نمایش داده شوند که شامل موارد زیر هستند:</w:t>
       </w:r>
     </w:p>
     <w:p>
@@ -20561,30 +20785,26 @@
     </w:p>
     <w:p>
       <w:pPr>
-        <w:pStyle w:val="ListParagraph"/>
-        <w:bidi/>
-        <w:ind w:left="0"/>
-        <w:rPr>
-          <w:rFonts w:ascii="SG Kara FaNum Light" w:hAnsi="SG Kara FaNum Light" w:cs="SG Kara FaNum Light"/>
-          <w:rtl/>
-          <w:lang w:bidi="fa-IR"/>
-        </w:rPr>
-      </w:pPr>
-    </w:p>
-    <w:p>
-      <w:pPr>
-        <w:pStyle w:val="ListParagraph"/>
-        <w:bidi/>
-        <w:ind w:left="0"/>
-        <w:rPr>
-          <w:rFonts w:ascii="SG Kara FaNum Light" w:hAnsi="SG Kara FaNum Light" w:cs="SG Kara FaNum Light"/>
-          <w:rtl/>
-          <w:lang w:bidi="fa-IR"/>
-        </w:rPr>
-      </w:pPr>
-      <w:r>
-        <w:rPr>
-          <w:rFonts w:ascii="SG Kara FaNum Light" w:hAnsi="SG Kara FaNum Light" w:cs="SG Kara FaNum Light" w:hint="cs"/>
+        <w:pStyle w:val="Heading2"/>
+        <w:bidi/>
+        <w:rPr>
+          <w:rtl/>
+          <w:lang w:bidi="fa-IR"/>
+        </w:rPr>
+      </w:pPr>
+    </w:p>
+    <w:p>
+      <w:pPr>
+        <w:pStyle w:val="Heading2"/>
+        <w:bidi/>
+        <w:rPr>
+          <w:rtl/>
+          <w:lang w:bidi="fa-IR"/>
+        </w:rPr>
+      </w:pPr>
+      <w:r>
+        <w:rPr>
+          <w:rFonts w:hint="cs"/>
           <w:rtl/>
           <w:lang w:bidi="fa-IR"/>
         </w:rPr>
@@ -20705,35 +20925,10 @@
         <w:bidi/>
         <w:ind w:left="0"/>
         <w:rPr>
-          <w:rFonts w:ascii="SG Kara FaNum Light" w:hAnsi="SG Kara FaNum Light" w:cs="SG Kara FaNum Light"/>
-          <w:rtl/>
-          <w:lang w:bidi="fa-IR"/>
-        </w:rPr>
-      </w:pPr>
-      <w:r>
-        <w:rPr>
-          <w:rFonts w:ascii="SG Kara FaNum Light" w:hAnsi="SG Kara FaNum Light" w:cs="SG Kara FaNum Light" w:hint="cs"/>
-          <w:rtl/>
-          <w:lang w:bidi="fa-IR"/>
-        </w:rPr>
-        <w:t>شماره سند، شماره عطف: برای این فیلتر ها امکان وارد کردن شماره آغاز و پایان یک بازه وجود دارد، برای مثال نمایش سند ها از شماره 10 تا 15</w:t>
-      </w:r>
-      <w:r>
-        <w:rPr>
-          <w:rFonts w:ascii="SG Kara FaNum Light" w:hAnsi="SG Kara FaNum Light" w:cs="SG Kara FaNum Light"/>
-          <w:rtl/>
-          <w:lang w:bidi="fa-IR"/>
-        </w:rPr>
-        <w:br/>
-      </w:r>
-      <w:r>
-        <w:rPr>
-          <w:rFonts w:ascii="SG Kara FaNum Light" w:hAnsi="SG Kara FaNum Light" w:cs="SG Kara FaNum Light" w:hint="cs"/>
-          <w:rtl/>
-          <w:lang w:bidi="fa-IR"/>
-        </w:rPr>
-        <w:t>شماره فرعی: امکان وارد کردن یک شماره و انجام فیلتر با گزینه های مختلف مانند برابر است با، برابر نیست با، بزرگتر است از، کوچکتر است از، بزرگتر یا مساوی است با، کوچکتر یا مساوی است با ، وجود دارد.</w:t>
-      </w:r>
+          <w:rStyle w:val="Heading2Char"/>
+          <w:rtl/>
+        </w:rPr>
+      </w:pPr>
     </w:p>
     <w:p>
       <w:pPr>
@@ -20748,11 +20943,35 @@
       </w:pPr>
       <w:r>
         <w:rPr>
-          <w:rFonts w:ascii="SG Kara FaNum Light" w:hAnsi="SG Kara FaNum Light" w:cs="SG Kara FaNum Light" w:hint="cs"/>
-          <w:rtl/>
-          <w:lang w:bidi="fa-IR"/>
-        </w:rPr>
-        <w:t>وضعیت حساب: امکان انتخاب حساب های فعال یا غیر فعال یا هر دو.</w:t>
+          <w:rStyle w:val="Heading2Char"/>
+          <w:rFonts w:hint="cs"/>
+          <w:rtl/>
+        </w:rPr>
+        <w:t>شماره سند</w:t>
+      </w:r>
+      <w:r>
+        <w:rPr>
+          <w:rStyle w:val="Heading2Char"/>
+          <w:rFonts w:hint="cs"/>
+          <w:rtl/>
+        </w:rPr>
+        <w:t xml:space="preserve"> -</w:t>
+      </w:r>
+      <w:r>
+        <w:rPr>
+          <w:rStyle w:val="Heading2Char"/>
+          <w:rFonts w:hint="cs"/>
+          <w:rtl/>
+        </w:rPr>
+        <w:t xml:space="preserve"> شماره عطف:</w:t>
+      </w:r>
+      <w:r>
+        <w:rPr>
+          <w:rFonts w:ascii="SG Kara FaNum Light" w:hAnsi="SG Kara FaNum Light" w:cs="SG Kara FaNum Light" w:hint="cs"/>
+          <w:rtl/>
+          <w:lang w:bidi="fa-IR"/>
+        </w:rPr>
+        <w:t xml:space="preserve"> </w:t>
       </w:r>
     </w:p>
     <w:p>
@@ -20772,7 +20991,568 @@
           <w:rtl/>
           <w:lang w:bidi="fa-IR"/>
         </w:rPr>
-        <w:t xml:space="preserve">وضعیت سند: امکان گزارش گیری اسناد در یکی از وضعیت های موقت، بررسی شده و قطعی شده. (اسناد یادداشت در گزارشات نمایش داده </w:t>
+        <w:t>برای این فیلتر ها امکان وارد کردن شماره آغاز و پایان یک بازه وجود دارد، برای مثال نمایش سند ها از شماره 10 تا 15</w:t>
+      </w:r>
+      <w:r>
+        <w:rPr>
+          <w:rFonts w:ascii="SG Kara FaNum Light" w:hAnsi="SG Kara FaNum Light" w:cs="SG Kara FaNum Light" w:hint="cs"/>
+          <w:rtl/>
+          <w:lang w:bidi="fa-IR"/>
+        </w:rPr>
+        <w:t xml:space="preserve">. </w:t>
+      </w:r>
+      <w:r>
+        <w:rPr>
+          <w:rFonts w:ascii="SG Kara FaNum Light" w:hAnsi="SG Kara FaNum Light" w:cs="SG Kara FaNum Light" w:hint="cs"/>
+          <w:rtl/>
+          <w:lang w:bidi="fa-IR"/>
+        </w:rPr>
+        <w:t xml:space="preserve">شماره عطف سند حسابداری برای ردیابی یک سند </w:t>
+      </w:r>
+      <w:r>
+        <w:rPr>
+          <w:rFonts w:ascii="SG Kara FaNum Light" w:hAnsi="SG Kara FaNum Light" w:cs="SG Kara FaNum Light" w:hint="cs"/>
+          <w:rtl/>
+          <w:lang w:bidi="fa-IR"/>
+        </w:rPr>
+        <w:t>ک</w:t>
+      </w:r>
+      <w:r>
+        <w:rPr>
+          <w:rFonts w:ascii="SG Kara FaNum Light" w:hAnsi="SG Kara FaNum Light" w:cs="SG Kara FaNum Light" w:hint="cs"/>
+          <w:rtl/>
+          <w:lang w:bidi="fa-IR"/>
+        </w:rPr>
+        <w:t>اربرد دارد</w:t>
+      </w:r>
+      <w:r>
+        <w:rPr>
+          <w:rFonts w:ascii="SG Kara FaNum Light" w:hAnsi="SG Kara FaNum Light" w:cs="SG Kara FaNum Light" w:hint="cs"/>
+          <w:rtl/>
+          <w:lang w:bidi="fa-IR"/>
+        </w:rPr>
+        <w:t xml:space="preserve">. همچنین میتوان برای ترکیب کمپانی، دفتر،  سال مالی و شعبه یکتا نیز </w:t>
+      </w:r>
+      <w:r>
+        <w:rPr>
+          <w:rFonts w:ascii="SG Kara FaNum Light" w:hAnsi="SG Kara FaNum Light" w:cs="SG Kara FaNum Light" w:hint="cs"/>
+          <w:rtl/>
+          <w:lang w:bidi="fa-IR"/>
+        </w:rPr>
+        <w:t>استفاده شود</w:t>
+      </w:r>
+      <w:r>
+        <w:rPr>
+          <w:rFonts w:ascii="SG Kara FaNum Light" w:hAnsi="SG Kara FaNum Light" w:cs="SG Kara FaNum Light" w:hint="cs"/>
+          <w:rtl/>
+          <w:lang w:bidi="fa-IR"/>
+        </w:rPr>
+        <w:t xml:space="preserve">. </w:t>
+      </w:r>
+    </w:p>
+    <w:p>
+      <w:pPr>
+        <w:pStyle w:val="ListParagraph"/>
+        <w:bidi/>
+        <w:ind w:left="0"/>
+        <w:rPr>
+          <w:rFonts w:ascii="SG Kara FaNum Light" w:hAnsi="SG Kara FaNum Light" w:cs="SG Kara FaNum Light"/>
+          <w:rtl/>
+          <w:lang w:bidi="fa-IR"/>
+        </w:rPr>
+      </w:pPr>
+      <w:r>
+        <w:rPr>
+          <w:rStyle w:val="Heading2Char"/>
+          <w:rFonts w:hint="cs"/>
+          <w:rtl/>
+        </w:rPr>
+        <w:t>شماره فرعی:</w:t>
+      </w:r>
+      <w:r>
+        <w:rPr>
+          <w:rFonts w:ascii="SG Kara FaNum Light" w:hAnsi="SG Kara FaNum Light" w:cs="SG Kara FaNum Light" w:hint="cs"/>
+          <w:rtl/>
+          <w:lang w:bidi="fa-IR"/>
+        </w:rPr>
+        <w:t xml:space="preserve"> </w:t>
+      </w:r>
+    </w:p>
+    <w:p>
+      <w:pPr>
+        <w:pStyle w:val="ListParagraph"/>
+        <w:bidi/>
+        <w:ind w:left="0"/>
+        <w:rPr>
+          <w:rFonts w:ascii="SG Kara FaNum Light" w:hAnsi="SG Kara FaNum Light" w:cs="SG Kara FaNum Light"/>
+          <w:rtl/>
+          <w:lang w:bidi="fa-IR"/>
+        </w:rPr>
+      </w:pPr>
+      <w:r>
+        <w:rPr>
+          <w:rFonts w:ascii="SG Kara FaNum Light" w:hAnsi="SG Kara FaNum Light" w:cs="SG Kara FaNum Light" w:hint="cs"/>
+          <w:rtl/>
+          <w:lang w:bidi="fa-IR"/>
+        </w:rPr>
+        <w:lastRenderedPageBreak/>
+        <w:t xml:space="preserve">امکان وارد کردن یک شماره و انجام فیلتر با گزینه های مختلف مانند </w:t>
+      </w:r>
+      <w:r>
+        <w:rPr>
+          <w:rFonts w:ascii="SG Kara FaNum Light" w:hAnsi="SG Kara FaNum Light" w:cs="SG Kara FaNum Light" w:hint="cs"/>
+          <w:rtl/>
+          <w:lang w:bidi="fa-IR"/>
+        </w:rPr>
+        <w:t>"</w:t>
+      </w:r>
+      <w:r>
+        <w:rPr>
+          <w:rFonts w:ascii="SG Kara FaNum Light" w:hAnsi="SG Kara FaNum Light" w:cs="SG Kara FaNum Light" w:hint="cs"/>
+          <w:rtl/>
+          <w:lang w:bidi="fa-IR"/>
+        </w:rPr>
+        <w:t>برابر است با</w:t>
+      </w:r>
+      <w:r>
+        <w:rPr>
+          <w:rFonts w:ascii="SG Kara FaNum Light" w:hAnsi="SG Kara FaNum Light" w:cs="SG Kara FaNum Light" w:hint="cs"/>
+          <w:rtl/>
+          <w:lang w:bidi="fa-IR"/>
+        </w:rPr>
+        <w:t>"</w:t>
+      </w:r>
+      <w:r>
+        <w:rPr>
+          <w:rFonts w:ascii="SG Kara FaNum Light" w:hAnsi="SG Kara FaNum Light" w:cs="SG Kara FaNum Light" w:hint="cs"/>
+          <w:rtl/>
+          <w:lang w:bidi="fa-IR"/>
+        </w:rPr>
+        <w:t xml:space="preserve">، </w:t>
+      </w:r>
+      <w:r>
+        <w:rPr>
+          <w:rFonts w:ascii="SG Kara FaNum Light" w:hAnsi="SG Kara FaNum Light" w:cs="SG Kara FaNum Light" w:hint="cs"/>
+          <w:rtl/>
+          <w:lang w:bidi="fa-IR"/>
+        </w:rPr>
+        <w:t>"</w:t>
+      </w:r>
+      <w:r>
+        <w:rPr>
+          <w:rFonts w:ascii="SG Kara FaNum Light" w:hAnsi="SG Kara FaNum Light" w:cs="SG Kara FaNum Light" w:hint="cs"/>
+          <w:rtl/>
+          <w:lang w:bidi="fa-IR"/>
+        </w:rPr>
+        <w:t>برابر نیست با</w:t>
+      </w:r>
+      <w:r>
+        <w:rPr>
+          <w:rFonts w:ascii="SG Kara FaNum Light" w:hAnsi="SG Kara FaNum Light" w:cs="SG Kara FaNum Light" w:hint="cs"/>
+          <w:rtl/>
+          <w:lang w:bidi="fa-IR"/>
+        </w:rPr>
+        <w:t>"</w:t>
+      </w:r>
+      <w:r>
+        <w:rPr>
+          <w:rFonts w:ascii="SG Kara FaNum Light" w:hAnsi="SG Kara FaNum Light" w:cs="SG Kara FaNum Light" w:hint="cs"/>
+          <w:rtl/>
+          <w:lang w:bidi="fa-IR"/>
+        </w:rPr>
+        <w:t xml:space="preserve">، </w:t>
+      </w:r>
+      <w:r>
+        <w:rPr>
+          <w:rFonts w:ascii="SG Kara FaNum Light" w:hAnsi="SG Kara FaNum Light" w:cs="SG Kara FaNum Light" w:hint="cs"/>
+          <w:rtl/>
+          <w:lang w:bidi="fa-IR"/>
+        </w:rPr>
+        <w:t>"</w:t>
+      </w:r>
+      <w:r>
+        <w:rPr>
+          <w:rFonts w:ascii="SG Kara FaNum Light" w:hAnsi="SG Kara FaNum Light" w:cs="SG Kara FaNum Light" w:hint="cs"/>
+          <w:rtl/>
+          <w:lang w:bidi="fa-IR"/>
+        </w:rPr>
+        <w:t>بزرگتر است از</w:t>
+      </w:r>
+      <w:r>
+        <w:rPr>
+          <w:rFonts w:ascii="SG Kara FaNum Light" w:hAnsi="SG Kara FaNum Light" w:cs="SG Kara FaNum Light" w:hint="cs"/>
+          <w:rtl/>
+          <w:lang w:bidi="fa-IR"/>
+        </w:rPr>
+        <w:t>"</w:t>
+      </w:r>
+      <w:r>
+        <w:rPr>
+          <w:rFonts w:ascii="SG Kara FaNum Light" w:hAnsi="SG Kara FaNum Light" w:cs="SG Kara FaNum Light" w:hint="cs"/>
+          <w:rtl/>
+          <w:lang w:bidi="fa-IR"/>
+        </w:rPr>
+        <w:t xml:space="preserve">، </w:t>
+      </w:r>
+      <w:r>
+        <w:rPr>
+          <w:rFonts w:ascii="SG Kara FaNum Light" w:hAnsi="SG Kara FaNum Light" w:cs="SG Kara FaNum Light" w:hint="cs"/>
+          <w:rtl/>
+          <w:lang w:bidi="fa-IR"/>
+        </w:rPr>
+        <w:t>"</w:t>
+      </w:r>
+      <w:r>
+        <w:rPr>
+          <w:rFonts w:ascii="SG Kara FaNum Light" w:hAnsi="SG Kara FaNum Light" w:cs="SG Kara FaNum Light" w:hint="cs"/>
+          <w:rtl/>
+          <w:lang w:bidi="fa-IR"/>
+        </w:rPr>
+        <w:t>کوچکتر است از</w:t>
+      </w:r>
+      <w:r>
+        <w:rPr>
+          <w:rFonts w:ascii="SG Kara FaNum Light" w:hAnsi="SG Kara FaNum Light" w:cs="SG Kara FaNum Light" w:hint="cs"/>
+          <w:rtl/>
+          <w:lang w:bidi="fa-IR"/>
+        </w:rPr>
+        <w:t>"</w:t>
+      </w:r>
+      <w:r>
+        <w:rPr>
+          <w:rFonts w:ascii="SG Kara FaNum Light" w:hAnsi="SG Kara FaNum Light" w:cs="SG Kara FaNum Light" w:hint="cs"/>
+          <w:rtl/>
+          <w:lang w:bidi="fa-IR"/>
+        </w:rPr>
+        <w:t xml:space="preserve">، </w:t>
+      </w:r>
+      <w:r>
+        <w:rPr>
+          <w:rFonts w:ascii="SG Kara FaNum Light" w:hAnsi="SG Kara FaNum Light" w:cs="SG Kara FaNum Light" w:hint="cs"/>
+          <w:rtl/>
+          <w:lang w:bidi="fa-IR"/>
+        </w:rPr>
+        <w:t>"</w:t>
+      </w:r>
+      <w:r>
+        <w:rPr>
+          <w:rFonts w:ascii="SG Kara FaNum Light" w:hAnsi="SG Kara FaNum Light" w:cs="SG Kara FaNum Light" w:hint="cs"/>
+          <w:rtl/>
+          <w:lang w:bidi="fa-IR"/>
+        </w:rPr>
+        <w:t>بزرگتر یا مساوی است با</w:t>
+      </w:r>
+      <w:r>
+        <w:rPr>
+          <w:rFonts w:ascii="SG Kara FaNum Light" w:hAnsi="SG Kara FaNum Light" w:cs="SG Kara FaNum Light" w:hint="cs"/>
+          <w:rtl/>
+          <w:lang w:bidi="fa-IR"/>
+        </w:rPr>
+        <w:t>"</w:t>
+      </w:r>
+      <w:r>
+        <w:rPr>
+          <w:rFonts w:ascii="SG Kara FaNum Light" w:hAnsi="SG Kara FaNum Light" w:cs="SG Kara FaNum Light" w:hint="cs"/>
+          <w:rtl/>
+          <w:lang w:bidi="fa-IR"/>
+        </w:rPr>
+        <w:t xml:space="preserve">، </w:t>
+      </w:r>
+      <w:r>
+        <w:rPr>
+          <w:rFonts w:ascii="SG Kara FaNum Light" w:hAnsi="SG Kara FaNum Light" w:cs="SG Kara FaNum Light" w:hint="cs"/>
+          <w:rtl/>
+          <w:lang w:bidi="fa-IR"/>
+        </w:rPr>
+        <w:t>"</w:t>
+      </w:r>
+      <w:r>
+        <w:rPr>
+          <w:rFonts w:ascii="SG Kara FaNum Light" w:hAnsi="SG Kara FaNum Light" w:cs="SG Kara FaNum Light" w:hint="cs"/>
+          <w:rtl/>
+          <w:lang w:bidi="fa-IR"/>
+        </w:rPr>
+        <w:t>کوچکتر یا مساوی است با</w:t>
+      </w:r>
+      <w:r>
+        <w:rPr>
+          <w:rFonts w:ascii="SG Kara FaNum Light" w:hAnsi="SG Kara FaNum Light" w:cs="SG Kara FaNum Light" w:hint="cs"/>
+          <w:rtl/>
+          <w:lang w:bidi="fa-IR"/>
+        </w:rPr>
+        <w:t>"</w:t>
+      </w:r>
+      <w:r>
+        <w:rPr>
+          <w:rFonts w:ascii="SG Kara FaNum Light" w:hAnsi="SG Kara FaNum Light" w:cs="SG Kara FaNum Light" w:hint="cs"/>
+          <w:rtl/>
+          <w:lang w:bidi="fa-IR"/>
+        </w:rPr>
+        <w:t xml:space="preserve"> ، وجود دارد.</w:t>
+      </w:r>
+      <w:r>
+        <w:rPr>
+          <w:rFonts w:ascii="SG Kara FaNum Light" w:hAnsi="SG Kara FaNum Light" w:cs="SG Kara FaNum Light" w:hint="cs"/>
+          <w:rtl/>
+          <w:lang w:bidi="fa-IR"/>
+        </w:rPr>
+        <w:t xml:space="preserve"> بنابراین این شماره قابلیت ثبت توسط کاربر را دارد. </w:t>
+      </w:r>
+    </w:p>
+    <w:p>
+      <w:pPr>
+        <w:pStyle w:val="ListParagraph"/>
+        <w:bidi/>
+        <w:ind w:left="0"/>
+        <w:rPr>
+          <w:rFonts w:ascii="SG Kara FaNum Light" w:hAnsi="SG Kara FaNum Light" w:cs="SG Kara FaNum Light"/>
+          <w:rtl/>
+          <w:lang w:bidi="fa-IR"/>
+        </w:rPr>
+      </w:pPr>
+      <w:r>
+        <w:rPr>
+          <w:rStyle w:val="Heading2Char"/>
+          <w:rFonts w:hint="cs"/>
+          <w:rtl/>
+        </w:rPr>
+        <w:t>وضعیت حساب:</w:t>
+      </w:r>
+      <w:r>
+        <w:rPr>
+          <w:rFonts w:ascii="SG Kara FaNum Light" w:hAnsi="SG Kara FaNum Light" w:cs="SG Kara FaNum Light" w:hint="cs"/>
+          <w:rtl/>
+          <w:lang w:bidi="fa-IR"/>
+        </w:rPr>
+        <w:t xml:space="preserve"> </w:t>
+      </w:r>
+    </w:p>
+    <w:p>
+      <w:pPr>
+        <w:pStyle w:val="ListParagraph"/>
+        <w:bidi/>
+        <w:ind w:left="0"/>
+        <w:rPr>
+          <w:rFonts w:ascii="SG Kara FaNum Light" w:hAnsi="SG Kara FaNum Light" w:cs="SG Kara FaNum Light"/>
+          <w:rtl/>
+          <w:lang w:bidi="fa-IR"/>
+        </w:rPr>
+      </w:pPr>
+      <w:r>
+        <w:rPr>
+          <w:rFonts w:ascii="SG Kara FaNum Light" w:hAnsi="SG Kara FaNum Light" w:cs="SG Kara FaNum Light" w:hint="cs"/>
+          <w:rtl/>
+          <w:lang w:bidi="fa-IR"/>
+        </w:rPr>
+        <w:t>امکان انتخاب حساب های فعال یا غیر فعال یا هر دو.</w:t>
+      </w:r>
+    </w:p>
+    <w:p>
+      <w:pPr>
+        <w:pStyle w:val="ListParagraph"/>
+        <w:bidi/>
+        <w:ind w:left="0"/>
+        <w:rPr>
+          <w:rFonts w:ascii="SG Kara FaNum Light" w:hAnsi="SG Kara FaNum Light" w:cs="SG Kara FaNum Light"/>
+          <w:rtl/>
+          <w:lang w:bidi="fa-IR"/>
+        </w:rPr>
+      </w:pPr>
+      <w:r>
+        <w:rPr>
+          <w:rStyle w:val="Heading2Char"/>
+          <w:rFonts w:hint="cs"/>
+          <w:rtl/>
+        </w:rPr>
+        <w:t>وضعیت سند</w:t>
+      </w:r>
+      <w:r>
+        <w:rPr>
+          <w:rStyle w:val="Heading2Char"/>
+          <w:rFonts w:hint="cs"/>
+          <w:rtl/>
+        </w:rPr>
+        <w:t xml:space="preserve"> حسابداری</w:t>
+      </w:r>
+      <w:r>
+        <w:rPr>
+          <w:rStyle w:val="Heading2Char"/>
+          <w:rFonts w:hint="cs"/>
+          <w:rtl/>
+        </w:rPr>
+        <w:t>:</w:t>
+      </w:r>
+      <w:r>
+        <w:rPr>
+          <w:rFonts w:ascii="SG Kara FaNum Light" w:hAnsi="SG Kara FaNum Light" w:cs="SG Kara FaNum Light" w:hint="cs"/>
+          <w:rtl/>
+          <w:lang w:bidi="fa-IR"/>
+        </w:rPr>
+        <w:t xml:space="preserve"> </w:t>
+      </w:r>
+    </w:p>
+    <w:p>
+      <w:pPr>
+        <w:pStyle w:val="ListParagraph"/>
+        <w:bidi/>
+        <w:ind w:left="0"/>
+        <w:rPr>
+          <w:rFonts w:ascii="SG Kara FaNum Light" w:hAnsi="SG Kara FaNum Light" w:cs="SG Kara FaNum Light"/>
+          <w:rtl/>
+          <w:lang w:bidi="fa-IR"/>
+        </w:rPr>
+      </w:pPr>
+      <w:r>
+        <w:rPr>
+          <w:rFonts w:ascii="SG Kara FaNum Light" w:hAnsi="SG Kara FaNum Light" w:cs="SG Kara FaNum Light" w:hint="cs"/>
+          <w:rtl/>
+          <w:lang w:bidi="fa-IR"/>
+        </w:rPr>
+        <w:t xml:space="preserve">از مجموع 4 وضعیت برای سند حسابداری (موقت، بررسی شده، قطعی شده، یادداشت شده)، </w:t>
+      </w:r>
+      <w:r>
+        <w:rPr>
+          <w:rFonts w:ascii="SG Kara FaNum Light" w:hAnsi="SG Kara FaNum Light" w:cs="SG Kara FaNum Light" w:hint="cs"/>
+          <w:rtl/>
+          <w:lang w:bidi="fa-IR"/>
+        </w:rPr>
+        <w:t xml:space="preserve">امکان گزارش گیری اسناد در یکی از وضعیت های </w:t>
+      </w:r>
+      <w:r>
+        <w:rPr>
+          <w:rFonts w:ascii="SG Kara FaNum Light" w:hAnsi="SG Kara FaNum Light" w:cs="SG Kara FaNum Light" w:hint="cs"/>
+          <w:rtl/>
+          <w:lang w:bidi="fa-IR"/>
+        </w:rPr>
+        <w:t>"</w:t>
+      </w:r>
+      <w:r>
+        <w:rPr>
+          <w:rFonts w:ascii="SG Kara FaNum Light" w:hAnsi="SG Kara FaNum Light" w:cs="SG Kara FaNum Light" w:hint="cs"/>
+          <w:rtl/>
+          <w:lang w:bidi="fa-IR"/>
+        </w:rPr>
+        <w:t>موقت</w:t>
+      </w:r>
+      <w:r>
+        <w:rPr>
+          <w:rFonts w:ascii="SG Kara FaNum Light" w:hAnsi="SG Kara FaNum Light" w:cs="SG Kara FaNum Light" w:hint="cs"/>
+          <w:rtl/>
+          <w:lang w:bidi="fa-IR"/>
+        </w:rPr>
+        <w:t>"</w:t>
+      </w:r>
+      <w:r>
+        <w:rPr>
+          <w:rFonts w:ascii="SG Kara FaNum Light" w:hAnsi="SG Kara FaNum Light" w:cs="SG Kara FaNum Light" w:hint="cs"/>
+          <w:rtl/>
+          <w:lang w:bidi="fa-IR"/>
+        </w:rPr>
+        <w:t xml:space="preserve">، </w:t>
+      </w:r>
+      <w:r>
+        <w:rPr>
+          <w:rFonts w:ascii="SG Kara FaNum Light" w:hAnsi="SG Kara FaNum Light" w:cs="SG Kara FaNum Light" w:hint="cs"/>
+          <w:rtl/>
+          <w:lang w:bidi="fa-IR"/>
+        </w:rPr>
+        <w:t>"</w:t>
+      </w:r>
+      <w:r>
+        <w:rPr>
+          <w:rFonts w:ascii="SG Kara FaNum Light" w:hAnsi="SG Kara FaNum Light" w:cs="SG Kara FaNum Light" w:hint="cs"/>
+          <w:rtl/>
+          <w:lang w:bidi="fa-IR"/>
+        </w:rPr>
+        <w:t>بررسی شده</w:t>
+      </w:r>
+      <w:r>
+        <w:rPr>
+          <w:rFonts w:ascii="SG Kara FaNum Light" w:hAnsi="SG Kara FaNum Light" w:cs="SG Kara FaNum Light" w:hint="cs"/>
+          <w:rtl/>
+          <w:lang w:bidi="fa-IR"/>
+        </w:rPr>
+        <w:t>"</w:t>
+      </w:r>
+      <w:r>
+        <w:rPr>
+          <w:rFonts w:ascii="SG Kara FaNum Light" w:hAnsi="SG Kara FaNum Light" w:cs="SG Kara FaNum Light" w:hint="cs"/>
+          <w:rtl/>
+          <w:lang w:bidi="fa-IR"/>
+        </w:rPr>
+        <w:t xml:space="preserve"> و </w:t>
+      </w:r>
+      <w:r>
+        <w:rPr>
+          <w:rFonts w:ascii="SG Kara FaNum Light" w:hAnsi="SG Kara FaNum Light" w:cs="SG Kara FaNum Light" w:hint="cs"/>
+          <w:rtl/>
+          <w:lang w:bidi="fa-IR"/>
+        </w:rPr>
+        <w:t>"</w:t>
+      </w:r>
+      <w:r>
+        <w:rPr>
+          <w:rFonts w:ascii="SG Kara FaNum Light" w:hAnsi="SG Kara FaNum Light" w:cs="SG Kara FaNum Light" w:hint="cs"/>
+          <w:rtl/>
+          <w:lang w:bidi="fa-IR"/>
+        </w:rPr>
+        <w:t>قطعی شده</w:t>
+      </w:r>
+      <w:r>
+        <w:rPr>
+          <w:rFonts w:ascii="SG Kara FaNum Light" w:hAnsi="SG Kara FaNum Light" w:cs="SG Kara FaNum Light" w:hint="cs"/>
+          <w:rtl/>
+          <w:lang w:bidi="fa-IR"/>
+        </w:rPr>
+        <w:t>"</w:t>
+      </w:r>
+      <w:r>
+        <w:rPr>
+          <w:rFonts w:ascii="SG Kara FaNum Light" w:hAnsi="SG Kara FaNum Light" w:cs="SG Kara FaNum Light" w:hint="cs"/>
+          <w:rtl/>
+          <w:lang w:bidi="fa-IR"/>
+        </w:rPr>
+        <w:t xml:space="preserve"> وجود دارد</w:t>
+      </w:r>
+      <w:r>
+        <w:rPr>
+          <w:rFonts w:ascii="SG Kara FaNum Light" w:hAnsi="SG Kara FaNum Light" w:cs="SG Kara FaNum Light" w:hint="cs"/>
+          <w:rtl/>
+          <w:lang w:bidi="fa-IR"/>
+        </w:rPr>
+        <w:t xml:space="preserve"> (اسناد </w:t>
+      </w:r>
+      <w:r>
+        <w:rPr>
+          <w:rFonts w:ascii="SG Kara FaNum Light" w:hAnsi="SG Kara FaNum Light" w:cs="SG Kara FaNum Light" w:hint="cs"/>
+          <w:rtl/>
+          <w:lang w:bidi="fa-IR"/>
+        </w:rPr>
+        <w:t>"</w:t>
+      </w:r>
+      <w:r>
+        <w:rPr>
+          <w:rFonts w:ascii="SG Kara FaNum Light" w:hAnsi="SG Kara FaNum Light" w:cs="SG Kara FaNum Light" w:hint="cs"/>
+          <w:rtl/>
+          <w:lang w:bidi="fa-IR"/>
+        </w:rPr>
+        <w:t>یادداشت</w:t>
+      </w:r>
+      <w:r>
+        <w:rPr>
+          <w:rFonts w:ascii="SG Kara FaNum Light" w:hAnsi="SG Kara FaNum Light" w:cs="SG Kara FaNum Light" w:hint="cs"/>
+          <w:rtl/>
+          <w:lang w:bidi="fa-IR"/>
+        </w:rPr>
+        <w:t>"</w:t>
+      </w:r>
+      <w:r>
+        <w:rPr>
+          <w:rFonts w:ascii="SG Kara FaNum Light" w:hAnsi="SG Kara FaNum Light" w:cs="SG Kara FaNum Light" w:hint="cs"/>
+          <w:rtl/>
+          <w:lang w:bidi="fa-IR"/>
+        </w:rPr>
+        <w:t xml:space="preserve"> در گزارشات نمایش داده </w:t>
       </w:r>
       <w:proofErr w:type="spellStart"/>
       <w:r>
@@ -20792,6 +21572,14 @@
         </w:rPr>
         <w:t xml:space="preserve"> شوند)</w:t>
       </w:r>
+      <w:r>
+        <w:rPr>
+          <w:rFonts w:ascii="SG Kara FaNum Light" w:hAnsi="SG Kara FaNum Light" w:cs="SG Kara FaNum Light" w:hint="cs"/>
+          <w:rtl/>
+          <w:lang w:bidi="fa-IR"/>
+        </w:rPr>
+        <w:t xml:space="preserve">. در صورتی که سند حسابداری در وضعیت "بررسی شده" قرار داشته باشند، دیگر قابل حذف نیستند. </w:t>
+      </w:r>
     </w:p>
     <w:p>
       <w:pPr>
@@ -20810,6 +21598,142 @@
           <w:rtl/>
           <w:lang w:bidi="fa-IR"/>
         </w:rPr>
+        <w:t>توجه: در هیچ زمانی امکان لغو قطعی شدن سند حسابداری وجود ندارد.</w:t>
+      </w:r>
+    </w:p>
+    <w:p>
+      <w:pPr>
+        <w:pStyle w:val="ListParagraph"/>
+        <w:bidi/>
+        <w:ind w:left="0"/>
+        <w:rPr>
+          <w:rFonts w:ascii="SG Kara FaNum Light" w:hAnsi="SG Kara FaNum Light" w:cs="SG Kara FaNum Light"/>
+          <w:rtl/>
+          <w:lang w:bidi="fa-IR"/>
+        </w:rPr>
+      </w:pPr>
+      <w:r>
+        <w:rPr>
+          <w:rFonts w:ascii="SG Kara FaNum Light" w:hAnsi="SG Kara FaNum Light" w:cs="SG Kara FaNum Light" w:hint="cs"/>
+          <w:rtl/>
+          <w:lang w:bidi="fa-IR"/>
+        </w:rPr>
+        <w:t>توجه: اسناد "یادداشت شده"</w:t>
+      </w:r>
+      <w:r>
+        <w:rPr>
+          <w:rFonts w:ascii="SG Kara FaNum Light" w:hAnsi="SG Kara FaNum Light" w:cs="SG Kara FaNum Light" w:hint="cs"/>
+          <w:rtl/>
+          <w:lang w:bidi="fa-IR"/>
+        </w:rPr>
+        <w:t xml:space="preserve"> </w:t>
+      </w:r>
+      <w:r>
+        <w:rPr>
+          <w:rFonts w:ascii="SG Kara FaNum Light" w:hAnsi="SG Kara FaNum Light" w:cs="SG Kara FaNum Light" w:hint="cs"/>
+          <w:rtl/>
+          <w:lang w:bidi="fa-IR"/>
+        </w:rPr>
+        <w:t>در سند حسابداری با اینکه در گزارشات نمایش داده نمیشوند، قابل ویرایش هستند.</w:t>
+      </w:r>
+    </w:p>
+    <w:p>
+      <w:pPr>
+        <w:pStyle w:val="ListParagraph"/>
+        <w:bidi/>
+        <w:ind w:left="0"/>
+        <w:rPr>
+          <w:rFonts w:ascii="SG Kara FaNum Light" w:hAnsi="SG Kara FaNum Light" w:cs="SG Kara FaNum Light"/>
+          <w:rtl/>
+          <w:lang w:bidi="fa-IR"/>
+        </w:rPr>
+      </w:pPr>
+      <w:r>
+        <w:rPr>
+          <w:rFonts w:ascii="SG Kara FaNum Light" w:hAnsi="SG Kara FaNum Light" w:cs="SG Kara FaNum Light" w:hint="cs"/>
+          <w:rtl/>
+          <w:lang w:bidi="fa-IR"/>
+        </w:rPr>
+        <w:t xml:space="preserve">توجه: امکان ویرایش اسناد حسابداری تنها در وضعیت "یادداشت" و "موقت" وجود دارد. </w:t>
+      </w:r>
+    </w:p>
+    <w:p>
+      <w:pPr>
+        <w:pStyle w:val="ListParagraph"/>
+        <w:bidi/>
+        <w:ind w:left="0"/>
+        <w:rPr>
+          <w:rFonts w:ascii="SG Kara FaNum Light" w:hAnsi="SG Kara FaNum Light" w:cs="SG Kara FaNum Light"/>
+          <w:rtl/>
+          <w:lang w:bidi="fa-IR"/>
+        </w:rPr>
+      </w:pPr>
+      <w:r>
+        <w:rPr>
+          <w:rFonts w:ascii="SG Kara FaNum Light" w:hAnsi="SG Kara FaNum Light" w:cs="SG Kara FaNum Light" w:hint="cs"/>
+          <w:rtl/>
+          <w:lang w:bidi="fa-IR"/>
+        </w:rPr>
+        <w:t xml:space="preserve">توجه: در هر زمانی امکان ذخیره "یادداشت شده" سند حسابداری وجود دارد. </w:t>
+      </w:r>
+    </w:p>
+    <w:p>
+      <w:pPr>
+        <w:pStyle w:val="ListParagraph"/>
+        <w:bidi/>
+        <w:ind w:left="0"/>
+        <w:rPr>
+          <w:rFonts w:ascii="SG Kara FaNum Light" w:hAnsi="SG Kara FaNum Light" w:cs="SG Kara FaNum Light"/>
+          <w:rtl/>
+          <w:lang w:bidi="fa-IR"/>
+        </w:rPr>
+      </w:pPr>
+      <w:r>
+        <w:rPr>
+          <w:rFonts w:ascii="SG Kara FaNum Light" w:hAnsi="SG Kara FaNum Light" w:cs="SG Kara FaNum Light" w:hint="cs"/>
+          <w:rtl/>
+          <w:lang w:bidi="fa-IR"/>
+        </w:rPr>
+        <w:t xml:space="preserve">توجه: زمانی که اطلاعات اجباری پر شده باشد، امکان ذخیره موقت سند حسابداری وجود دارد. </w:t>
+      </w:r>
+    </w:p>
+    <w:p>
+      <w:pPr>
+        <w:pStyle w:val="ListParagraph"/>
+        <w:bidi/>
+        <w:ind w:left="0"/>
+        <w:rPr>
+          <w:rFonts w:ascii="SG Kara FaNum Light" w:hAnsi="SG Kara FaNum Light" w:cs="SG Kara FaNum Light"/>
+          <w:rtl/>
+          <w:lang w:bidi="fa-IR"/>
+        </w:rPr>
+      </w:pPr>
+      <w:r>
+        <w:rPr>
+          <w:rFonts w:ascii="SG Kara FaNum Light" w:hAnsi="SG Kara FaNum Light" w:cs="SG Kara FaNum Light" w:hint="cs"/>
+          <w:rtl/>
+          <w:lang w:bidi="fa-IR"/>
+        </w:rPr>
+        <w:t xml:space="preserve">توجه: در سند حسابداری، جمع مبلغ بدهکار و بستانکار در صورتی که برابر باشند، امکان ذخیره موقت سند وجود دارد. </w:t>
+      </w:r>
+    </w:p>
+    <w:p>
+      <w:pPr>
+        <w:pStyle w:val="ListParagraph"/>
+        <w:bidi/>
+        <w:ind w:left="0"/>
+        <w:rPr>
+          <w:rFonts w:ascii="SG Kara FaNum Light" w:hAnsi="SG Kara FaNum Light" w:cs="SG Kara FaNum Light"/>
+          <w:rtl/>
+          <w:lang w:bidi="fa-IR"/>
+        </w:rPr>
+      </w:pPr>
+      <w:r>
+        <w:rPr>
+          <w:rFonts w:ascii="SG Kara FaNum Light" w:hAnsi="SG Kara FaNum Light" w:cs="SG Kara FaNum Light" w:hint="cs"/>
+          <w:rtl/>
+          <w:lang w:bidi="fa-IR"/>
+        </w:rPr>
         <w:t>صادر کننده، آخرین بررسی کننده: امکان گزارش گیری از اسنادی که صادر کننده یا بررسی کننده آنها شخص یا اشخاص انتخاب شده باشند.</w:t>
       </w:r>
     </w:p>
@@ -20858,11 +21782,19 @@
       </w:pPr>
       <w:r>
         <w:rPr>
-          <w:rFonts w:ascii="SG Kara FaNum Light" w:hAnsi="SG Kara FaNum Light" w:cs="SG Kara FaNum Light" w:hint="cs"/>
-          <w:rtl/>
-          <w:lang w:bidi="fa-IR"/>
-        </w:rPr>
-        <w:t>شماره پیگیری و تاریخ پیگیری: برای مشاهده اسنادی که دارای شماره و تاریخ پیگیری هستند میتوانید از این دو فیلتر استفاده کنید.</w:t>
+          <w:rStyle w:val="Heading2Char"/>
+          <w:rFonts w:hint="cs"/>
+          <w:rtl/>
+        </w:rPr>
+        <w:t>شماره پیگیری و تاریخ پیگیری:</w:t>
+      </w:r>
+      <w:r>
+        <w:rPr>
+          <w:rFonts w:ascii="SG Kara FaNum Light" w:hAnsi="SG Kara FaNum Light" w:cs="SG Kara FaNum Light" w:hint="cs"/>
+          <w:rtl/>
+          <w:lang w:bidi="fa-IR"/>
+        </w:rPr>
+        <w:t xml:space="preserve"> </w:t>
       </w:r>
     </w:p>
     <w:p>
@@ -20882,6 +21814,26 @@
           <w:rtl/>
           <w:lang w:bidi="fa-IR"/>
         </w:rPr>
+        <w:t>برای مشاهده اسنادی که دارای شماره و تاریخ پیگیری هستند میتوانید از این دو فیلتر استفاده کنید.</w:t>
+      </w:r>
+    </w:p>
+    <w:p>
+      <w:pPr>
+        <w:pStyle w:val="ListParagraph"/>
+        <w:bidi/>
+        <w:ind w:left="0"/>
+        <w:rPr>
+          <w:rFonts w:ascii="SG Kara FaNum Light" w:hAnsi="SG Kara FaNum Light" w:cs="SG Kara FaNum Light"/>
+          <w:rtl/>
+          <w:lang w:bidi="fa-IR"/>
+        </w:rPr>
+      </w:pPr>
+      <w:r>
+        <w:rPr>
+          <w:rFonts w:ascii="SG Kara FaNum Light" w:hAnsi="SG Kara FaNum Light" w:cs="SG Kara FaNum Light" w:hint="cs"/>
+          <w:rtl/>
+          <w:lang w:bidi="fa-IR"/>
+        </w:rPr>
         <w:t xml:space="preserve">شرح سند: در میان شرح </w:t>
       </w:r>
       <w:proofErr w:type="spellStart"/>
@@ -20930,7 +21882,6 @@
         <w:ind w:left="0"/>
         <w:rPr>
           <w:rFonts w:ascii="SG Kara FaNum Light" w:hAnsi="SG Kara FaNum Light" w:cs="SG Kara FaNum Light"/>
-          <w:rtl/>
           <w:lang w:bidi="fa-IR"/>
         </w:rPr>
       </w:pPr>
@@ -20942,9 +21893,139 @@
         <w:ind w:left="0"/>
         <w:rPr>
           <w:rFonts w:ascii="SG Kara FaNum Light" w:hAnsi="SG Kara FaNum Light" w:cs="SG Kara FaNum Light"/>
-          <w:lang w:bidi="fa-IR"/>
-        </w:rPr>
-      </w:pPr>
+          <w:rtl/>
+          <w:lang w:bidi="fa-IR"/>
+        </w:rPr>
+      </w:pPr>
+      <w:r>
+        <w:rPr>
+          <w:rFonts w:ascii="SG Kara FaNum Light" w:hAnsi="SG Kara FaNum Light" w:cs="SG Kara FaNum Light" w:hint="cs"/>
+          <w:rtl/>
+          <w:lang w:bidi="fa-IR"/>
+        </w:rPr>
+        <w:t>توجه: در بخش اقلام سند، کلید "موازنه مبلغ"، به طور خودکار مبلغ را برای موازنه کردن سند محاسبه میکند.</w:t>
+      </w:r>
+    </w:p>
+    <w:p>
+      <w:pPr>
+        <w:pStyle w:val="ListParagraph"/>
+        <w:bidi/>
+        <w:ind w:left="0"/>
+        <w:rPr>
+          <w:rFonts w:ascii="SG Kara FaNum Light" w:hAnsi="SG Kara FaNum Light" w:cs="SG Kara FaNum Light" w:hint="cs"/>
+          <w:rtl/>
+          <w:lang w:bidi="fa-IR"/>
+        </w:rPr>
+      </w:pPr>
+    </w:p>
+    <w:p>
+      <w:pPr>
+        <w:pStyle w:val="ListParagraph"/>
+        <w:bidi/>
+        <w:ind w:left="0"/>
+        <w:rPr>
+          <w:rFonts w:ascii="SG Kara FaNum Light" w:hAnsi="SG Kara FaNum Light" w:cs="SG Kara FaNum Light"/>
+          <w:lang w:bidi="fa-IR"/>
+        </w:rPr>
+      </w:pPr>
+      <w:r>
+        <w:rPr>
+          <w:rFonts w:ascii="SG Kara FaNum Light" w:hAnsi="SG Kara FaNum Light" w:cs="SG Kara FaNum Light" w:hint="cs"/>
+          <w:rtl/>
+          <w:lang w:bidi="fa-IR"/>
+        </w:rPr>
+        <w:t>جهت اعمال فیلتر های پیشرفته از گوشه سمت چپ گزینه "اعمال" و جهت نادیده گرفتن تغییرات گزینه " انصراف" را انتخاب کنید. در هر دو صورت صفحه ی فیلتر های پیشرفته بسته خواهد شد و به صفحه اصلی گزارش باز می گردید.</w:t>
+      </w:r>
+    </w:p>
+    <w:p>
+      <w:pPr>
+        <w:pStyle w:val="ListParagraph"/>
+        <w:bidi/>
+        <w:ind w:left="0"/>
+        <w:rPr>
+          <w:rFonts w:ascii="SG Kara FaNum Light" w:hAnsi="SG Kara FaNum Light" w:cs="SG Kara FaNum Light"/>
+          <w:rtl/>
+          <w:lang w:bidi="fa-IR"/>
+        </w:rPr>
+      </w:pPr>
+    </w:p>
+    <w:p>
+      <w:pPr>
+        <w:pStyle w:val="Heading2"/>
+        <w:bidi/>
+        <w:rPr>
+          <w:rtl/>
+          <w:lang w:bidi="fa-IR"/>
+        </w:rPr>
+      </w:pPr>
+      <w:r>
+        <w:rPr>
+          <w:rFonts w:hint="cs"/>
+          <w:rtl/>
+          <w:lang w:bidi="fa-IR"/>
+        </w:rPr>
+        <w:t xml:space="preserve">نحوه اجرای گزارش: </w:t>
+      </w:r>
+    </w:p>
+    <w:p>
+      <w:pPr>
+        <w:pStyle w:val="ListParagraph"/>
+        <w:bidi/>
+        <w:ind w:left="0"/>
+        <w:rPr>
+          <w:rFonts w:ascii="SG Kara FaNum Light" w:hAnsi="SG Kara FaNum Light" w:cs="SG Kara FaNum Light"/>
+          <w:rtl/>
+          <w:lang w:bidi="fa-IR"/>
+        </w:rPr>
+      </w:pPr>
+      <w:r>
+        <w:rPr>
+          <w:rFonts w:ascii="SG Kara FaNum Light" w:hAnsi="SG Kara FaNum Light" w:cs="SG Kara FaNum Light" w:hint="cs"/>
+          <w:rtl/>
+          <w:lang w:bidi="fa-IR"/>
+        </w:rPr>
+        <w:t>در گزارش مرور حساب ها پس از انجام فیلتر های اصلی و پیشرفته، میتوانید بر اساس هر یک از زبانه ها، گزارش را اجرا کرده و گردش بدهکار و بستانکار، مانده بدهکار و بستانکار و مانده نهایی حساب ها را مشاهده کنید.</w:t>
+      </w:r>
+    </w:p>
+    <w:p>
+      <w:pPr>
+        <w:pStyle w:val="ListParagraph"/>
+        <w:bidi/>
+        <w:ind w:left="0"/>
+        <w:rPr>
+          <w:rFonts w:ascii="SG Kara FaNum Light" w:hAnsi="SG Kara FaNum Light" w:cs="SG Kara FaNum Light"/>
+          <w:rtl/>
+          <w:lang w:bidi="fa-IR"/>
+        </w:rPr>
+      </w:pPr>
+      <w:r>
+        <w:rPr>
+          <w:rFonts w:ascii="SG Kara FaNum Light" w:hAnsi="SG Kara FaNum Light" w:cs="SG Kara FaNum Light" w:hint="cs"/>
+          <w:rtl/>
+          <w:lang w:bidi="fa-IR"/>
+        </w:rPr>
+        <w:t>در هر زبانه و با انتخاب یک یا چند حساب میتوانید آنها را فیلتر نموده و مرور در سایر زبانه ها را ادامه دهید.</w:t>
+      </w:r>
+    </w:p>
+    <w:p>
+      <w:pPr>
+        <w:pStyle w:val="ListParagraph"/>
+        <w:bidi/>
+        <w:ind w:left="0"/>
+        <w:rPr>
+          <w:rFonts w:ascii="SG Kara FaNum Light" w:hAnsi="SG Kara FaNum Light" w:cs="SG Kara FaNum Light"/>
+          <w:rtl/>
+          <w:lang w:bidi="fa-IR"/>
+        </w:rPr>
+      </w:pPr>
+      <w:r>
+        <w:rPr>
+          <w:rFonts w:ascii="SG Kara FaNum Light" w:hAnsi="SG Kara FaNum Light" w:cs="SG Kara FaNum Light" w:hint="cs"/>
+          <w:rtl/>
+          <w:lang w:bidi="fa-IR"/>
+        </w:rPr>
+        <w:t xml:space="preserve">برای مثال: در ابتدا با کلیک بر روی گروه حساب، تمامی گروه حساب های مورد نظر خود را مشاهده میکنید، در صورتی که فقط گروه حساب هزینه ها را انتخاب کنید و سپس روی تب معین کلیک کنید، فقط حساب </w:t>
+      </w:r>
       <w:r>
         <w:rPr>
           <w:rFonts w:ascii="SG Kara FaNum Light" w:hAnsi="SG Kara FaNum Light" w:cs="SG Kara FaNum Light" w:hint="cs"/>
@@ -20952,7 +22033,7 @@
           <w:lang w:bidi="fa-IR"/>
         </w:rPr>
         <w:lastRenderedPageBreak/>
-        <w:t>جهت اعمال فیلتر های پیشرفته از گوشه سمت چپ گزینه "اعمال" و جهت نادیده گرفتن تغییرات گزینه " انصراف" را انتخاب کنید. در هر دو صورت صفحه ی فیلتر های پیشرفته بسته خواهد شد و به صفحه اصلی گزارش باز می گردید.</w:t>
+        <w:t>های معین مرتبط با گروه حساب هزینه ها نمایش داده میشود. در ادامه اگر یکی از معین های هزینه را انتخاب کنید (مثلا هزینه حقوق ) و بر روی زبانه تفصیل ها، تفصیل مرکز هزینه کلیک کنید، اطلاعات هزینه حقوق به تفکیک مراکز هزینه را مشاهده خواهید کرد. سپس اگر مرکز هزینه ای را انتخاب و بر روی زبانه ریز گردش کلیک کنید، گردش تمام حساب های هزینه حقوق مرکز هزینه انتخابی را مشاهده خواهید کرد.</w:t>
       </w:r>
     </w:p>
     <w:p>
@@ -20966,6 +22047,14 @@
           <w:lang w:bidi="fa-IR"/>
         </w:rPr>
       </w:pPr>
+      <w:r>
+        <w:rPr>
+          <w:rFonts w:ascii="SG Kara FaNum Light" w:hAnsi="SG Kara FaNum Light" w:cs="SG Kara FaNum Light" w:hint="cs"/>
+          <w:rtl/>
+          <w:lang w:bidi="fa-IR"/>
+        </w:rPr>
+        <w:t>به عنوان مثالی دیگر، اگر معین حساب های دریافتنی را در زبانه حساب معین انتخاب نموده و بعد در زبانه طرف تجاری در تفصیل ها تفصیل مشخصی را انتخاب کنید و در ادامه به زبانه ریز گردش بروید، گردش معین و تفصیل انتخابی را مشاهده خواهید کرد.</w:t>
+      </w:r>
     </w:p>
     <w:p>
       <w:pPr>
@@ -20984,7 +22073,39 @@
           <w:rtl/>
           <w:lang w:bidi="fa-IR"/>
         </w:rPr>
-        <w:t xml:space="preserve">نحوه اجرای گزارش: </w:t>
+        <w:t>در زبانه ریز گردش می توانید با کلیک رو لینک شماره سند قلم مورد نظر، به سند حسابداری مربوط به آن قلم دسترسی داشته باشید.</w:t>
+      </w:r>
+      <w:r>
+        <w:rPr>
+          <w:rFonts w:ascii="SG Kara FaNum Light" w:hAnsi="SG Kara FaNum Light" w:cs="SG Kara FaNum Light" w:hint="cs"/>
+          <w:rtl/>
+          <w:lang w:bidi="fa-IR"/>
+        </w:rPr>
+        <w:t xml:space="preserve"> باید </w:t>
+      </w:r>
+      <w:r>
+        <w:rPr>
+          <w:rFonts w:ascii="SG Kara FaNum Light" w:hAnsi="SG Kara FaNum Light" w:cs="SG Kara FaNum Light" w:hint="cs"/>
+          <w:rtl/>
+          <w:lang w:bidi="fa-IR"/>
+        </w:rPr>
+        <w:t>توجه</w:t>
+      </w:r>
+      <w:r>
+        <w:rPr>
+          <w:rFonts w:ascii="SG Kara FaNum Light" w:hAnsi="SG Kara FaNum Light" w:cs="SG Kara FaNum Light" w:hint="cs"/>
+          <w:rtl/>
+          <w:lang w:bidi="fa-IR"/>
+        </w:rPr>
+        <w:t xml:space="preserve"> </w:t>
+      </w:r>
+      <w:r>
+        <w:rPr>
+          <w:rFonts w:ascii="SG Kara FaNum Light" w:hAnsi="SG Kara FaNum Light" w:cs="SG Kara FaNum Light" w:hint="cs"/>
+          <w:rtl/>
+          <w:lang w:bidi="fa-IR"/>
+        </w:rPr>
+        <w:t xml:space="preserve">شماره سند به ترتیب تاریخ و شماره روزانه توسط سیستم به صورت خودکار تکمیل میگردد. </w:t>
       </w:r>
     </w:p>
     <w:p>
@@ -20998,14 +22119,6 @@
           <w:lang w:bidi="fa-IR"/>
         </w:rPr>
       </w:pPr>
-      <w:r>
-        <w:rPr>
-          <w:rFonts w:ascii="SG Kara FaNum Light" w:hAnsi="SG Kara FaNum Light" w:cs="SG Kara FaNum Light" w:hint="cs"/>
-          <w:rtl/>
-          <w:lang w:bidi="fa-IR"/>
-        </w:rPr>
-        <w:t>در گزارش مرور حساب ها پس از انجام فیلتر های اصلی و پیشرفته، میتوانید بر اساس هر یک از زبانه ها، گزارش را اجرا کرده و گردش بدهکار و بستانکار، مانده بدهکار و بستانکار و مانده نهایی حساب ها را مشاهده کنید.</w:t>
-      </w:r>
     </w:p>
     <w:p>
       <w:pPr>
@@ -21018,14 +22131,6 @@
           <w:lang w:bidi="fa-IR"/>
         </w:rPr>
       </w:pPr>
-      <w:r>
-        <w:rPr>
-          <w:rFonts w:ascii="SG Kara FaNum Light" w:hAnsi="SG Kara FaNum Light" w:cs="SG Kara FaNum Light" w:hint="cs"/>
-          <w:rtl/>
-          <w:lang w:bidi="fa-IR"/>
-        </w:rPr>
-        <w:t>در هر زبانه و با انتخاب یک یا چند حساب میتوانید آنها را فیلتر نموده و مرور در سایر زبانه ها را ادامه دهید.</w:t>
-      </w:r>
     </w:p>
     <w:p>
       <w:pPr>
@@ -21038,54 +22143,6 @@
           <w:lang w:bidi="fa-IR"/>
         </w:rPr>
       </w:pPr>
-      <w:r>
-        <w:rPr>
-          <w:rFonts w:ascii="SG Kara FaNum Light" w:hAnsi="SG Kara FaNum Light" w:cs="SG Kara FaNum Light" w:hint="cs"/>
-          <w:rtl/>
-          <w:lang w:bidi="fa-IR"/>
-        </w:rPr>
-        <w:t>برای مثال: در ابتدا با کلیک بر روی گروه حساب، تمامی گروه حساب های مورد نظر خود را مشاهده میکنید، در صورتی که فقط گروه حساب هزینه ها را انتخاب کنید و سپس روی تب معین کلیک کنید، فقط حساب های معین مرتبط با گروه حساب هزینه ها نمایش داده میشود. در ادامه اگر یکی از معین های هزینه را انتخاب کنید (مثلا هزینه حقوق ) و بر روی زبانه تفصیل ها، تفصیل مرکز هزینه کلیک کنید، اطلاعات هزینه حقوق به تفکیک مراکز هزینه را مشاهده خواهید کرد. سپس اگر مرکز هزینه ای را انتخاب و بر روی زبانه ریز گردش کلیک کنید، گردش تمام حساب های هزینه حقوق مرکز هزینه انتخابی را مشاهده خواهید کرد.</w:t>
-      </w:r>
-    </w:p>
-    <w:p>
-      <w:pPr>
-        <w:pStyle w:val="ListParagraph"/>
-        <w:bidi/>
-        <w:ind w:left="0"/>
-        <w:rPr>
-          <w:rFonts w:ascii="SG Kara FaNum Light" w:hAnsi="SG Kara FaNum Light" w:cs="SG Kara FaNum Light"/>
-          <w:rtl/>
-          <w:lang w:bidi="fa-IR"/>
-        </w:rPr>
-      </w:pPr>
-      <w:r>
-        <w:rPr>
-          <w:rFonts w:ascii="SG Kara FaNum Light" w:hAnsi="SG Kara FaNum Light" w:cs="SG Kara FaNum Light" w:hint="cs"/>
-          <w:rtl/>
-          <w:lang w:bidi="fa-IR"/>
-        </w:rPr>
-        <w:t>به عنوان مثالی دیگر، اگر معین حساب های دریافتنی را در زبانه حساب معین انتخاب نموده و بعد در زبانه طرف تجاری در تفصیل ها تفصیل مشخصی را انتخاب کنید و در ادامه به زبانه ریز گردش بروید، گردش معین و تفصیل انتخابی را مشاهده خواهید کرد.</w:t>
-      </w:r>
-    </w:p>
-    <w:p>
-      <w:pPr>
-        <w:pStyle w:val="ListParagraph"/>
-        <w:bidi/>
-        <w:ind w:left="0"/>
-        <w:rPr>
-          <w:rFonts w:ascii="SG Kara FaNum Light" w:hAnsi="SG Kara FaNum Light" w:cs="SG Kara FaNum Light"/>
-          <w:rtl/>
-          <w:lang w:bidi="fa-IR"/>
-        </w:rPr>
-      </w:pPr>
-      <w:r>
-        <w:rPr>
-          <w:rFonts w:ascii="SG Kara FaNum Light" w:hAnsi="SG Kara FaNum Light" w:cs="SG Kara FaNum Light" w:hint="cs"/>
-          <w:rtl/>
-          <w:lang w:bidi="fa-IR"/>
-        </w:rPr>
-        <w:t>در زبانه ریز گردش می توانید با کلیک رو لینک شماره سند قلم مورد نظر، به سند حسابداری مربوط به آن قلم دسترسی داشته باشید.</w:t>
-      </w:r>
     </w:p>
     <w:p>
       <w:pPr>
@@ -21120,146 +22177,6 @@
             <wp:extent cx="5943600" cy="2962275"/>
             <wp:effectExtent l="0" t="0" r="0" b="9525"/>
             <wp:docPr id="22" name="Picture 22"/>
-            <wp:cNvGraphicFramePr>
-              <a:graphicFrameLocks xmlns:a="http://schemas.openxmlformats.org/drawingml/2006/main" noChangeAspect="1"/>
-            </wp:cNvGraphicFramePr>
-            <a:graphic xmlns:a="http://schemas.openxmlformats.org/drawingml/2006/main">
-              <a:graphicData uri="http://schemas.openxmlformats.org/drawingml/2006/picture">
-                <pic:pic xmlns:pic="http://schemas.openxmlformats.org/drawingml/2006/picture">
-                  <pic:nvPicPr>
-                    <pic:cNvPr id="1" name=""/>
-                    <pic:cNvPicPr/>
-                  </pic:nvPicPr>
-                  <pic:blipFill>
-                    <a:blip r:embed="rId26"/>
-                    <a:stretch>
-                      <a:fillRect/>
-                    </a:stretch>
-                  </pic:blipFill>
-                  <pic:spPr>
-                    <a:xfrm>
-                      <a:off x="0" y="0"/>
-                      <a:ext cx="5943600" cy="2962275"/>
-                    </a:xfrm>
-                    <a:prstGeom prst="rect">
-                      <a:avLst/>
-                    </a:prstGeom>
-                  </pic:spPr>
-                </pic:pic>
-              </a:graphicData>
-            </a:graphic>
-          </wp:inline>
-        </w:drawing>
-      </w:r>
-    </w:p>
-    <w:p>
-      <w:pPr>
-        <w:pStyle w:val="ListParagraph"/>
-        <w:bidi/>
-        <w:ind w:left="0"/>
-        <w:jc w:val="center"/>
-        <w:rPr>
-          <w:rFonts w:ascii="SG Kara FaNum Light" w:hAnsi="SG Kara FaNum Light" w:cs="SG Kara FaNum Light"/>
-          <w:rtl/>
-          <w:lang w:bidi="fa-IR"/>
-        </w:rPr>
-      </w:pPr>
-    </w:p>
-    <w:p>
-      <w:pPr>
-        <w:pStyle w:val="ListParagraph"/>
-        <w:bidi/>
-        <w:ind w:left="0"/>
-        <w:rPr>
-          <w:rFonts w:ascii="SG Kara FaNum Light" w:hAnsi="SG Kara FaNum Light" w:cs="SG Kara FaNum Light"/>
-          <w:rtl/>
-          <w:lang w:bidi="fa-IR"/>
-        </w:rPr>
-      </w:pPr>
-      <w:r>
-        <w:rPr>
-          <w:rFonts w:ascii="SG Kara FaNum Light" w:hAnsi="SG Kara FaNum Light" w:cs="SG Kara FaNum Light" w:hint="cs"/>
-          <w:rtl/>
-          <w:lang w:bidi="fa-IR"/>
-        </w:rPr>
-        <w:t xml:space="preserve"> این گزارش امکان چاپ و ارسال به اکسل در هر مرحله را دارد.</w:t>
-      </w:r>
-    </w:p>
-    <w:p>
-      <w:pPr>
-        <w:bidi/>
-        <w:rPr>
-          <w:rFonts w:ascii="SG Kara FaNum Light" w:hAnsi="SG Kara FaNum Light" w:cs="SG Kara FaNum Light"/>
-          <w:rtl/>
-          <w:lang w:bidi="fa-IR"/>
-        </w:rPr>
-      </w:pPr>
-      <w:r>
-        <w:rPr>
-          <w:rFonts w:ascii="SG Kara FaNum Light" w:hAnsi="SG Kara FaNum Light" w:cs="SG Kara FaNum Light" w:hint="cs"/>
-          <w:rtl/>
-          <w:lang w:bidi="fa-IR"/>
-        </w:rPr>
-        <w:t xml:space="preserve">در صورت </w:t>
-      </w:r>
-      <w:proofErr w:type="spellStart"/>
-      <w:r>
-        <w:rPr>
-          <w:rFonts w:ascii="SG Kara FaNum Light" w:hAnsi="SG Kara FaNum Light" w:cs="SG Kara FaNum Light" w:hint="cs"/>
-          <w:rtl/>
-          <w:lang w:bidi="fa-IR"/>
-        </w:rPr>
-        <w:t>درگ</w:t>
-      </w:r>
-      <w:proofErr w:type="spellEnd"/>
-      <w:r>
-        <w:rPr>
-          <w:rFonts w:ascii="SG Kara FaNum Light" w:hAnsi="SG Kara FaNum Light" w:cs="SG Kara FaNum Light" w:hint="cs"/>
-          <w:rtl/>
-          <w:lang w:bidi="fa-IR"/>
-        </w:rPr>
-        <w:t xml:space="preserve"> کردن (انتخاب و کشیدن </w:t>
-      </w:r>
-      <w:proofErr w:type="spellStart"/>
-      <w:r>
-        <w:rPr>
-          <w:rFonts w:ascii="SG Kara FaNum Light" w:hAnsi="SG Kara FaNum Light" w:cs="SG Kara FaNum Light" w:hint="cs"/>
-          <w:rtl/>
-          <w:lang w:bidi="fa-IR"/>
-        </w:rPr>
-        <w:t>ماوس</w:t>
-      </w:r>
-      <w:proofErr w:type="spellEnd"/>
-      <w:r>
-        <w:rPr>
-          <w:rFonts w:ascii="SG Kara FaNum Light" w:hAnsi="SG Kara FaNum Light" w:cs="SG Kara FaNum Light" w:hint="cs"/>
-          <w:rtl/>
-          <w:lang w:bidi="fa-IR"/>
-        </w:rPr>
-        <w:t>) روی مبالغ مورد نظر، امکان مشاهده تعداد و مجموع مبالغ انتخابی در پایین صفحه را خواهید داشت.</w:t>
-      </w:r>
-    </w:p>
-    <w:p>
-      <w:pPr>
-        <w:pStyle w:val="ListParagraph"/>
-        <w:bidi/>
-        <w:ind w:left="0"/>
-        <w:rPr>
-          <w:rFonts w:ascii="SG Kara FaNum Light" w:hAnsi="SG Kara FaNum Light" w:cs="SG Kara FaNum Light"/>
-          <w:rtl/>
-          <w:lang w:bidi="fa-IR"/>
-        </w:rPr>
-      </w:pPr>
-      <w:r>
-        <w:rPr>
-          <w:noProof/>
-        </w:rPr>
-        <w:lastRenderedPageBreak/>
-        <w:drawing>
-          <wp:inline distT="0" distB="0" distL="0" distR="0" wp14:anchorId="5BF86DD0" wp14:editId="64999C87">
-            <wp:extent cx="5943600" cy="2962275"/>
-            <wp:effectExtent l="0" t="0" r="0" b="9525"/>
-            <wp:docPr id="23" name="Picture 23"/>
             <wp:cNvGraphicFramePr>
               <a:graphicFrameLocks xmlns:a="http://schemas.openxmlformats.org/drawingml/2006/main" noChangeAspect="1"/>
             </wp:cNvGraphicFramePr>
@@ -21297,6 +22214,169 @@
         <w:pStyle w:val="ListParagraph"/>
         <w:bidi/>
         <w:ind w:left="0"/>
+        <w:jc w:val="center"/>
+        <w:rPr>
+          <w:rFonts w:ascii="SG Kara FaNum Light" w:hAnsi="SG Kara FaNum Light" w:cs="SG Kara FaNum Light"/>
+          <w:rtl/>
+          <w:lang w:bidi="fa-IR"/>
+        </w:rPr>
+      </w:pPr>
+    </w:p>
+    <w:p>
+      <w:pPr>
+        <w:pStyle w:val="ListParagraph"/>
+        <w:bidi/>
+        <w:ind w:left="0"/>
+        <w:rPr>
+          <w:rFonts w:ascii="SG Kara FaNum Light" w:hAnsi="SG Kara FaNum Light" w:cs="SG Kara FaNum Light"/>
+          <w:lang w:bidi="fa-IR"/>
+        </w:rPr>
+      </w:pPr>
+      <w:r>
+        <w:rPr>
+          <w:rFonts w:ascii="SG Kara FaNum Light" w:hAnsi="SG Kara FaNum Light" w:cs="SG Kara FaNum Light" w:hint="cs"/>
+          <w:rtl/>
+          <w:lang w:bidi="fa-IR"/>
+        </w:rPr>
+        <w:t xml:space="preserve"> این گزارش امکان چاپ و ارسال به اکسل در هر مرحله را دارد.</w:t>
+      </w:r>
+      <w:r>
+        <w:rPr>
+          <w:rFonts w:ascii="SG Kara FaNum Light" w:hAnsi="SG Kara FaNum Light" w:cs="SG Kara FaNum Light" w:hint="cs"/>
+          <w:rtl/>
+          <w:lang w:bidi="fa-IR"/>
+        </w:rPr>
+        <w:t xml:space="preserve"> در صورت انتخاب گزینه چاپ</w:t>
+      </w:r>
+      <w:r>
+        <w:rPr>
+          <w:rFonts w:ascii="SG Kara FaNum Light" w:hAnsi="SG Kara FaNum Light" w:cs="SG Kara FaNum Light" w:hint="cs"/>
+          <w:rtl/>
+          <w:lang w:bidi="fa-IR"/>
+        </w:rPr>
+        <w:t xml:space="preserve"> برای یک سند حسابداری</w:t>
+      </w:r>
+      <w:r>
+        <w:rPr>
+          <w:rFonts w:ascii="SG Kara FaNum Light" w:hAnsi="SG Kara FaNum Light" w:cs="SG Kara FaNum Light" w:hint="cs"/>
+          <w:rtl/>
+          <w:lang w:bidi="fa-IR"/>
+        </w:rPr>
+        <w:t>، سند با الگوی چاپ پیش فرض نمایش داده میشود.</w:t>
+      </w:r>
+    </w:p>
+    <w:p>
+      <w:pPr>
+        <w:bidi/>
+        <w:rPr>
+          <w:rFonts w:ascii="SG Kara FaNum Light" w:hAnsi="SG Kara FaNum Light" w:cs="SG Kara FaNum Light"/>
+          <w:rtl/>
+          <w:lang w:bidi="fa-IR"/>
+        </w:rPr>
+      </w:pPr>
+      <w:r>
+        <w:rPr>
+          <w:rFonts w:ascii="SG Kara FaNum Light" w:hAnsi="SG Kara FaNum Light" w:cs="SG Kara FaNum Light" w:hint="cs"/>
+          <w:rtl/>
+          <w:lang w:bidi="fa-IR"/>
+        </w:rPr>
+        <w:t xml:space="preserve">در صورت </w:t>
+      </w:r>
+      <w:proofErr w:type="spellStart"/>
+      <w:r>
+        <w:rPr>
+          <w:rFonts w:ascii="SG Kara FaNum Light" w:hAnsi="SG Kara FaNum Light" w:cs="SG Kara FaNum Light" w:hint="cs"/>
+          <w:rtl/>
+          <w:lang w:bidi="fa-IR"/>
+        </w:rPr>
+        <w:t>درگ</w:t>
+      </w:r>
+      <w:proofErr w:type="spellEnd"/>
+      <w:r>
+        <w:rPr>
+          <w:rFonts w:ascii="SG Kara FaNum Light" w:hAnsi="SG Kara FaNum Light" w:cs="SG Kara FaNum Light" w:hint="cs"/>
+          <w:rtl/>
+          <w:lang w:bidi="fa-IR"/>
+        </w:rPr>
+        <w:t xml:space="preserve"> کردن (انتخاب و کشیدن </w:t>
+      </w:r>
+      <w:proofErr w:type="spellStart"/>
+      <w:r>
+        <w:rPr>
+          <w:rFonts w:ascii="SG Kara FaNum Light" w:hAnsi="SG Kara FaNum Light" w:cs="SG Kara FaNum Light" w:hint="cs"/>
+          <w:rtl/>
+          <w:lang w:bidi="fa-IR"/>
+        </w:rPr>
+        <w:t>ماوس</w:t>
+      </w:r>
+      <w:proofErr w:type="spellEnd"/>
+      <w:r>
+        <w:rPr>
+          <w:rFonts w:ascii="SG Kara FaNum Light" w:hAnsi="SG Kara FaNum Light" w:cs="SG Kara FaNum Light" w:hint="cs"/>
+          <w:rtl/>
+          <w:lang w:bidi="fa-IR"/>
+        </w:rPr>
+        <w:t>) روی مبالغ مورد نظر، امکان مشاهده تعداد و مجموع مبالغ انتخابی در پایین صفحه را خواهید داشت.</w:t>
+      </w:r>
+    </w:p>
+    <w:p>
+      <w:pPr>
+        <w:pStyle w:val="ListParagraph"/>
+        <w:bidi/>
+        <w:ind w:left="0"/>
+        <w:rPr>
+          <w:rFonts w:ascii="SG Kara FaNum Light" w:hAnsi="SG Kara FaNum Light" w:cs="SG Kara FaNum Light"/>
+          <w:rtl/>
+          <w:lang w:bidi="fa-IR"/>
+        </w:rPr>
+      </w:pPr>
+      <w:r>
+        <w:rPr>
+          <w:noProof/>
+        </w:rPr>
+        <w:lastRenderedPageBreak/>
+        <w:drawing>
+          <wp:inline distT="0" distB="0" distL="0" distR="0" wp14:anchorId="5BF86DD0" wp14:editId="64999C87">
+            <wp:extent cx="5943600" cy="2962275"/>
+            <wp:effectExtent l="0" t="0" r="0" b="9525"/>
+            <wp:docPr id="23" name="Picture 23"/>
+            <wp:cNvGraphicFramePr>
+              <a:graphicFrameLocks xmlns:a="http://schemas.openxmlformats.org/drawingml/2006/main" noChangeAspect="1"/>
+            </wp:cNvGraphicFramePr>
+            <a:graphic xmlns:a="http://schemas.openxmlformats.org/drawingml/2006/main">
+              <a:graphicData uri="http://schemas.openxmlformats.org/drawingml/2006/picture">
+                <pic:pic xmlns:pic="http://schemas.openxmlformats.org/drawingml/2006/picture">
+                  <pic:nvPicPr>
+                    <pic:cNvPr id="1" name=""/>
+                    <pic:cNvPicPr/>
+                  </pic:nvPicPr>
+                  <pic:blipFill>
+                    <a:blip r:embed="rId28"/>
+                    <a:stretch>
+                      <a:fillRect/>
+                    </a:stretch>
+                  </pic:blipFill>
+                  <pic:spPr>
+                    <a:xfrm>
+                      <a:off x="0" y="0"/>
+                      <a:ext cx="5943600" cy="2962275"/>
+                    </a:xfrm>
+                    <a:prstGeom prst="rect">
+                      <a:avLst/>
+                    </a:prstGeom>
+                  </pic:spPr>
+                </pic:pic>
+              </a:graphicData>
+            </a:graphic>
+          </wp:inline>
+        </w:drawing>
+      </w:r>
+    </w:p>
+    <w:p>
+      <w:pPr>
+        <w:pStyle w:val="ListParagraph"/>
+        <w:bidi/>
+        <w:ind w:left="0"/>
         <w:rPr>
           <w:rFonts w:ascii="SG Kara FaNum Light" w:hAnsi="SG Kara FaNum Light" w:cs="SG Kara FaNum Light"/>
           <w:rtl/>
@@ -21309,11 +22389,55 @@
         <w:bidi/>
         <w:jc w:val="both"/>
         <w:rPr>
-          <w:rFonts w:ascii="SG Kara FaNum Light" w:hAnsi="SG Kara FaNum Light" w:cs="SG Kara FaNum Light"/>
-          <w:rtl/>
-          <w:lang w:bidi="fa-IR"/>
-        </w:rPr>
-      </w:pPr>
+          <w:rFonts w:ascii="Calibri" w:eastAsia="Times New Roman" w:hAnsi="Calibri" w:cs="Calibri"/>
+          <w:color w:val="000000"/>
+          <w:rtl/>
+        </w:rPr>
+      </w:pPr>
+      <w:r>
+        <w:rPr>
+          <w:rFonts w:ascii="SG Kara FaNum Light" w:hAnsi="SG Kara FaNum Light" w:cs="SG Kara FaNum Light" w:hint="cs"/>
+          <w:rtl/>
+          <w:lang w:bidi="fa-IR"/>
+        </w:rPr>
+        <w:t xml:space="preserve">توجه: در صورت انجام </w:t>
+      </w:r>
+      <w:proofErr w:type="spellStart"/>
+      <w:r>
+        <w:rPr>
+          <w:rFonts w:ascii="SG Kara FaNum Light" w:hAnsi="SG Kara FaNum Light" w:cs="SG Kara FaNum Light" w:hint="cs"/>
+          <w:rtl/>
+          <w:lang w:bidi="fa-IR"/>
+        </w:rPr>
+        <w:t>تنظیمات</w:t>
+      </w:r>
+      <w:proofErr w:type="spellEnd"/>
+      <w:r>
+        <w:rPr>
+          <w:rFonts w:ascii="SG Kara FaNum Light" w:hAnsi="SG Kara FaNum Light" w:cs="SG Kara FaNum Light" w:hint="cs"/>
+          <w:rtl/>
+          <w:lang w:bidi="fa-IR"/>
+        </w:rPr>
+        <w:t xml:space="preserve"> شماره گذاری در سطح شعبه در </w:t>
+      </w:r>
+      <w:proofErr w:type="spellStart"/>
+      <w:r>
+        <w:rPr>
+          <w:rFonts w:ascii="SG Kara FaNum Light" w:hAnsi="SG Kara FaNum Light" w:cs="SG Kara FaNum Light" w:hint="cs"/>
+          <w:rtl/>
+          <w:lang w:bidi="fa-IR"/>
+        </w:rPr>
+        <w:t>تنظیمات</w:t>
+      </w:r>
+      <w:proofErr w:type="spellEnd"/>
+      <w:r>
+        <w:rPr>
+          <w:rFonts w:ascii="SG Kara FaNum Light" w:hAnsi="SG Kara FaNum Light" w:cs="SG Kara FaNum Light" w:hint="cs"/>
+          <w:rtl/>
+          <w:lang w:bidi="fa-IR"/>
+        </w:rPr>
+        <w:t xml:space="preserve"> دفتر کل، امکان شماره گذاری اسناد در سطح شعبه وجود دارد. </w:t>
+      </w:r>
     </w:p>
     <w:sectPr>
       <w:pgSz w:w="12240" w:h="15840"/>
@@ -24229,6 +25353,7 @@
     <w:lsdException w:name="HTML Sample" w:semiHidden="1" w:unhideWhenUsed="1"/>
     <w:lsdException w:name="HTML Typewriter" w:semiHidden="1" w:unhideWhenUsed="1"/>
     <w:lsdException w:name="HTML Variable" w:semiHidden="1" w:unhideWhenUsed="1"/>
+    <w:lsdException w:name="Normal Table" w:semiHidden="1" w:unhideWhenUsed="1"/>
     <w:lsdException w:name="annotation subject" w:semiHidden="1" w:unhideWhenUsed="1"/>
     <w:lsdException w:name="No List" w:semiHidden="1" w:unhideWhenUsed="1"/>
     <w:lsdException w:name="Outline List 1" w:semiHidden="1" w:unhideWhenUsed="1"/>
@@ -24275,8 +25400,10 @@
     <w:lsdException w:name="Table Subtle 2" w:semiHidden="1" w:unhideWhenUsed="1"/>
     <w:lsdException w:name="Table Web 1" w:semiHidden="1" w:unhideWhenUsed="1"/>
     <w:lsdException w:name="Table Web 2" w:semiHidden="1" w:unhideWhenUsed="1"/>
+    <w:lsdException w:name="Table Web 3" w:semiHidden="1" w:unhideWhenUsed="1"/>
     <w:lsdException w:name="Balloon Text" w:semiHidden="1" w:unhideWhenUsed="1"/>
     <w:lsdException w:name="Table Grid" w:uiPriority="39"/>
+    <w:lsdException w:name="Table Theme" w:semiHidden="1" w:unhideWhenUsed="1"/>
     <w:lsdException w:name="Placeholder Text" w:semiHidden="1"/>
     <w:lsdException w:name="No Spacing" w:uiPriority="1" w:qFormat="1"/>
     <w:lsdException w:name="Light Shading" w:uiPriority="60"/>
@@ -24524,6 +25651,28 @@
       <w:szCs w:val="32"/>
     </w:rPr>
   </w:style>
+  <w:style w:type="paragraph" w:styleId="Heading2">
+    <w:name w:val="heading 2"/>
+    <w:basedOn w:val="Normal"/>
+    <w:next w:val="Normal"/>
+    <w:link w:val="Heading2Char"/>
+    <w:uiPriority w:val="9"/>
+    <w:unhideWhenUsed/>
+    <w:qFormat/>
+    <w:rsid w:val="003477AE"/>
+    <w:pPr>
+      <w:keepNext/>
+      <w:keepLines/>
+      <w:spacing w:before="40" w:after="0"/>
+      <w:outlineLvl w:val="1"/>
+    </w:pPr>
+    <w:rPr>
+      <w:rFonts w:asciiTheme="majorHAnsi" w:eastAsiaTheme="majorEastAsia" w:hAnsiTheme="majorHAnsi" w:cstheme="majorBidi"/>
+      <w:color w:val="2F5496" w:themeColor="accent1" w:themeShade="BF"/>
+      <w:sz w:val="26"/>
+      <w:szCs w:val="26"/>
+    </w:rPr>
+  </w:style>
   <w:style w:type="character" w:default="1" w:styleId="DefaultParagraphFont">
     <w:name w:val="Default Paragraph Font"/>
     <w:uiPriority w:val="1"/>
@@ -24711,6 +25860,19 @@
       <w:color w:val="2F5496" w:themeColor="accent1" w:themeShade="BF"/>
       <w:sz w:val="32"/>
       <w:szCs w:val="32"/>
+    </w:rPr>
+  </w:style>
+  <w:style w:type="character" w:customStyle="1" w:styleId="Heading2Char">
+    <w:name w:val="Heading 2 Char"/>
+    <w:basedOn w:val="DefaultParagraphFont"/>
+    <w:link w:val="Heading2"/>
+    <w:uiPriority w:val="9"/>
+    <w:rsid w:val="003477AE"/>
+    <w:rPr>
+      <w:rFonts w:asciiTheme="majorHAnsi" w:eastAsiaTheme="majorEastAsia" w:hAnsiTheme="majorHAnsi" w:cstheme="majorBidi"/>
+      <w:color w:val="2F5496" w:themeColor="accent1" w:themeShade="BF"/>
+      <w:sz w:val="26"/>
+      <w:szCs w:val="26"/>
     </w:rPr>
   </w:style>
 </w:styles>
@@ -25009,4 +26171,16 @@
     </a:ext>
   </a:extLst>
 </a:theme>
+</file>
+
+<file path=customXml/item1.xml><?xml version="1.0" encoding="utf-8"?>
+<b:Sources xmlns:b="http://schemas.openxmlformats.org/officeDocument/2006/bibliography" xmlns="http://schemas.openxmlformats.org/officeDocument/2006/bibliography" SelectedStyle="\APASixthEditionOfficeOnline.xsl" StyleName="APA" Version="6"/>
+</file>
+
+<file path=customXml/itemProps1.xml><?xml version="1.0" encoding="utf-8"?>
+<ds:datastoreItem xmlns:ds="http://schemas.openxmlformats.org/officeDocument/2006/customXml" ds:itemID="{CE38819C-9663-4A74-BA3F-219D7D3BD186}">
+  <ds:schemaRefs>
+    <ds:schemaRef ds:uri="http://schemas.openxmlformats.org/officeDocument/2006/bibliography"/>
+  </ds:schemaRefs>
+</ds:datastoreItem>
 </file>
</xml_diff>